<commit_message>
broadened appeal deadline from custody order exclusive to simply divorce order that includes a custody order in both appeals steps - yml and docx.
</commit_message>
<xml_diff>
--- a/docassemble/AKA2JBranding/data/templates/appeal_content.docx
+++ b/docassemble/AKA2JBranding/data/templates/appeal_content.docx
@@ -1,6 +1,6 @@
 
 <file path=word/document.xml><?xml version="1.0" encoding="utf-8"?>
-<w:document xmlns:wpc="http://schemas.microsoft.com/office/word/2010/wordprocessingCanvas" xmlns:cx="http://schemas.microsoft.com/office/drawing/2014/chartex" xmlns:cx1="http://schemas.microsoft.com/office/drawing/2015/9/8/chartex" xmlns:cx2="http://schemas.microsoft.com/office/drawing/2015/10/21/chartex" xmlns:cx3="http://schemas.microsoft.com/office/drawing/2016/5/9/chartex" xmlns:cx4="http://schemas.microsoft.com/office/drawing/2016/5/10/chartex" xmlns:cx5="http://schemas.microsoft.com/office/drawing/2016/5/11/chartex" xmlns:cx6="http://schemas.microsoft.com/office/drawing/2016/5/12/chartex" xmlns:cx7="http://schemas.microsoft.com/office/drawing/2016/5/13/chartex" xmlns:cx8="http://schemas.microsoft.com/office/drawing/2016/5/14/chartex" xmlns:mc="http://schemas.openxmlformats.org/markup-compatibility/2006" xmlns:aink="http://schemas.microsoft.com/office/drawing/2016/ink" xmlns:am3d="http://schemas.microsoft.com/office/drawing/2017/model3d" xmlns:o="urn:schemas-microsoft-com:office:office" xmlns:r="http://schemas.openxmlformats.org/officeDocument/2006/relationships" xmlns:m="http://schemas.openxmlformats.org/officeDocument/2006/math" xmlns:v="urn:schemas-microsoft-com:vml" xmlns:wp14="http://schemas.microsoft.com/office/word/2010/wordprocessingDrawing" xmlns:wp="http://schemas.openxmlformats.org/drawingml/2006/wordprocessingDrawing" xmlns:w10="urn:schemas-microsoft-com:office:word" xmlns:w="http://schemas.openxmlformats.org/wordprocessingml/2006/main" xmlns:w14="http://schemas.microsoft.com/office/word/2010/wordml" xmlns:w15="http://schemas.microsoft.com/office/word/2012/wordml" xmlns:w16cex="http://schemas.microsoft.com/office/word/2018/wordml/cex" xmlns:w16cid="http://schemas.microsoft.com/office/word/2016/wordml/cid" xmlns:w16="http://schemas.microsoft.com/office/word/2018/wordml" xmlns:w16sdtdh="http://schemas.microsoft.com/office/word/2020/wordml/sdtdatahash" xmlns:w16se="http://schemas.microsoft.com/office/word/2015/wordml/symex" xmlns:wpg="http://schemas.microsoft.com/office/word/2010/wordprocessingGroup" xmlns:wpi="http://schemas.microsoft.com/office/word/2010/wordprocessingInk" xmlns:wne="http://schemas.microsoft.com/office/word/2006/wordml" xmlns:wps="http://schemas.microsoft.com/office/word/2010/wordprocessingShape" mc:Ignorable="w14 w15 w16se w16cid w16 w16cex w16sdtdh wp14">
+<w:document xmlns:wpc="http://schemas.microsoft.com/office/word/2010/wordprocessingCanvas" xmlns:mc="http://schemas.openxmlformats.org/markup-compatibility/2006" xmlns:o="urn:schemas-microsoft-com:office:office" xmlns:r="http://schemas.openxmlformats.org/officeDocument/2006/relationships" xmlns:m="http://schemas.openxmlformats.org/officeDocument/2006/math" xmlns:v="urn:schemas-microsoft-com:vml" xmlns:wp14="http://schemas.microsoft.com/office/word/2010/wordprocessingDrawing" xmlns:wp="http://schemas.openxmlformats.org/drawingml/2006/wordprocessingDrawing" xmlns:w10="urn:schemas-microsoft-com:office:word" xmlns:w="http://schemas.openxmlformats.org/wordprocessingml/2006/main" xmlns:w14="http://schemas.microsoft.com/office/word/2010/wordml" xmlns:wpg="http://schemas.microsoft.com/office/word/2010/wordprocessingGroup" xmlns:wpi="http://schemas.microsoft.com/office/word/2010/wordprocessingInk" xmlns:wne="http://schemas.microsoft.com/office/word/2006/wordml" xmlns:wps="http://schemas.microsoft.com/office/word/2010/wordprocessingShape" mc:Ignorable="w14 wp14">
   <w:body>
     <w:p>
       <w:pPr>
@@ -171,7 +171,7 @@
           <w:noProof/>
           <w:color w:val="FF0000"/>
         </w:rPr>
-        <w:t>divorce</w:t>
+        <w:t>custody</w:t>
       </w:r>
       <w:r>
         <w:rPr>
@@ -199,154 +199,21 @@
           <w:noProof/>
           <w:color w:val="FF0000"/>
         </w:rPr>
-        <w:t>and</w:t>
+        <w:t>or (</w:t>
+      </w:r>
+      <w:r>
+        <w:rPr>
+          <w:noProof/>
+          <w:color w:val="FFC000"/>
+        </w:rPr>
+        <w:t>user_need == 'change divorce order' and type_of_final_order['custody order'] and why_change == 'problem'</w:t>
       </w:r>
       <w:r>
         <w:rPr>
           <w:noProof/>
           <w:color w:val="FF0000"/>
         </w:rPr>
-        <w:t xml:space="preserve"> (</w:t>
-      </w:r>
-      <w:r>
-        <w:rPr>
-          <w:noProof/>
-          <w:color w:val="FF0000"/>
-        </w:rPr>
-        <w:t>type_of_final_order</w:t>
-      </w:r>
-      <w:r>
-        <w:rPr>
-          <w:noProof/>
-          <w:color w:val="FF0000"/>
-        </w:rPr>
-        <w:t>.all_true(</w:t>
-      </w:r>
-      <w:r>
-        <w:rPr>
-          <w:noProof/>
-          <w:color w:val="FF0000"/>
-        </w:rPr>
-        <w:t>'custody</w:t>
-      </w:r>
-      <w:r>
-        <w:rPr>
-          <w:noProof/>
-          <w:color w:val="FF0000"/>
-        </w:rPr>
-        <w:t xml:space="preserve"> </w:t>
-      </w:r>
-      <w:r>
-        <w:rPr>
-          <w:noProof/>
-          <w:color w:val="FF0000"/>
-        </w:rPr>
-        <w:t>order'</w:t>
-      </w:r>
-      <w:r>
-        <w:rPr>
-          <w:noProof/>
-          <w:color w:val="FF0000"/>
-        </w:rPr>
-        <w:t xml:space="preserve">, </w:t>
-      </w:r>
-      <w:r>
-        <w:rPr>
-          <w:noProof/>
-          <w:color w:val="FF0000"/>
-        </w:rPr>
-        <w:t>exclusive=True</w:t>
-      </w:r>
-      <w:r>
-        <w:rPr>
-          <w:noProof/>
-          <w:color w:val="FF0000"/>
-        </w:rPr>
-        <w:t>) or (</w:t>
-      </w:r>
-      <w:r>
-        <w:rPr>
-          <w:noProof/>
-          <w:color w:val="FF0000"/>
-        </w:rPr>
-        <w:t>type_of_final_order</w:t>
-      </w:r>
-      <w:r>
-        <w:rPr>
-          <w:noProof/>
-          <w:color w:val="FF0000"/>
-        </w:rPr>
-        <w:t>[</w:t>
-      </w:r>
-      <w:r>
-        <w:rPr>
-          <w:noProof/>
-          <w:color w:val="FF0000"/>
-        </w:rPr>
-        <w:t>'custody</w:t>
-      </w:r>
-      <w:r>
-        <w:rPr>
-          <w:noProof/>
-          <w:color w:val="FF0000"/>
-        </w:rPr>
-        <w:t xml:space="preserve"> </w:t>
-      </w:r>
-      <w:r>
-        <w:rPr>
-          <w:noProof/>
-          <w:color w:val="FF0000"/>
-        </w:rPr>
-        <w:t>order'</w:t>
-      </w:r>
-      <w:r>
-        <w:rPr>
-          <w:noProof/>
-          <w:color w:val="FF0000"/>
-        </w:rPr>
-        <w:t xml:space="preserve">] </w:t>
-      </w:r>
-      <w:r>
-        <w:rPr>
-          <w:noProof/>
-          <w:color w:val="FF0000"/>
-        </w:rPr>
-        <w:t>and</w:t>
-      </w:r>
-      <w:r>
-        <w:rPr>
-          <w:noProof/>
-          <w:color w:val="FF0000"/>
-        </w:rPr>
-        <w:t xml:space="preserve"> </w:t>
-      </w:r>
-      <w:r>
-        <w:rPr>
-          <w:noProof/>
-          <w:color w:val="FF0000"/>
-        </w:rPr>
-        <w:t>why_change</w:t>
-      </w:r>
-      <w:r>
-        <w:rPr>
-          <w:noProof/>
-          <w:color w:val="FF0000"/>
-        </w:rPr>
-        <w:t xml:space="preserve">_divorce_order != </w:t>
-      </w:r>
-      <w:r>
-        <w:rPr>
-          <w:noProof/>
-          <w:color w:val="FF0000"/>
-        </w:rPr>
-        <w:t>'problem'</w:t>
-      </w:r>
-      <w:r>
-        <w:rPr>
-          <w:noProof/>
-          <w:color w:val="FF0000"/>
-        </w:rPr>
-        <w:t xml:space="preserve">)) </w:t>
+        <w:t xml:space="preserve">) </w:t>
       </w:r>
       <w:r>
         <w:rPr>
@@ -490,6 +357,8 @@
         </w:rPr>
         <w:t>%}</w:t>
       </w:r>
+      <w:bookmarkStart w:id="0" w:name="_GoBack"/>
+      <w:bookmarkEnd w:id="0"/>
     </w:p>
     <w:p>
       <w:pPr>
@@ -794,7 +663,7 @@
       <w:r>
         <w:t xml:space="preserve"> </w:t>
       </w:r>
-      <w:hyperlink r:id="rId8" w:history="1">
+      <w:hyperlink r:id="rId9" w:history="1">
         <w:r>
           <w:rPr>
             <w:rStyle w:val="Hyperlink"/>
@@ -1551,28 +1420,6 @@
       <w:r>
         <w:t>[</w:t>
       </w:r>
-      <w:hyperlink r:id="rId9" w:history="1">
-        <w:r>
-          <w:rPr>
-            <w:rStyle w:val="Hyperlink"/>
-            <w:spacing w:val="0"/>
-          </w:rPr>
-          <w:t>Word</w:t>
-        </w:r>
-      </w:hyperlink>
-      <w:r>
-        <w:t xml:space="preserve">] and </w:t>
-      </w:r>
-      <w:r>
-        <w:rPr>
-          <w:b/>
-          <w:bCs/>
-        </w:rPr>
-        <w:t>Order Waiving Fees and / or Costs SHS-AP-135</w:t>
-      </w:r>
-      <w:r>
-        <w:t xml:space="preserve"> [</w:t>
-      </w:r>
       <w:hyperlink r:id="rId10" w:history="1">
         <w:r>
           <w:rPr>
@@ -1583,6 +1430,28 @@
         </w:r>
       </w:hyperlink>
       <w:r>
+        <w:t xml:space="preserve">] and </w:t>
+      </w:r>
+      <w:r>
+        <w:rPr>
+          <w:b/>
+          <w:bCs/>
+        </w:rPr>
+        <w:t>Order Waiving Fees and / or Costs SHS-AP-135</w:t>
+      </w:r>
+      <w:r>
+        <w:t xml:space="preserve"> [</w:t>
+      </w:r>
+      <w:hyperlink r:id="rId11" w:history="1">
+        <w:r>
+          <w:rPr>
+            <w:rStyle w:val="Hyperlink"/>
+            <w:spacing w:val="0"/>
+          </w:rPr>
+          <w:t>Word</w:t>
+        </w:r>
+      </w:hyperlink>
+      <w:r>
         <w:t xml:space="preserve">] </w:t>
       </w:r>
       <w:r>
@@ -1702,7 +1571,7 @@
       <w:r>
         <w:t xml:space="preserve"> web pages </w:t>
       </w:r>
-      <w:hyperlink r:id="rId11" w:history="1">
+      <w:hyperlink r:id="rId12" w:history="1">
         <w:r>
           <w:rPr>
             <w:rStyle w:val="Hyperlink"/>
@@ -1798,7 +1667,7 @@
       <w:pPr>
         <w:pStyle w:val="Body"/>
       </w:pPr>
-      <w:hyperlink r:id="rId12" w:history="1">
+      <w:hyperlink r:id="rId13" w:history="1">
         <w:r>
           <w:rPr>
             <w:rStyle w:val="Hyperlink"/>
@@ -1810,7 +1679,7 @@
       <w:r>
         <w:br/>
       </w:r>
-      <w:hyperlink r:id="rId13" w:history="1">
+      <w:hyperlink r:id="rId14" w:history="1">
         <w:r>
           <w:rPr>
             <w:rStyle w:val="Hyperlink"/>
@@ -1840,7 +1709,7 @@
         </w:rPr>
         <w:t xml:space="preserve">Motion for Waiver of Filing Fees and Costs </w:t>
       </w:r>
-      <w:hyperlink r:id="rId14" w:history="1">
+      <w:hyperlink r:id="rId15" w:history="1">
         <w:r>
           <w:rPr>
             <w:rStyle w:val="Hyperlink"/>
@@ -1861,7 +1730,7 @@
         <w:br/>
         <w:t xml:space="preserve">as a </w:t>
       </w:r>
-      <w:hyperlink r:id="rId15" w:history="1">
+      <w:hyperlink r:id="rId16" w:history="1">
         <w:r>
           <w:rPr>
             <w:rStyle w:val="Hyperlink"/>
@@ -1886,7 +1755,7 @@
         </w:rPr>
         <w:br/>
       </w:r>
-      <w:hyperlink r:id="rId16" w:history="1">
+      <w:hyperlink r:id="rId17" w:history="1">
         <w:r>
           <w:rPr>
             <w:rStyle w:val="Hyperlink"/>
@@ -1947,7 +1816,7 @@
         </w:rPr>
         <w:t xml:space="preserve"> Costs </w:t>
       </w:r>
-      <w:hyperlink r:id="rId17" w:history="1">
+      <w:hyperlink r:id="rId18" w:history="1">
         <w:r>
           <w:rPr>
             <w:rStyle w:val="Hyperlink"/>
@@ -1978,7 +1847,7 @@
         <w:br/>
         <w:t xml:space="preserve">as a </w:t>
       </w:r>
-      <w:hyperlink r:id="rId18" w:history="1">
+      <w:hyperlink r:id="rId19" w:history="1">
         <w:r>
           <w:rPr>
             <w:rStyle w:val="Hyperlink"/>
@@ -2003,7 +1872,7 @@
         </w:rPr>
         <w:br/>
       </w:r>
-      <w:hyperlink r:id="rId19" w:history="1">
+      <w:hyperlink r:id="rId20" w:history="1">
         <w:r>
           <w:rPr>
             <w:rStyle w:val="Hyperlink"/>
@@ -2017,7 +1886,7 @@
       <w:pPr>
         <w:pStyle w:val="Body"/>
       </w:pPr>
-      <w:hyperlink r:id="rId20" w:history="1">
+      <w:hyperlink r:id="rId21" w:history="1">
         <w:r>
           <w:rPr>
             <w:rStyle w:val="Hyperlink"/>
@@ -2034,7 +1903,7 @@
         </w:rPr>
         <w:br/>
       </w:r>
-      <w:hyperlink r:id="rId21" w:history="1">
+      <w:hyperlink r:id="rId22" w:history="1">
         <w:r>
           <w:rPr>
             <w:rStyle w:val="Hyperlink"/>
@@ -2045,12 +1914,12 @@
       </w:hyperlink>
     </w:p>
     <w:sectPr>
-      <w:headerReference w:type="even" r:id="rId22"/>
-      <w:headerReference w:type="default" r:id="rId23"/>
-      <w:footerReference w:type="even" r:id="rId24"/>
-      <w:footerReference w:type="default" r:id="rId25"/>
-      <w:headerReference w:type="first" r:id="rId26"/>
-      <w:footerReference w:type="first" r:id="rId27"/>
+      <w:headerReference w:type="even" r:id="rId23"/>
+      <w:headerReference w:type="default" r:id="rId24"/>
+      <w:footerReference w:type="even" r:id="rId25"/>
+      <w:footerReference w:type="default" r:id="rId26"/>
+      <w:headerReference w:type="first" r:id="rId27"/>
+      <w:footerReference w:type="first" r:id="rId28"/>
       <w:pgSz w:w="12240" w:h="15840"/>
       <w:pgMar w:top="1440" w:right="1440" w:bottom="1440" w:left="1440" w:header="720" w:footer="720" w:gutter="0"/>
       <w:cols w:space="720"/>
@@ -2061,7 +1930,7 @@
 </file>
 
 <file path=word/endnotes.xml><?xml version="1.0" encoding="utf-8"?>
-<w:endnotes xmlns:wpc="http://schemas.microsoft.com/office/word/2010/wordprocessingCanvas" xmlns:cx="http://schemas.microsoft.com/office/drawing/2014/chartex" xmlns:cx1="http://schemas.microsoft.com/office/drawing/2015/9/8/chartex" xmlns:cx2="http://schemas.microsoft.com/office/drawing/2015/10/21/chartex" xmlns:cx3="http://schemas.microsoft.com/office/drawing/2016/5/9/chartex" xmlns:cx4="http://schemas.microsoft.com/office/drawing/2016/5/10/chartex" xmlns:cx5="http://schemas.microsoft.com/office/drawing/2016/5/11/chartex" xmlns:cx6="http://schemas.microsoft.com/office/drawing/2016/5/12/chartex" xmlns:cx7="http://schemas.microsoft.com/office/drawing/2016/5/13/chartex" xmlns:cx8="http://schemas.microsoft.com/office/drawing/2016/5/14/chartex" xmlns:mc="http://schemas.openxmlformats.org/markup-compatibility/2006" xmlns:aink="http://schemas.microsoft.com/office/drawing/2016/ink" xmlns:am3d="http://schemas.microsoft.com/office/drawing/2017/model3d" xmlns:o="urn:schemas-microsoft-com:office:office" xmlns:r="http://schemas.openxmlformats.org/officeDocument/2006/relationships" xmlns:m="http://schemas.openxmlformats.org/officeDocument/2006/math" xmlns:v="urn:schemas-microsoft-com:vml" xmlns:wp14="http://schemas.microsoft.com/office/word/2010/wordprocessingDrawing" xmlns:wp="http://schemas.openxmlformats.org/drawingml/2006/wordprocessingDrawing" xmlns:w10="urn:schemas-microsoft-com:office:word" xmlns:w="http://schemas.openxmlformats.org/wordprocessingml/2006/main" xmlns:w14="http://schemas.microsoft.com/office/word/2010/wordml" xmlns:w15="http://schemas.microsoft.com/office/word/2012/wordml" xmlns:w16cex="http://schemas.microsoft.com/office/word/2018/wordml/cex" xmlns:w16cid="http://schemas.microsoft.com/office/word/2016/wordml/cid" xmlns:w16="http://schemas.microsoft.com/office/word/2018/wordml" xmlns:w16sdtdh="http://schemas.microsoft.com/office/word/2020/wordml/sdtdatahash" xmlns:w16se="http://schemas.microsoft.com/office/word/2015/wordml/symex" xmlns:wpg="http://schemas.microsoft.com/office/word/2010/wordprocessingGroup" xmlns:wpi="http://schemas.microsoft.com/office/word/2010/wordprocessingInk" xmlns:wne="http://schemas.microsoft.com/office/word/2006/wordml" xmlns:wps="http://schemas.microsoft.com/office/word/2010/wordprocessingShape" mc:Ignorable="w14 w15 w16se w16cid w16 w16cex w16sdtdh wp14">
+<w:endnotes xmlns:wpc="http://schemas.microsoft.com/office/word/2010/wordprocessingCanvas" xmlns:mc="http://schemas.openxmlformats.org/markup-compatibility/2006" xmlns:o="urn:schemas-microsoft-com:office:office" xmlns:r="http://schemas.openxmlformats.org/officeDocument/2006/relationships" xmlns:m="http://schemas.openxmlformats.org/officeDocument/2006/math" xmlns:v="urn:schemas-microsoft-com:vml" xmlns:wp14="http://schemas.microsoft.com/office/word/2010/wordprocessingDrawing" xmlns:wp="http://schemas.openxmlformats.org/drawingml/2006/wordprocessingDrawing" xmlns:w10="urn:schemas-microsoft-com:office:word" xmlns:w="http://schemas.openxmlformats.org/wordprocessingml/2006/main" xmlns:w14="http://schemas.microsoft.com/office/word/2010/wordml" xmlns:wpg="http://schemas.microsoft.com/office/word/2010/wordprocessingGroup" xmlns:wpi="http://schemas.microsoft.com/office/word/2010/wordprocessingInk" xmlns:wne="http://schemas.microsoft.com/office/word/2006/wordml" xmlns:wps="http://schemas.microsoft.com/office/word/2010/wordprocessingShape" mc:Ignorable="w14 wp14">
   <w:endnote w:type="separator" w:id="-1">
     <w:p>
       <w:pPr>
@@ -2086,7 +1955,7 @@
 </file>
 
 <file path=word/footer1.xml><?xml version="1.0" encoding="utf-8"?>
-<w:ftr xmlns:wpc="http://schemas.microsoft.com/office/word/2010/wordprocessingCanvas" xmlns:cx="http://schemas.microsoft.com/office/drawing/2014/chartex" xmlns:cx1="http://schemas.microsoft.com/office/drawing/2015/9/8/chartex" xmlns:cx2="http://schemas.microsoft.com/office/drawing/2015/10/21/chartex" xmlns:cx3="http://schemas.microsoft.com/office/drawing/2016/5/9/chartex" xmlns:cx4="http://schemas.microsoft.com/office/drawing/2016/5/10/chartex" xmlns:cx5="http://schemas.microsoft.com/office/drawing/2016/5/11/chartex" xmlns:cx6="http://schemas.microsoft.com/office/drawing/2016/5/12/chartex" xmlns:cx7="http://schemas.microsoft.com/office/drawing/2016/5/13/chartex" xmlns:cx8="http://schemas.microsoft.com/office/drawing/2016/5/14/chartex" xmlns:mc="http://schemas.openxmlformats.org/markup-compatibility/2006" xmlns:aink="http://schemas.microsoft.com/office/drawing/2016/ink" xmlns:am3d="http://schemas.microsoft.com/office/drawing/2017/model3d" xmlns:o="urn:schemas-microsoft-com:office:office" xmlns:r="http://schemas.openxmlformats.org/officeDocument/2006/relationships" xmlns:m="http://schemas.openxmlformats.org/officeDocument/2006/math" xmlns:v="urn:schemas-microsoft-com:vml" xmlns:wp14="http://schemas.microsoft.com/office/word/2010/wordprocessingDrawing" xmlns:wp="http://schemas.openxmlformats.org/drawingml/2006/wordprocessingDrawing" xmlns:w10="urn:schemas-microsoft-com:office:word" xmlns:w="http://schemas.openxmlformats.org/wordprocessingml/2006/main" xmlns:w14="http://schemas.microsoft.com/office/word/2010/wordml" xmlns:w15="http://schemas.microsoft.com/office/word/2012/wordml" xmlns:w16cex="http://schemas.microsoft.com/office/word/2018/wordml/cex" xmlns:w16cid="http://schemas.microsoft.com/office/word/2016/wordml/cid" xmlns:w16="http://schemas.microsoft.com/office/word/2018/wordml" xmlns:w16sdtdh="http://schemas.microsoft.com/office/word/2020/wordml/sdtdatahash" xmlns:w16se="http://schemas.microsoft.com/office/word/2015/wordml/symex" xmlns:wpg="http://schemas.microsoft.com/office/word/2010/wordprocessingGroup" xmlns:wpi="http://schemas.microsoft.com/office/word/2010/wordprocessingInk" xmlns:wne="http://schemas.microsoft.com/office/word/2006/wordml" xmlns:wps="http://schemas.microsoft.com/office/word/2010/wordprocessingShape" mc:Ignorable="w14 w15 w16se w16cid w16 w16cex w16sdtdh wp14">
+<w:ftr xmlns:wpc="http://schemas.microsoft.com/office/word/2010/wordprocessingCanvas" xmlns:mc="http://schemas.openxmlformats.org/markup-compatibility/2006" xmlns:o="urn:schemas-microsoft-com:office:office" xmlns:r="http://schemas.openxmlformats.org/officeDocument/2006/relationships" xmlns:m="http://schemas.openxmlformats.org/officeDocument/2006/math" xmlns:v="urn:schemas-microsoft-com:vml" xmlns:wp14="http://schemas.microsoft.com/office/word/2010/wordprocessingDrawing" xmlns:wp="http://schemas.openxmlformats.org/drawingml/2006/wordprocessingDrawing" xmlns:w10="urn:schemas-microsoft-com:office:word" xmlns:w="http://schemas.openxmlformats.org/wordprocessingml/2006/main" xmlns:w14="http://schemas.microsoft.com/office/word/2010/wordml" xmlns:wpg="http://schemas.microsoft.com/office/word/2010/wordprocessingGroup" xmlns:wpi="http://schemas.microsoft.com/office/word/2010/wordprocessingInk" xmlns:wne="http://schemas.microsoft.com/office/word/2006/wordml" xmlns:wps="http://schemas.microsoft.com/office/word/2010/wordprocessingShape" mc:Ignorable="w14 wp14">
   <w:p>
     <w:pPr>
       <w:pStyle w:val="Footer"/>
@@ -2096,7 +1965,7 @@
 </file>
 
 <file path=word/footer2.xml><?xml version="1.0" encoding="utf-8"?>
-<w:ftr xmlns:wpc="http://schemas.microsoft.com/office/word/2010/wordprocessingCanvas" xmlns:cx="http://schemas.microsoft.com/office/drawing/2014/chartex" xmlns:cx1="http://schemas.microsoft.com/office/drawing/2015/9/8/chartex" xmlns:cx2="http://schemas.microsoft.com/office/drawing/2015/10/21/chartex" xmlns:cx3="http://schemas.microsoft.com/office/drawing/2016/5/9/chartex" xmlns:cx4="http://schemas.microsoft.com/office/drawing/2016/5/10/chartex" xmlns:cx5="http://schemas.microsoft.com/office/drawing/2016/5/11/chartex" xmlns:cx6="http://schemas.microsoft.com/office/drawing/2016/5/12/chartex" xmlns:cx7="http://schemas.microsoft.com/office/drawing/2016/5/13/chartex" xmlns:cx8="http://schemas.microsoft.com/office/drawing/2016/5/14/chartex" xmlns:mc="http://schemas.openxmlformats.org/markup-compatibility/2006" xmlns:aink="http://schemas.microsoft.com/office/drawing/2016/ink" xmlns:am3d="http://schemas.microsoft.com/office/drawing/2017/model3d" xmlns:o="urn:schemas-microsoft-com:office:office" xmlns:r="http://schemas.openxmlformats.org/officeDocument/2006/relationships" xmlns:m="http://schemas.openxmlformats.org/officeDocument/2006/math" xmlns:v="urn:schemas-microsoft-com:vml" xmlns:wp14="http://schemas.microsoft.com/office/word/2010/wordprocessingDrawing" xmlns:wp="http://schemas.openxmlformats.org/drawingml/2006/wordprocessingDrawing" xmlns:w10="urn:schemas-microsoft-com:office:word" xmlns:w="http://schemas.openxmlformats.org/wordprocessingml/2006/main" xmlns:w14="http://schemas.microsoft.com/office/word/2010/wordml" xmlns:w15="http://schemas.microsoft.com/office/word/2012/wordml" xmlns:w16cex="http://schemas.microsoft.com/office/word/2018/wordml/cex" xmlns:w16cid="http://schemas.microsoft.com/office/word/2016/wordml/cid" xmlns:w16="http://schemas.microsoft.com/office/word/2018/wordml" xmlns:w16sdtdh="http://schemas.microsoft.com/office/word/2020/wordml/sdtdatahash" xmlns:w16se="http://schemas.microsoft.com/office/word/2015/wordml/symex" xmlns:wpg="http://schemas.microsoft.com/office/word/2010/wordprocessingGroup" xmlns:wpi="http://schemas.microsoft.com/office/word/2010/wordprocessingInk" xmlns:wne="http://schemas.microsoft.com/office/word/2006/wordml" xmlns:wps="http://schemas.microsoft.com/office/word/2010/wordprocessingShape" mc:Ignorable="w14 w15 w16se w16cid w16 w16cex w16sdtdh wp14">
+<w:ftr xmlns:wpc="http://schemas.microsoft.com/office/word/2010/wordprocessingCanvas" xmlns:mc="http://schemas.openxmlformats.org/markup-compatibility/2006" xmlns:o="urn:schemas-microsoft-com:office:office" xmlns:r="http://schemas.openxmlformats.org/officeDocument/2006/relationships" xmlns:m="http://schemas.openxmlformats.org/officeDocument/2006/math" xmlns:v="urn:schemas-microsoft-com:vml" xmlns:wp14="http://schemas.microsoft.com/office/word/2010/wordprocessingDrawing" xmlns:wp="http://schemas.openxmlformats.org/drawingml/2006/wordprocessingDrawing" xmlns:w10="urn:schemas-microsoft-com:office:word" xmlns:w="http://schemas.openxmlformats.org/wordprocessingml/2006/main" xmlns:w14="http://schemas.microsoft.com/office/word/2010/wordml" xmlns:wpg="http://schemas.microsoft.com/office/word/2010/wordprocessingGroup" xmlns:wpi="http://schemas.microsoft.com/office/word/2010/wordprocessingInk" xmlns:wne="http://schemas.microsoft.com/office/word/2006/wordml" xmlns:wps="http://schemas.microsoft.com/office/word/2010/wordprocessingShape" mc:Ignorable="w14 wp14">
   <w:p>
     <w:pPr>
       <w:pStyle w:val="Footer"/>
@@ -2106,7 +1975,7 @@
 </file>
 
 <file path=word/footer3.xml><?xml version="1.0" encoding="utf-8"?>
-<w:ftr xmlns:wpc="http://schemas.microsoft.com/office/word/2010/wordprocessingCanvas" xmlns:cx="http://schemas.microsoft.com/office/drawing/2014/chartex" xmlns:cx1="http://schemas.microsoft.com/office/drawing/2015/9/8/chartex" xmlns:cx2="http://schemas.microsoft.com/office/drawing/2015/10/21/chartex" xmlns:cx3="http://schemas.microsoft.com/office/drawing/2016/5/9/chartex" xmlns:cx4="http://schemas.microsoft.com/office/drawing/2016/5/10/chartex" xmlns:cx5="http://schemas.microsoft.com/office/drawing/2016/5/11/chartex" xmlns:cx6="http://schemas.microsoft.com/office/drawing/2016/5/12/chartex" xmlns:cx7="http://schemas.microsoft.com/office/drawing/2016/5/13/chartex" xmlns:cx8="http://schemas.microsoft.com/office/drawing/2016/5/14/chartex" xmlns:mc="http://schemas.openxmlformats.org/markup-compatibility/2006" xmlns:aink="http://schemas.microsoft.com/office/drawing/2016/ink" xmlns:am3d="http://schemas.microsoft.com/office/drawing/2017/model3d" xmlns:o="urn:schemas-microsoft-com:office:office" xmlns:r="http://schemas.openxmlformats.org/officeDocument/2006/relationships" xmlns:m="http://schemas.openxmlformats.org/officeDocument/2006/math" xmlns:v="urn:schemas-microsoft-com:vml" xmlns:wp14="http://schemas.microsoft.com/office/word/2010/wordprocessingDrawing" xmlns:wp="http://schemas.openxmlformats.org/drawingml/2006/wordprocessingDrawing" xmlns:w10="urn:schemas-microsoft-com:office:word" xmlns:w="http://schemas.openxmlformats.org/wordprocessingml/2006/main" xmlns:w14="http://schemas.microsoft.com/office/word/2010/wordml" xmlns:w15="http://schemas.microsoft.com/office/word/2012/wordml" xmlns:w16cex="http://schemas.microsoft.com/office/word/2018/wordml/cex" xmlns:w16cid="http://schemas.microsoft.com/office/word/2016/wordml/cid" xmlns:w16="http://schemas.microsoft.com/office/word/2018/wordml" xmlns:w16sdtdh="http://schemas.microsoft.com/office/word/2020/wordml/sdtdatahash" xmlns:w16se="http://schemas.microsoft.com/office/word/2015/wordml/symex" xmlns:wpg="http://schemas.microsoft.com/office/word/2010/wordprocessingGroup" xmlns:wpi="http://schemas.microsoft.com/office/word/2010/wordprocessingInk" xmlns:wne="http://schemas.microsoft.com/office/word/2006/wordml" xmlns:wps="http://schemas.microsoft.com/office/word/2010/wordprocessingShape" mc:Ignorable="w14 w15 w16se w16cid w16 w16cex w16sdtdh wp14">
+<w:ftr xmlns:wpc="http://schemas.microsoft.com/office/word/2010/wordprocessingCanvas" xmlns:mc="http://schemas.openxmlformats.org/markup-compatibility/2006" xmlns:o="urn:schemas-microsoft-com:office:office" xmlns:r="http://schemas.openxmlformats.org/officeDocument/2006/relationships" xmlns:m="http://schemas.openxmlformats.org/officeDocument/2006/math" xmlns:v="urn:schemas-microsoft-com:vml" xmlns:wp14="http://schemas.microsoft.com/office/word/2010/wordprocessingDrawing" xmlns:wp="http://schemas.openxmlformats.org/drawingml/2006/wordprocessingDrawing" xmlns:w10="urn:schemas-microsoft-com:office:word" xmlns:w="http://schemas.openxmlformats.org/wordprocessingml/2006/main" xmlns:w14="http://schemas.microsoft.com/office/word/2010/wordml" xmlns:wpg="http://schemas.microsoft.com/office/word/2010/wordprocessingGroup" xmlns:wpi="http://schemas.microsoft.com/office/word/2010/wordprocessingInk" xmlns:wne="http://schemas.microsoft.com/office/word/2006/wordml" xmlns:wps="http://schemas.microsoft.com/office/word/2010/wordprocessingShape" mc:Ignorable="w14 wp14">
   <w:p>
     <w:pPr>
       <w:pStyle w:val="Footer"/>
@@ -2116,7 +1985,7 @@
 </file>
 
 <file path=word/footnotes.xml><?xml version="1.0" encoding="utf-8"?>
-<w:footnotes xmlns:wpc="http://schemas.microsoft.com/office/word/2010/wordprocessingCanvas" xmlns:cx="http://schemas.microsoft.com/office/drawing/2014/chartex" xmlns:cx1="http://schemas.microsoft.com/office/drawing/2015/9/8/chartex" xmlns:cx2="http://schemas.microsoft.com/office/drawing/2015/10/21/chartex" xmlns:cx3="http://schemas.microsoft.com/office/drawing/2016/5/9/chartex" xmlns:cx4="http://schemas.microsoft.com/office/drawing/2016/5/10/chartex" xmlns:cx5="http://schemas.microsoft.com/office/drawing/2016/5/11/chartex" xmlns:cx6="http://schemas.microsoft.com/office/drawing/2016/5/12/chartex" xmlns:cx7="http://schemas.microsoft.com/office/drawing/2016/5/13/chartex" xmlns:cx8="http://schemas.microsoft.com/office/drawing/2016/5/14/chartex" xmlns:mc="http://schemas.openxmlformats.org/markup-compatibility/2006" xmlns:aink="http://schemas.microsoft.com/office/drawing/2016/ink" xmlns:am3d="http://schemas.microsoft.com/office/drawing/2017/model3d" xmlns:o="urn:schemas-microsoft-com:office:office" xmlns:r="http://schemas.openxmlformats.org/officeDocument/2006/relationships" xmlns:m="http://schemas.openxmlformats.org/officeDocument/2006/math" xmlns:v="urn:schemas-microsoft-com:vml" xmlns:wp14="http://schemas.microsoft.com/office/word/2010/wordprocessingDrawing" xmlns:wp="http://schemas.openxmlformats.org/drawingml/2006/wordprocessingDrawing" xmlns:w10="urn:schemas-microsoft-com:office:word" xmlns:w="http://schemas.openxmlformats.org/wordprocessingml/2006/main" xmlns:w14="http://schemas.microsoft.com/office/word/2010/wordml" xmlns:w15="http://schemas.microsoft.com/office/word/2012/wordml" xmlns:w16cex="http://schemas.microsoft.com/office/word/2018/wordml/cex" xmlns:w16cid="http://schemas.microsoft.com/office/word/2016/wordml/cid" xmlns:w16="http://schemas.microsoft.com/office/word/2018/wordml" xmlns:w16sdtdh="http://schemas.microsoft.com/office/word/2020/wordml/sdtdatahash" xmlns:w16se="http://schemas.microsoft.com/office/word/2015/wordml/symex" xmlns:wpg="http://schemas.microsoft.com/office/word/2010/wordprocessingGroup" xmlns:wpi="http://schemas.microsoft.com/office/word/2010/wordprocessingInk" xmlns:wne="http://schemas.microsoft.com/office/word/2006/wordml" xmlns:wps="http://schemas.microsoft.com/office/word/2010/wordprocessingShape" mc:Ignorable="w14 w15 w16se w16cid w16 w16cex w16sdtdh wp14">
+<w:footnotes xmlns:wpc="http://schemas.microsoft.com/office/word/2010/wordprocessingCanvas" xmlns:mc="http://schemas.openxmlformats.org/markup-compatibility/2006" xmlns:o="urn:schemas-microsoft-com:office:office" xmlns:r="http://schemas.openxmlformats.org/officeDocument/2006/relationships" xmlns:m="http://schemas.openxmlformats.org/officeDocument/2006/math" xmlns:v="urn:schemas-microsoft-com:vml" xmlns:wp14="http://schemas.microsoft.com/office/word/2010/wordprocessingDrawing" xmlns:wp="http://schemas.openxmlformats.org/drawingml/2006/wordprocessingDrawing" xmlns:w10="urn:schemas-microsoft-com:office:word" xmlns:w="http://schemas.openxmlformats.org/wordprocessingml/2006/main" xmlns:w14="http://schemas.microsoft.com/office/word/2010/wordml" xmlns:wpg="http://schemas.microsoft.com/office/word/2010/wordprocessingGroup" xmlns:wpi="http://schemas.microsoft.com/office/word/2010/wordprocessingInk" xmlns:wne="http://schemas.microsoft.com/office/word/2006/wordml" xmlns:wps="http://schemas.microsoft.com/office/word/2010/wordprocessingShape" mc:Ignorable="w14 wp14">
   <w:footnote w:type="separator" w:id="-1">
     <w:p>
       <w:pPr>
@@ -2141,7 +2010,7 @@
 </file>
 
 <file path=word/header1.xml><?xml version="1.0" encoding="utf-8"?>
-<w:hdr xmlns:wpc="http://schemas.microsoft.com/office/word/2010/wordprocessingCanvas" xmlns:cx="http://schemas.microsoft.com/office/drawing/2014/chartex" xmlns:cx1="http://schemas.microsoft.com/office/drawing/2015/9/8/chartex" xmlns:cx2="http://schemas.microsoft.com/office/drawing/2015/10/21/chartex" xmlns:cx3="http://schemas.microsoft.com/office/drawing/2016/5/9/chartex" xmlns:cx4="http://schemas.microsoft.com/office/drawing/2016/5/10/chartex" xmlns:cx5="http://schemas.microsoft.com/office/drawing/2016/5/11/chartex" xmlns:cx6="http://schemas.microsoft.com/office/drawing/2016/5/12/chartex" xmlns:cx7="http://schemas.microsoft.com/office/drawing/2016/5/13/chartex" xmlns:cx8="http://schemas.microsoft.com/office/drawing/2016/5/14/chartex" xmlns:mc="http://schemas.openxmlformats.org/markup-compatibility/2006" xmlns:aink="http://schemas.microsoft.com/office/drawing/2016/ink" xmlns:am3d="http://schemas.microsoft.com/office/drawing/2017/model3d" xmlns:o="urn:schemas-microsoft-com:office:office" xmlns:r="http://schemas.openxmlformats.org/officeDocument/2006/relationships" xmlns:m="http://schemas.openxmlformats.org/officeDocument/2006/math" xmlns:v="urn:schemas-microsoft-com:vml" xmlns:wp14="http://schemas.microsoft.com/office/word/2010/wordprocessingDrawing" xmlns:wp="http://schemas.openxmlformats.org/drawingml/2006/wordprocessingDrawing" xmlns:w10="urn:schemas-microsoft-com:office:word" xmlns:w="http://schemas.openxmlformats.org/wordprocessingml/2006/main" xmlns:w14="http://schemas.microsoft.com/office/word/2010/wordml" xmlns:w15="http://schemas.microsoft.com/office/word/2012/wordml" xmlns:w16cex="http://schemas.microsoft.com/office/word/2018/wordml/cex" xmlns:w16cid="http://schemas.microsoft.com/office/word/2016/wordml/cid" xmlns:w16="http://schemas.microsoft.com/office/word/2018/wordml" xmlns:w16sdtdh="http://schemas.microsoft.com/office/word/2020/wordml/sdtdatahash" xmlns:w16se="http://schemas.microsoft.com/office/word/2015/wordml/symex" xmlns:wpg="http://schemas.microsoft.com/office/word/2010/wordprocessingGroup" xmlns:wpi="http://schemas.microsoft.com/office/word/2010/wordprocessingInk" xmlns:wne="http://schemas.microsoft.com/office/word/2006/wordml" xmlns:wps="http://schemas.microsoft.com/office/word/2010/wordprocessingShape" mc:Ignorable="w14 w15 w16se w16cid w16 w16cex w16sdtdh wp14">
+<w:hdr xmlns:wpc="http://schemas.microsoft.com/office/word/2010/wordprocessingCanvas" xmlns:mc="http://schemas.openxmlformats.org/markup-compatibility/2006" xmlns:o="urn:schemas-microsoft-com:office:office" xmlns:r="http://schemas.openxmlformats.org/officeDocument/2006/relationships" xmlns:m="http://schemas.openxmlformats.org/officeDocument/2006/math" xmlns:v="urn:schemas-microsoft-com:vml" xmlns:wp14="http://schemas.microsoft.com/office/word/2010/wordprocessingDrawing" xmlns:wp="http://schemas.openxmlformats.org/drawingml/2006/wordprocessingDrawing" xmlns:w10="urn:schemas-microsoft-com:office:word" xmlns:w="http://schemas.openxmlformats.org/wordprocessingml/2006/main" xmlns:w14="http://schemas.microsoft.com/office/word/2010/wordml" xmlns:wpg="http://schemas.microsoft.com/office/word/2010/wordprocessingGroup" xmlns:wpi="http://schemas.microsoft.com/office/word/2010/wordprocessingInk" xmlns:wne="http://schemas.microsoft.com/office/word/2006/wordml" xmlns:wps="http://schemas.microsoft.com/office/word/2010/wordprocessingShape" mc:Ignorable="w14 wp14">
   <w:p>
     <w:pPr>
       <w:pStyle w:val="Header"/>
@@ -2151,7 +2020,7 @@
 </file>
 
 <file path=word/header2.xml><?xml version="1.0" encoding="utf-8"?>
-<w:hdr xmlns:wpc="http://schemas.microsoft.com/office/word/2010/wordprocessingCanvas" xmlns:cx="http://schemas.microsoft.com/office/drawing/2014/chartex" xmlns:cx1="http://schemas.microsoft.com/office/drawing/2015/9/8/chartex" xmlns:cx2="http://schemas.microsoft.com/office/drawing/2015/10/21/chartex" xmlns:cx3="http://schemas.microsoft.com/office/drawing/2016/5/9/chartex" xmlns:cx4="http://schemas.microsoft.com/office/drawing/2016/5/10/chartex" xmlns:cx5="http://schemas.microsoft.com/office/drawing/2016/5/11/chartex" xmlns:cx6="http://schemas.microsoft.com/office/drawing/2016/5/12/chartex" xmlns:cx7="http://schemas.microsoft.com/office/drawing/2016/5/13/chartex" xmlns:cx8="http://schemas.microsoft.com/office/drawing/2016/5/14/chartex" xmlns:mc="http://schemas.openxmlformats.org/markup-compatibility/2006" xmlns:aink="http://schemas.microsoft.com/office/drawing/2016/ink" xmlns:am3d="http://schemas.microsoft.com/office/drawing/2017/model3d" xmlns:o="urn:schemas-microsoft-com:office:office" xmlns:r="http://schemas.openxmlformats.org/officeDocument/2006/relationships" xmlns:m="http://schemas.openxmlformats.org/officeDocument/2006/math" xmlns:v="urn:schemas-microsoft-com:vml" xmlns:wp14="http://schemas.microsoft.com/office/word/2010/wordprocessingDrawing" xmlns:wp="http://schemas.openxmlformats.org/drawingml/2006/wordprocessingDrawing" xmlns:w10="urn:schemas-microsoft-com:office:word" xmlns:w="http://schemas.openxmlformats.org/wordprocessingml/2006/main" xmlns:w14="http://schemas.microsoft.com/office/word/2010/wordml" xmlns:w15="http://schemas.microsoft.com/office/word/2012/wordml" xmlns:w16cex="http://schemas.microsoft.com/office/word/2018/wordml/cex" xmlns:w16cid="http://schemas.microsoft.com/office/word/2016/wordml/cid" xmlns:w16="http://schemas.microsoft.com/office/word/2018/wordml" xmlns:w16sdtdh="http://schemas.microsoft.com/office/word/2020/wordml/sdtdatahash" xmlns:w16se="http://schemas.microsoft.com/office/word/2015/wordml/symex" xmlns:wpg="http://schemas.microsoft.com/office/word/2010/wordprocessingGroup" xmlns:wpi="http://schemas.microsoft.com/office/word/2010/wordprocessingInk" xmlns:wne="http://schemas.microsoft.com/office/word/2006/wordml" xmlns:wps="http://schemas.microsoft.com/office/word/2010/wordprocessingShape" mc:Ignorable="w14 w15 w16se w16cid w16 w16cex w16sdtdh wp14">
+<w:hdr xmlns:wpc="http://schemas.microsoft.com/office/word/2010/wordprocessingCanvas" xmlns:mc="http://schemas.openxmlformats.org/markup-compatibility/2006" xmlns:o="urn:schemas-microsoft-com:office:office" xmlns:r="http://schemas.openxmlformats.org/officeDocument/2006/relationships" xmlns:m="http://schemas.openxmlformats.org/officeDocument/2006/math" xmlns:v="urn:schemas-microsoft-com:vml" xmlns:wp14="http://schemas.microsoft.com/office/word/2010/wordprocessingDrawing" xmlns:wp="http://schemas.openxmlformats.org/drawingml/2006/wordprocessingDrawing" xmlns:w10="urn:schemas-microsoft-com:office:word" xmlns:w="http://schemas.openxmlformats.org/wordprocessingml/2006/main" xmlns:w14="http://schemas.microsoft.com/office/word/2010/wordml" xmlns:wpg="http://schemas.microsoft.com/office/word/2010/wordprocessingGroup" xmlns:wpi="http://schemas.microsoft.com/office/word/2010/wordprocessingInk" xmlns:wne="http://schemas.microsoft.com/office/word/2006/wordml" xmlns:wps="http://schemas.microsoft.com/office/word/2010/wordprocessingShape" mc:Ignorable="w14 wp14">
   <w:p>
     <w:pPr>
       <w:pStyle w:val="Header"/>
@@ -2161,7 +2030,7 @@
 </file>
 
 <file path=word/header3.xml><?xml version="1.0" encoding="utf-8"?>
-<w:hdr xmlns:wpc="http://schemas.microsoft.com/office/word/2010/wordprocessingCanvas" xmlns:cx="http://schemas.microsoft.com/office/drawing/2014/chartex" xmlns:cx1="http://schemas.microsoft.com/office/drawing/2015/9/8/chartex" xmlns:cx2="http://schemas.microsoft.com/office/drawing/2015/10/21/chartex" xmlns:cx3="http://schemas.microsoft.com/office/drawing/2016/5/9/chartex" xmlns:cx4="http://schemas.microsoft.com/office/drawing/2016/5/10/chartex" xmlns:cx5="http://schemas.microsoft.com/office/drawing/2016/5/11/chartex" xmlns:cx6="http://schemas.microsoft.com/office/drawing/2016/5/12/chartex" xmlns:cx7="http://schemas.microsoft.com/office/drawing/2016/5/13/chartex" xmlns:cx8="http://schemas.microsoft.com/office/drawing/2016/5/14/chartex" xmlns:mc="http://schemas.openxmlformats.org/markup-compatibility/2006" xmlns:aink="http://schemas.microsoft.com/office/drawing/2016/ink" xmlns:am3d="http://schemas.microsoft.com/office/drawing/2017/model3d" xmlns:o="urn:schemas-microsoft-com:office:office" xmlns:r="http://schemas.openxmlformats.org/officeDocument/2006/relationships" xmlns:m="http://schemas.openxmlformats.org/officeDocument/2006/math" xmlns:v="urn:schemas-microsoft-com:vml" xmlns:wp14="http://schemas.microsoft.com/office/word/2010/wordprocessingDrawing" xmlns:wp="http://schemas.openxmlformats.org/drawingml/2006/wordprocessingDrawing" xmlns:w10="urn:schemas-microsoft-com:office:word" xmlns:w="http://schemas.openxmlformats.org/wordprocessingml/2006/main" xmlns:w14="http://schemas.microsoft.com/office/word/2010/wordml" xmlns:w15="http://schemas.microsoft.com/office/word/2012/wordml" xmlns:w16cex="http://schemas.microsoft.com/office/word/2018/wordml/cex" xmlns:w16cid="http://schemas.microsoft.com/office/word/2016/wordml/cid" xmlns:w16="http://schemas.microsoft.com/office/word/2018/wordml" xmlns:w16sdtdh="http://schemas.microsoft.com/office/word/2020/wordml/sdtdatahash" xmlns:w16se="http://schemas.microsoft.com/office/word/2015/wordml/symex" xmlns:wpg="http://schemas.microsoft.com/office/word/2010/wordprocessingGroup" xmlns:wpi="http://schemas.microsoft.com/office/word/2010/wordprocessingInk" xmlns:wne="http://schemas.microsoft.com/office/word/2006/wordml" xmlns:wps="http://schemas.microsoft.com/office/word/2010/wordprocessingShape" mc:Ignorable="w14 w15 w16se w16cid w16 w16cex w16sdtdh wp14">
+<w:hdr xmlns:wpc="http://schemas.microsoft.com/office/word/2010/wordprocessingCanvas" xmlns:mc="http://schemas.openxmlformats.org/markup-compatibility/2006" xmlns:o="urn:schemas-microsoft-com:office:office" xmlns:r="http://schemas.openxmlformats.org/officeDocument/2006/relationships" xmlns:m="http://schemas.openxmlformats.org/officeDocument/2006/math" xmlns:v="urn:schemas-microsoft-com:vml" xmlns:wp14="http://schemas.microsoft.com/office/word/2010/wordprocessingDrawing" xmlns:wp="http://schemas.openxmlformats.org/drawingml/2006/wordprocessingDrawing" xmlns:w10="urn:schemas-microsoft-com:office:word" xmlns:w="http://schemas.openxmlformats.org/wordprocessingml/2006/main" xmlns:w14="http://schemas.microsoft.com/office/word/2010/wordml" xmlns:wpg="http://schemas.microsoft.com/office/word/2010/wordprocessingGroup" xmlns:wpi="http://schemas.microsoft.com/office/word/2010/wordprocessingInk" xmlns:wne="http://schemas.microsoft.com/office/word/2006/wordml" xmlns:wps="http://schemas.microsoft.com/office/word/2010/wordprocessingShape" mc:Ignorable="w14 wp14">
   <w:p>
     <w:pPr>
       <w:pStyle w:val="Header"/>
@@ -2171,8 +2040,8 @@
 </file>
 
 <file path=word/numbering.xml><?xml version="1.0" encoding="utf-8"?>
-<w:numbering xmlns:wpc="http://schemas.microsoft.com/office/word/2010/wordprocessingCanvas" xmlns:cx="http://schemas.microsoft.com/office/drawing/2014/chartex" xmlns:cx1="http://schemas.microsoft.com/office/drawing/2015/9/8/chartex" xmlns:cx2="http://schemas.microsoft.com/office/drawing/2015/10/21/chartex" xmlns:cx3="http://schemas.microsoft.com/office/drawing/2016/5/9/chartex" xmlns:cx4="http://schemas.microsoft.com/office/drawing/2016/5/10/chartex" xmlns:cx5="http://schemas.microsoft.com/office/drawing/2016/5/11/chartex" xmlns:cx6="http://schemas.microsoft.com/office/drawing/2016/5/12/chartex" xmlns:cx7="http://schemas.microsoft.com/office/drawing/2016/5/13/chartex" xmlns:cx8="http://schemas.microsoft.com/office/drawing/2016/5/14/chartex" xmlns:mc="http://schemas.openxmlformats.org/markup-compatibility/2006" xmlns:aink="http://schemas.microsoft.com/office/drawing/2016/ink" xmlns:am3d="http://schemas.microsoft.com/office/drawing/2017/model3d" xmlns:o="urn:schemas-microsoft-com:office:office" xmlns:r="http://schemas.openxmlformats.org/officeDocument/2006/relationships" xmlns:m="http://schemas.openxmlformats.org/officeDocument/2006/math" xmlns:v="urn:schemas-microsoft-com:vml" xmlns:wp14="http://schemas.microsoft.com/office/word/2010/wordprocessingDrawing" xmlns:wp="http://schemas.openxmlformats.org/drawingml/2006/wordprocessingDrawing" xmlns:w10="urn:schemas-microsoft-com:office:word" xmlns:w="http://schemas.openxmlformats.org/wordprocessingml/2006/main" xmlns:w14="http://schemas.microsoft.com/office/word/2010/wordml" xmlns:w15="http://schemas.microsoft.com/office/word/2012/wordml" xmlns:w16cex="http://schemas.microsoft.com/office/word/2018/wordml/cex" xmlns:w16cid="http://schemas.microsoft.com/office/word/2016/wordml/cid" xmlns:w16="http://schemas.microsoft.com/office/word/2018/wordml" xmlns:w16sdtdh="http://schemas.microsoft.com/office/word/2020/wordml/sdtdatahash" xmlns:w16se="http://schemas.microsoft.com/office/word/2015/wordml/symex" xmlns:wpg="http://schemas.microsoft.com/office/word/2010/wordprocessingGroup" xmlns:wpi="http://schemas.microsoft.com/office/word/2010/wordprocessingInk" xmlns:wne="http://schemas.microsoft.com/office/word/2006/wordml" xmlns:wps="http://schemas.microsoft.com/office/word/2010/wordprocessingShape" mc:Ignorable="w14 w15 w16se w16cid w16 w16cex w16sdtdh wp14">
-  <w:abstractNum w:abstractNumId="0" w15:restartNumberingAfterBreak="0">
+<w:numbering xmlns:wpc="http://schemas.microsoft.com/office/word/2010/wordprocessingCanvas" xmlns:mc="http://schemas.openxmlformats.org/markup-compatibility/2006" xmlns:o="urn:schemas-microsoft-com:office:office" xmlns:r="http://schemas.openxmlformats.org/officeDocument/2006/relationships" xmlns:m="http://schemas.openxmlformats.org/officeDocument/2006/math" xmlns:v="urn:schemas-microsoft-com:vml" xmlns:wp14="http://schemas.microsoft.com/office/word/2010/wordprocessingDrawing" xmlns:wp="http://schemas.openxmlformats.org/drawingml/2006/wordprocessingDrawing" xmlns:w10="urn:schemas-microsoft-com:office:word" xmlns:w="http://schemas.openxmlformats.org/wordprocessingml/2006/main" xmlns:w14="http://schemas.microsoft.com/office/word/2010/wordml" xmlns:wpg="http://schemas.microsoft.com/office/word/2010/wordprocessingGroup" xmlns:wpi="http://schemas.microsoft.com/office/word/2010/wordprocessingInk" xmlns:wne="http://schemas.microsoft.com/office/word/2006/wordml" xmlns:wps="http://schemas.microsoft.com/office/word/2010/wordprocessingShape" mc:Ignorable="w14 wp14">
+  <w:abstractNum w:abstractNumId="0">
     <w:nsid w:val="051F1BA3"/>
     <w:multiLevelType w:val="hybridMultilevel"/>
     <w:tmpl w:val="DAF6B360"/>
@@ -2285,7 +2154,7 @@
       </w:rPr>
     </w:lvl>
   </w:abstractNum>
-  <w:abstractNum w:abstractNumId="1" w15:restartNumberingAfterBreak="0">
+  <w:abstractNum w:abstractNumId="1">
     <w:nsid w:val="08C6366F"/>
     <w:multiLevelType w:val="hybridMultilevel"/>
     <w:tmpl w:val="D3561CAA"/>
@@ -2372,7 +2241,7 @@
       </w:pPr>
     </w:lvl>
   </w:abstractNum>
-  <w:abstractNum w:abstractNumId="2" w15:restartNumberingAfterBreak="0">
+  <w:abstractNum w:abstractNumId="2">
     <w:nsid w:val="0C357DD6"/>
     <w:multiLevelType w:val="hybridMultilevel"/>
     <w:tmpl w:val="D83AD7E4"/>
@@ -2463,7 +2332,7 @@
       </w:pPr>
     </w:lvl>
   </w:abstractNum>
-  <w:abstractNum w:abstractNumId="3" w15:restartNumberingAfterBreak="0">
+  <w:abstractNum w:abstractNumId="3">
     <w:nsid w:val="0DEA069D"/>
     <w:multiLevelType w:val="multilevel"/>
     <w:tmpl w:val="450C4EF6"/>
@@ -2604,7 +2473,7 @@
       </w:rPr>
     </w:lvl>
   </w:abstractNum>
-  <w:abstractNum w:abstractNumId="4" w15:restartNumberingAfterBreak="0">
+  <w:abstractNum w:abstractNumId="4">
     <w:nsid w:val="107C07BC"/>
     <w:multiLevelType w:val="hybridMultilevel"/>
     <w:tmpl w:val="EDBA8B9E"/>
@@ -2717,7 +2586,7 @@
       </w:rPr>
     </w:lvl>
   </w:abstractNum>
-  <w:abstractNum w:abstractNumId="5" w15:restartNumberingAfterBreak="0">
+  <w:abstractNum w:abstractNumId="5">
     <w:nsid w:val="15510218"/>
     <w:multiLevelType w:val="hybridMultilevel"/>
     <w:tmpl w:val="8EF49D20"/>
@@ -2807,7 +2676,7 @@
       </w:pPr>
     </w:lvl>
   </w:abstractNum>
-  <w:abstractNum w:abstractNumId="6" w15:restartNumberingAfterBreak="0">
+  <w:abstractNum w:abstractNumId="6">
     <w:nsid w:val="253D4794"/>
     <w:multiLevelType w:val="multilevel"/>
     <w:tmpl w:val="8C80AB36"/>
@@ -2920,7 +2789,7 @@
       </w:rPr>
     </w:lvl>
   </w:abstractNum>
-  <w:abstractNum w:abstractNumId="7" w15:restartNumberingAfterBreak="0">
+  <w:abstractNum w:abstractNumId="7">
     <w:nsid w:val="27FF20A5"/>
     <w:multiLevelType w:val="hybridMultilevel"/>
     <w:tmpl w:val="9036D3D8"/>
@@ -3035,7 +2904,7 @@
       </w:rPr>
     </w:lvl>
   </w:abstractNum>
-  <w:abstractNum w:abstractNumId="8" w15:restartNumberingAfterBreak="0">
+  <w:abstractNum w:abstractNumId="8">
     <w:nsid w:val="296F3872"/>
     <w:multiLevelType w:val="hybridMultilevel"/>
     <w:tmpl w:val="5E9E6A2E"/>
@@ -3149,7 +3018,7 @@
       </w:rPr>
     </w:lvl>
   </w:abstractNum>
-  <w:abstractNum w:abstractNumId="9" w15:restartNumberingAfterBreak="0">
+  <w:abstractNum w:abstractNumId="9">
     <w:nsid w:val="4803540D"/>
     <w:multiLevelType w:val="hybridMultilevel"/>
     <w:tmpl w:val="CC58063A"/>
@@ -3263,7 +3132,7 @@
       </w:rPr>
     </w:lvl>
   </w:abstractNum>
-  <w:abstractNum w:abstractNumId="10" w15:restartNumberingAfterBreak="0">
+  <w:abstractNum w:abstractNumId="10">
     <w:nsid w:val="492F4D8F"/>
     <w:multiLevelType w:val="hybridMultilevel"/>
     <w:tmpl w:val="F62C94DE"/>
@@ -3377,7 +3246,7 @@
       </w:rPr>
     </w:lvl>
   </w:abstractNum>
-  <w:abstractNum w:abstractNumId="11" w15:restartNumberingAfterBreak="0">
+  <w:abstractNum w:abstractNumId="11">
     <w:nsid w:val="4B1B7F7B"/>
     <w:multiLevelType w:val="hybridMultilevel"/>
     <w:tmpl w:val="D458C3DA"/>
@@ -3466,7 +3335,7 @@
       </w:pPr>
     </w:lvl>
   </w:abstractNum>
-  <w:abstractNum w:abstractNumId="12" w15:restartNumberingAfterBreak="0">
+  <w:abstractNum w:abstractNumId="12">
     <w:nsid w:val="6B961852"/>
     <w:multiLevelType w:val="hybridMultilevel"/>
     <w:tmpl w:val="DAAECE10"/>
@@ -3559,7 +3428,7 @@
       </w:pPr>
     </w:lvl>
   </w:abstractNum>
-  <w:abstractNum w:abstractNumId="13" w15:restartNumberingAfterBreak="0">
+  <w:abstractNum w:abstractNumId="13">
     <w:nsid w:val="6F5D1775"/>
     <w:multiLevelType w:val="hybridMultilevel"/>
     <w:tmpl w:val="2F6EF11C"/>
@@ -3731,7 +3600,7 @@
 </file>
 
 <file path=word/styles.xml><?xml version="1.0" encoding="utf-8"?>
-<w:styles xmlns:mc="http://schemas.openxmlformats.org/markup-compatibility/2006" xmlns:r="http://schemas.openxmlformats.org/officeDocument/2006/relationships" xmlns:w="http://schemas.openxmlformats.org/wordprocessingml/2006/main" xmlns:w14="http://schemas.microsoft.com/office/word/2010/wordml" xmlns:w15="http://schemas.microsoft.com/office/word/2012/wordml" xmlns:w16cex="http://schemas.microsoft.com/office/word/2018/wordml/cex" xmlns:w16cid="http://schemas.microsoft.com/office/word/2016/wordml/cid" xmlns:w16="http://schemas.microsoft.com/office/word/2018/wordml" xmlns:w16sdtdh="http://schemas.microsoft.com/office/word/2020/wordml/sdtdatahash" xmlns:w16se="http://schemas.microsoft.com/office/word/2015/wordml/symex" mc:Ignorable="w14 w15 w16se w16cid w16 w16cex w16sdtdh">
+<w:styles xmlns:mc="http://schemas.openxmlformats.org/markup-compatibility/2006" xmlns:r="http://schemas.openxmlformats.org/officeDocument/2006/relationships" xmlns:w="http://schemas.openxmlformats.org/wordprocessingml/2006/main" xmlns:w14="http://schemas.microsoft.com/office/word/2010/wordml" mc:Ignorable="w14">
   <w:docDefaults>
     <w:rPrDefault>
       <w:rPr>
@@ -3747,383 +3616,147 @@
       </w:pPr>
     </w:pPrDefault>
   </w:docDefaults>
-  <w:latentStyles w:defLockedState="0" w:defUIPriority="99" w:defSemiHidden="0" w:defUnhideWhenUsed="0" w:defQFormat="0" w:count="376">
-    <w:lsdException w:name="Normal" w:uiPriority="0" w:qFormat="1"/>
-    <w:lsdException w:name="heading 1" w:uiPriority="9" w:qFormat="1"/>
-    <w:lsdException w:name="heading 2" w:semiHidden="1" w:uiPriority="9" w:unhideWhenUsed="1" w:qFormat="1"/>
-    <w:lsdException w:name="heading 3" w:semiHidden="1" w:uiPriority="9" w:unhideWhenUsed="1" w:qFormat="1"/>
-    <w:lsdException w:name="heading 4" w:semiHidden="1" w:uiPriority="9" w:unhideWhenUsed="1" w:qFormat="1"/>
-    <w:lsdException w:name="heading 5" w:semiHidden="1" w:uiPriority="9" w:unhideWhenUsed="1" w:qFormat="1"/>
-    <w:lsdException w:name="heading 6" w:semiHidden="1" w:uiPriority="9" w:unhideWhenUsed="1" w:qFormat="1"/>
-    <w:lsdException w:name="heading 7" w:semiHidden="1" w:uiPriority="9" w:unhideWhenUsed="1" w:qFormat="1"/>
-    <w:lsdException w:name="heading 8" w:semiHidden="1" w:uiPriority="9" w:unhideWhenUsed="1" w:qFormat="1"/>
-    <w:lsdException w:name="heading 9" w:semiHidden="1" w:uiPriority="9" w:unhideWhenUsed="1" w:qFormat="1"/>
-    <w:lsdException w:name="index 1" w:semiHidden="1" w:unhideWhenUsed="1"/>
-    <w:lsdException w:name="index 2" w:semiHidden="1" w:unhideWhenUsed="1"/>
-    <w:lsdException w:name="index 3" w:semiHidden="1" w:unhideWhenUsed="1"/>
-    <w:lsdException w:name="index 4" w:semiHidden="1" w:unhideWhenUsed="1"/>
-    <w:lsdException w:name="index 5" w:semiHidden="1" w:unhideWhenUsed="1"/>
-    <w:lsdException w:name="index 6" w:semiHidden="1" w:unhideWhenUsed="1"/>
-    <w:lsdException w:name="index 7" w:semiHidden="1" w:unhideWhenUsed="1"/>
-    <w:lsdException w:name="index 8" w:semiHidden="1" w:unhideWhenUsed="1"/>
-    <w:lsdException w:name="index 9" w:semiHidden="1" w:unhideWhenUsed="1"/>
-    <w:lsdException w:name="toc 1" w:semiHidden="1" w:uiPriority="39" w:unhideWhenUsed="1"/>
-    <w:lsdException w:name="toc 2" w:semiHidden="1" w:uiPriority="39" w:unhideWhenUsed="1"/>
-    <w:lsdException w:name="toc 3" w:semiHidden="1" w:uiPriority="39" w:unhideWhenUsed="1"/>
-    <w:lsdException w:name="toc 4" w:semiHidden="1" w:uiPriority="39" w:unhideWhenUsed="1"/>
-    <w:lsdException w:name="toc 5" w:semiHidden="1" w:uiPriority="39" w:unhideWhenUsed="1"/>
-    <w:lsdException w:name="toc 6" w:semiHidden="1" w:uiPriority="39" w:unhideWhenUsed="1"/>
-    <w:lsdException w:name="toc 7" w:semiHidden="1" w:uiPriority="39" w:unhideWhenUsed="1"/>
-    <w:lsdException w:name="toc 8" w:semiHidden="1" w:uiPriority="39" w:unhideWhenUsed="1"/>
-    <w:lsdException w:name="toc 9" w:semiHidden="1" w:uiPriority="39" w:unhideWhenUsed="1"/>
-    <w:lsdException w:name="Normal Indent" w:semiHidden="1" w:unhideWhenUsed="1"/>
-    <w:lsdException w:name="footnote text" w:semiHidden="1" w:unhideWhenUsed="1"/>
-    <w:lsdException w:name="annotation text" w:semiHidden="1" w:unhideWhenUsed="1" w:qFormat="1"/>
-    <w:lsdException w:name="header" w:semiHidden="1" w:unhideWhenUsed="1"/>
-    <w:lsdException w:name="footer" w:semiHidden="1" w:unhideWhenUsed="1"/>
-    <w:lsdException w:name="index heading" w:semiHidden="1" w:unhideWhenUsed="1"/>
-    <w:lsdException w:name="caption" w:semiHidden="1" w:uiPriority="35" w:unhideWhenUsed="1" w:qFormat="1"/>
-    <w:lsdException w:name="table of figures" w:semiHidden="1" w:unhideWhenUsed="1"/>
-    <w:lsdException w:name="envelope address" w:semiHidden="1" w:unhideWhenUsed="1"/>
-    <w:lsdException w:name="envelope return" w:semiHidden="1" w:unhideWhenUsed="1"/>
-    <w:lsdException w:name="footnote reference" w:semiHidden="1" w:unhideWhenUsed="1"/>
-    <w:lsdException w:name="annotation reference" w:semiHidden="1" w:unhideWhenUsed="1" w:qFormat="1"/>
-    <w:lsdException w:name="line number" w:semiHidden="1" w:unhideWhenUsed="1"/>
-    <w:lsdException w:name="page number" w:semiHidden="1" w:unhideWhenUsed="1"/>
-    <w:lsdException w:name="endnote reference" w:semiHidden="1" w:unhideWhenUsed="1"/>
-    <w:lsdException w:name="endnote text" w:semiHidden="1" w:unhideWhenUsed="1"/>
-    <w:lsdException w:name="table of authorities" w:semiHidden="1" w:unhideWhenUsed="1"/>
-    <w:lsdException w:name="macro" w:semiHidden="1" w:unhideWhenUsed="1"/>
-    <w:lsdException w:name="toa heading" w:semiHidden="1" w:unhideWhenUsed="1"/>
-    <w:lsdException w:name="List" w:semiHidden="1" w:unhideWhenUsed="1"/>
-    <w:lsdException w:name="List Bullet" w:semiHidden="1" w:unhideWhenUsed="1"/>
-    <w:lsdException w:name="List Number" w:semiHidden="1" w:unhideWhenUsed="1"/>
-    <w:lsdException w:name="List 2" w:semiHidden="1" w:unhideWhenUsed="1"/>
-    <w:lsdException w:name="List 3" w:semiHidden="1" w:unhideWhenUsed="1"/>
-    <w:lsdException w:name="List 4" w:semiHidden="1" w:unhideWhenUsed="1"/>
-    <w:lsdException w:name="List 5" w:semiHidden="1" w:unhideWhenUsed="1"/>
-    <w:lsdException w:name="List Bullet 2" w:semiHidden="1" w:unhideWhenUsed="1"/>
-    <w:lsdException w:name="List Bullet 3" w:semiHidden="1" w:unhideWhenUsed="1"/>
-    <w:lsdException w:name="List Bullet 4" w:semiHidden="1" w:unhideWhenUsed="1"/>
-    <w:lsdException w:name="List Bullet 5" w:semiHidden="1" w:unhideWhenUsed="1"/>
-    <w:lsdException w:name="List Number 2" w:semiHidden="1" w:unhideWhenUsed="1"/>
-    <w:lsdException w:name="List Number 3" w:semiHidden="1" w:unhideWhenUsed="1"/>
-    <w:lsdException w:name="List Number 4" w:semiHidden="1" w:unhideWhenUsed="1"/>
-    <w:lsdException w:name="List Number 5" w:semiHidden="1" w:unhideWhenUsed="1"/>
-    <w:lsdException w:name="Title" w:uiPriority="10" w:qFormat="1"/>
-    <w:lsdException w:name="Closing" w:semiHidden="1" w:unhideWhenUsed="1"/>
-    <w:lsdException w:name="Signature" w:semiHidden="1" w:unhideWhenUsed="1"/>
-    <w:lsdException w:name="Default Paragraph Font" w:semiHidden="1" w:uiPriority="1" w:unhideWhenUsed="1"/>
-    <w:lsdException w:name="Body Text" w:semiHidden="1" w:uiPriority="1" w:unhideWhenUsed="1" w:qFormat="1"/>
-    <w:lsdException w:name="Body Text Indent" w:semiHidden="1" w:unhideWhenUsed="1"/>
-    <w:lsdException w:name="List Continue" w:semiHidden="1" w:unhideWhenUsed="1"/>
-    <w:lsdException w:name="List Continue 2" w:semiHidden="1" w:unhideWhenUsed="1"/>
-    <w:lsdException w:name="List Continue 3" w:semiHidden="1" w:unhideWhenUsed="1"/>
-    <w:lsdException w:name="List Continue 4" w:semiHidden="1" w:unhideWhenUsed="1"/>
-    <w:lsdException w:name="List Continue 5" w:semiHidden="1" w:unhideWhenUsed="1"/>
-    <w:lsdException w:name="Message Header" w:semiHidden="1" w:unhideWhenUsed="1"/>
-    <w:lsdException w:name="Subtitle" w:uiPriority="11" w:qFormat="1"/>
-    <w:lsdException w:name="Salutation" w:semiHidden="1" w:unhideWhenUsed="1"/>
-    <w:lsdException w:name="Date" w:semiHidden="1" w:unhideWhenUsed="1"/>
-    <w:lsdException w:name="Body Text First Indent" w:semiHidden="1" w:unhideWhenUsed="1"/>
-    <w:lsdException w:name="Body Text First Indent 2" w:semiHidden="1" w:unhideWhenUsed="1"/>
-    <w:lsdException w:name="Note Heading" w:semiHidden="1" w:unhideWhenUsed="1"/>
-    <w:lsdException w:name="Body Text 2" w:semiHidden="1" w:unhideWhenUsed="1"/>
-    <w:lsdException w:name="Body Text 3" w:semiHidden="1" w:unhideWhenUsed="1"/>
-    <w:lsdException w:name="Body Text Indent 2" w:semiHidden="1" w:unhideWhenUsed="1"/>
-    <w:lsdException w:name="Body Text Indent 3" w:semiHidden="1" w:unhideWhenUsed="1"/>
-    <w:lsdException w:name="Block Text" w:semiHidden="1" w:unhideWhenUsed="1"/>
-    <w:lsdException w:name="Hyperlink" w:semiHidden="1" w:unhideWhenUsed="1"/>
-    <w:lsdException w:name="FollowedHyperlink" w:semiHidden="1" w:unhideWhenUsed="1"/>
-    <w:lsdException w:name="Strong" w:uiPriority="22" w:qFormat="1"/>
-    <w:lsdException w:name="Emphasis" w:uiPriority="20" w:qFormat="1"/>
-    <w:lsdException w:name="Document Map" w:semiHidden="1" w:unhideWhenUsed="1"/>
-    <w:lsdException w:name="Plain Text" w:semiHidden="1" w:unhideWhenUsed="1"/>
-    <w:lsdException w:name="E-mail Signature" w:semiHidden="1" w:unhideWhenUsed="1"/>
-    <w:lsdException w:name="HTML Top of Form" w:semiHidden="1" w:unhideWhenUsed="1"/>
-    <w:lsdException w:name="HTML Bottom of Form" w:semiHidden="1" w:unhideWhenUsed="1"/>
-    <w:lsdException w:name="Normal (Web)" w:semiHidden="1" w:unhideWhenUsed="1"/>
-    <w:lsdException w:name="HTML Acronym" w:semiHidden="1" w:unhideWhenUsed="1"/>
-    <w:lsdException w:name="HTML Address" w:semiHidden="1" w:unhideWhenUsed="1"/>
-    <w:lsdException w:name="HTML Cite" w:semiHidden="1" w:unhideWhenUsed="1"/>
-    <w:lsdException w:name="HTML Code" w:semiHidden="1" w:unhideWhenUsed="1"/>
-    <w:lsdException w:name="HTML Definition" w:semiHidden="1" w:unhideWhenUsed="1"/>
-    <w:lsdException w:name="HTML Keyboard" w:semiHidden="1" w:unhideWhenUsed="1"/>
-    <w:lsdException w:name="HTML Preformatted" w:semiHidden="1" w:unhideWhenUsed="1"/>
-    <w:lsdException w:name="HTML Sample" w:semiHidden="1" w:unhideWhenUsed="1"/>
-    <w:lsdException w:name="HTML Typewriter" w:semiHidden="1" w:unhideWhenUsed="1"/>
-    <w:lsdException w:name="HTML Variable" w:semiHidden="1" w:unhideWhenUsed="1"/>
-    <w:lsdException w:name="Normal Table" w:semiHidden="1" w:unhideWhenUsed="1"/>
-    <w:lsdException w:name="annotation subject" w:semiHidden="1" w:unhideWhenUsed="1"/>
-    <w:lsdException w:name="No List" w:semiHidden="1" w:unhideWhenUsed="1"/>
-    <w:lsdException w:name="Outline List 1" w:semiHidden="1" w:unhideWhenUsed="1"/>
-    <w:lsdException w:name="Outline List 2" w:semiHidden="1" w:unhideWhenUsed="1"/>
-    <w:lsdException w:name="Outline List 3" w:semiHidden="1" w:unhideWhenUsed="1"/>
-    <w:lsdException w:name="Table Simple 1" w:semiHidden="1" w:unhideWhenUsed="1"/>
-    <w:lsdException w:name="Table Simple 2" w:semiHidden="1" w:unhideWhenUsed="1"/>
-    <w:lsdException w:name="Table Simple 3" w:semiHidden="1" w:unhideWhenUsed="1"/>
-    <w:lsdException w:name="Table Classic 1" w:semiHidden="1" w:unhideWhenUsed="1"/>
-    <w:lsdException w:name="Table Classic 2" w:semiHidden="1" w:unhideWhenUsed="1"/>
-    <w:lsdException w:name="Table Classic 3" w:semiHidden="1" w:unhideWhenUsed="1"/>
-    <w:lsdException w:name="Table Classic 4" w:semiHidden="1" w:unhideWhenUsed="1"/>
-    <w:lsdException w:name="Table Colorful 1" w:semiHidden="1" w:unhideWhenUsed="1"/>
-    <w:lsdException w:name="Table Colorful 2" w:semiHidden="1" w:unhideWhenUsed="1"/>
-    <w:lsdException w:name="Table Colorful 3" w:semiHidden="1" w:unhideWhenUsed="1"/>
-    <w:lsdException w:name="Table Columns 1" w:semiHidden="1" w:unhideWhenUsed="1"/>
-    <w:lsdException w:name="Table Columns 2" w:semiHidden="1" w:unhideWhenUsed="1"/>
-    <w:lsdException w:name="Table Columns 3" w:semiHidden="1" w:unhideWhenUsed="1"/>
-    <w:lsdException w:name="Table Columns 4" w:semiHidden="1" w:unhideWhenUsed="1"/>
-    <w:lsdException w:name="Table Columns 5" w:semiHidden="1" w:unhideWhenUsed="1"/>
-    <w:lsdException w:name="Table Grid 1" w:semiHidden="1" w:unhideWhenUsed="1"/>
-    <w:lsdException w:name="Table Grid 2" w:semiHidden="1" w:unhideWhenUsed="1"/>
-    <w:lsdException w:name="Table Grid 3" w:semiHidden="1" w:unhideWhenUsed="1"/>
-    <w:lsdException w:name="Table Grid 4" w:semiHidden="1" w:unhideWhenUsed="1"/>
-    <w:lsdException w:name="Table Grid 5" w:semiHidden="1" w:unhideWhenUsed="1"/>
-    <w:lsdException w:name="Table Grid 6" w:semiHidden="1" w:unhideWhenUsed="1"/>
-    <w:lsdException w:name="Table Grid 7" w:semiHidden="1" w:unhideWhenUsed="1"/>
-    <w:lsdException w:name="Table Grid 8" w:semiHidden="1" w:unhideWhenUsed="1"/>
-    <w:lsdException w:name="Table List 1" w:semiHidden="1" w:unhideWhenUsed="1"/>
-    <w:lsdException w:name="Table List 2" w:semiHidden="1" w:unhideWhenUsed="1"/>
-    <w:lsdException w:name="Table List 3" w:semiHidden="1" w:unhideWhenUsed="1"/>
-    <w:lsdException w:name="Table List 4" w:semiHidden="1" w:unhideWhenUsed="1"/>
-    <w:lsdException w:name="Table List 5" w:semiHidden="1" w:unhideWhenUsed="1"/>
-    <w:lsdException w:name="Table List 6" w:semiHidden="1" w:unhideWhenUsed="1"/>
-    <w:lsdException w:name="Table List 7" w:semiHidden="1" w:unhideWhenUsed="1"/>
-    <w:lsdException w:name="Table List 8" w:semiHidden="1" w:unhideWhenUsed="1"/>
-    <w:lsdException w:name="Table 3D effects 1" w:semiHidden="1" w:unhideWhenUsed="1"/>
-    <w:lsdException w:name="Table 3D effects 2" w:semiHidden="1" w:unhideWhenUsed="1"/>
-    <w:lsdException w:name="Table 3D effects 3" w:semiHidden="1" w:unhideWhenUsed="1"/>
-    <w:lsdException w:name="Table Contemporary" w:semiHidden="1" w:unhideWhenUsed="1"/>
-    <w:lsdException w:name="Table Elegant" w:semiHidden="1" w:unhideWhenUsed="1"/>
-    <w:lsdException w:name="Table Professional" w:semiHidden="1" w:unhideWhenUsed="1"/>
-    <w:lsdException w:name="Table Subtle 1" w:semiHidden="1" w:unhideWhenUsed="1"/>
-    <w:lsdException w:name="Table Subtle 2" w:semiHidden="1" w:unhideWhenUsed="1"/>
-    <w:lsdException w:name="Table Web 1" w:semiHidden="1" w:unhideWhenUsed="1"/>
-    <w:lsdException w:name="Table Web 2" w:semiHidden="1" w:unhideWhenUsed="1"/>
-    <w:lsdException w:name="Table Web 3" w:semiHidden="1" w:unhideWhenUsed="1"/>
-    <w:lsdException w:name="Balloon Text" w:semiHidden="1" w:unhideWhenUsed="1"/>
-    <w:lsdException w:name="Table Grid" w:uiPriority="39"/>
-    <w:lsdException w:name="Table Theme" w:semiHidden="1" w:unhideWhenUsed="1"/>
-    <w:lsdException w:name="Placeholder Text" w:semiHidden="1"/>
-    <w:lsdException w:name="No Spacing" w:uiPriority="1" w:qFormat="1"/>
-    <w:lsdException w:name="Light Shading" w:uiPriority="60"/>
-    <w:lsdException w:name="Light List" w:uiPriority="61"/>
-    <w:lsdException w:name="Light Grid" w:uiPriority="62"/>
-    <w:lsdException w:name="Medium Shading 1" w:uiPriority="63"/>
-    <w:lsdException w:name="Medium Shading 2" w:uiPriority="64"/>
-    <w:lsdException w:name="Medium List 1" w:uiPriority="65"/>
-    <w:lsdException w:name="Medium List 2" w:uiPriority="66"/>
-    <w:lsdException w:name="Medium Grid 1" w:uiPriority="67"/>
-    <w:lsdException w:name="Medium Grid 2" w:uiPriority="68"/>
-    <w:lsdException w:name="Medium Grid 3" w:uiPriority="69"/>
-    <w:lsdException w:name="Dark List" w:uiPriority="70"/>
-    <w:lsdException w:name="Colorful Shading" w:uiPriority="71"/>
-    <w:lsdException w:name="Colorful List" w:uiPriority="72"/>
-    <w:lsdException w:name="Colorful Grid" w:uiPriority="73"/>
-    <w:lsdException w:name="Light Shading Accent 1" w:uiPriority="60"/>
-    <w:lsdException w:name="Light List Accent 1" w:uiPriority="61"/>
-    <w:lsdException w:name="Light Grid Accent 1" w:uiPriority="62"/>
-    <w:lsdException w:name="Medium Shading 1 Accent 1" w:uiPriority="63"/>
-    <w:lsdException w:name="Medium Shading 2 Accent 1" w:uiPriority="64"/>
-    <w:lsdException w:name="Medium List 1 Accent 1" w:uiPriority="65"/>
-    <w:lsdException w:name="Revision" w:semiHidden="1"/>
-    <w:lsdException w:name="List Paragraph" w:uiPriority="34" w:qFormat="1"/>
-    <w:lsdException w:name="Quote" w:uiPriority="29" w:qFormat="1"/>
-    <w:lsdException w:name="Intense Quote" w:uiPriority="30" w:qFormat="1"/>
-    <w:lsdException w:name="Medium List 2 Accent 1" w:uiPriority="66"/>
-    <w:lsdException w:name="Medium Grid 1 Accent 1" w:uiPriority="67"/>
-    <w:lsdException w:name="Medium Grid 2 Accent 1" w:uiPriority="68"/>
-    <w:lsdException w:name="Medium Grid 3 Accent 1" w:uiPriority="69"/>
-    <w:lsdException w:name="Dark List Accent 1" w:uiPriority="70"/>
-    <w:lsdException w:name="Colorful Shading Accent 1" w:uiPriority="71"/>
-    <w:lsdException w:name="Colorful List Accent 1" w:uiPriority="72"/>
-    <w:lsdException w:name="Colorful Grid Accent 1" w:uiPriority="73"/>
-    <w:lsdException w:name="Light Shading Accent 2" w:uiPriority="60"/>
-    <w:lsdException w:name="Light List Accent 2" w:uiPriority="61"/>
-    <w:lsdException w:name="Light Grid Accent 2" w:uiPriority="62"/>
-    <w:lsdException w:name="Medium Shading 1 Accent 2" w:uiPriority="63"/>
-    <w:lsdException w:name="Medium Shading 2 Accent 2" w:uiPriority="64"/>
-    <w:lsdException w:name="Medium List 1 Accent 2" w:uiPriority="65"/>
-    <w:lsdException w:name="Medium List 2 Accent 2" w:uiPriority="66"/>
-    <w:lsdException w:name="Medium Grid 1 Accent 2" w:uiPriority="67"/>
-    <w:lsdException w:name="Medium Grid 2 Accent 2" w:uiPriority="68"/>
-    <w:lsdException w:name="Medium Grid 3 Accent 2" w:uiPriority="69"/>
-    <w:lsdException w:name="Dark List Accent 2" w:uiPriority="70"/>
-    <w:lsdException w:name="Colorful Shading Accent 2" w:uiPriority="71"/>
-    <w:lsdException w:name="Colorful List Accent 2" w:uiPriority="72"/>
-    <w:lsdException w:name="Colorful Grid Accent 2" w:uiPriority="73"/>
-    <w:lsdException w:name="Light Shading Accent 3" w:uiPriority="60"/>
-    <w:lsdException w:name="Light List Accent 3" w:uiPriority="61"/>
-    <w:lsdException w:name="Light Grid Accent 3" w:uiPriority="62"/>
-    <w:lsdException w:name="Medium Shading 1 Accent 3" w:uiPriority="63"/>
-    <w:lsdException w:name="Medium Shading 2 Accent 3" w:uiPriority="64"/>
-    <w:lsdException w:name="Medium List 1 Accent 3" w:uiPriority="65"/>
-    <w:lsdException w:name="Medium List 2 Accent 3" w:uiPriority="66"/>
-    <w:lsdException w:name="Medium Grid 1 Accent 3" w:uiPriority="67"/>
-    <w:lsdException w:name="Medium Grid 2 Accent 3" w:uiPriority="68"/>
-    <w:lsdException w:name="Medium Grid 3 Accent 3" w:uiPriority="69"/>
-    <w:lsdException w:name="Dark List Accent 3" w:uiPriority="70"/>
-    <w:lsdException w:name="Colorful Shading Accent 3" w:uiPriority="71"/>
-    <w:lsdException w:name="Colorful List Accent 3" w:uiPriority="72"/>
-    <w:lsdException w:name="Colorful Grid Accent 3" w:uiPriority="73"/>
-    <w:lsdException w:name="Light Shading Accent 4" w:uiPriority="60"/>
-    <w:lsdException w:name="Light List Accent 4" w:uiPriority="61"/>
-    <w:lsdException w:name="Light Grid Accent 4" w:uiPriority="62"/>
-    <w:lsdException w:name="Medium Shading 1 Accent 4" w:uiPriority="63"/>
-    <w:lsdException w:name="Medium Shading 2 Accent 4" w:uiPriority="64"/>
-    <w:lsdException w:name="Medium List 1 Accent 4" w:uiPriority="65"/>
-    <w:lsdException w:name="Medium List 2 Accent 4" w:uiPriority="66"/>
-    <w:lsdException w:name="Medium Grid 1 Accent 4" w:uiPriority="67"/>
-    <w:lsdException w:name="Medium Grid 2 Accent 4" w:uiPriority="68"/>
-    <w:lsdException w:name="Medium Grid 3 Accent 4" w:uiPriority="69"/>
-    <w:lsdException w:name="Dark List Accent 4" w:uiPriority="70"/>
-    <w:lsdException w:name="Colorful Shading Accent 4" w:uiPriority="71"/>
-    <w:lsdException w:name="Colorful List Accent 4" w:uiPriority="72"/>
-    <w:lsdException w:name="Colorful Grid Accent 4" w:uiPriority="73"/>
-    <w:lsdException w:name="Light Shading Accent 5" w:uiPriority="60"/>
-    <w:lsdException w:name="Light List Accent 5" w:uiPriority="61"/>
-    <w:lsdException w:name="Light Grid Accent 5" w:uiPriority="62"/>
-    <w:lsdException w:name="Medium Shading 1 Accent 5" w:uiPriority="63"/>
-    <w:lsdException w:name="Medium Shading 2 Accent 5" w:uiPriority="64"/>
-    <w:lsdException w:name="Medium List 1 Accent 5" w:uiPriority="65"/>
-    <w:lsdException w:name="Medium List 2 Accent 5" w:uiPriority="66"/>
-    <w:lsdException w:name="Medium Grid 1 Accent 5" w:uiPriority="67"/>
-    <w:lsdException w:name="Medium Grid 2 Accent 5" w:uiPriority="68"/>
-    <w:lsdException w:name="Medium Grid 3 Accent 5" w:uiPriority="69"/>
-    <w:lsdException w:name="Dark List Accent 5" w:uiPriority="70"/>
-    <w:lsdException w:name="Colorful Shading Accent 5" w:uiPriority="71"/>
-    <w:lsdException w:name="Colorful List Accent 5" w:uiPriority="72"/>
-    <w:lsdException w:name="Colorful Grid Accent 5" w:uiPriority="73"/>
-    <w:lsdException w:name="Light Shading Accent 6" w:uiPriority="60"/>
-    <w:lsdException w:name="Light List Accent 6" w:uiPriority="61"/>
-    <w:lsdException w:name="Light Grid Accent 6" w:uiPriority="62"/>
-    <w:lsdException w:name="Medium Shading 1 Accent 6" w:uiPriority="63"/>
-    <w:lsdException w:name="Medium Shading 2 Accent 6" w:uiPriority="64"/>
-    <w:lsdException w:name="Medium List 1 Accent 6" w:uiPriority="65"/>
-    <w:lsdException w:name="Medium List 2 Accent 6" w:uiPriority="66"/>
-    <w:lsdException w:name="Medium Grid 1 Accent 6" w:uiPriority="67"/>
-    <w:lsdException w:name="Medium Grid 2 Accent 6" w:uiPriority="68"/>
-    <w:lsdException w:name="Medium Grid 3 Accent 6" w:uiPriority="69"/>
-    <w:lsdException w:name="Dark List Accent 6" w:uiPriority="70"/>
-    <w:lsdException w:name="Colorful Shading Accent 6" w:uiPriority="71"/>
-    <w:lsdException w:name="Colorful List Accent 6" w:uiPriority="72"/>
-    <w:lsdException w:name="Colorful Grid Accent 6" w:uiPriority="73"/>
-    <w:lsdException w:name="Subtle Emphasis" w:uiPriority="19" w:qFormat="1"/>
-    <w:lsdException w:name="Intense Emphasis" w:uiPriority="21" w:qFormat="1"/>
-    <w:lsdException w:name="Subtle Reference" w:uiPriority="31" w:qFormat="1"/>
-    <w:lsdException w:name="Intense Reference" w:uiPriority="32" w:qFormat="1"/>
-    <w:lsdException w:name="Book Title" w:uiPriority="33" w:qFormat="1"/>
-    <w:lsdException w:name="Bibliography" w:semiHidden="1" w:uiPriority="37" w:unhideWhenUsed="1"/>
-    <w:lsdException w:name="TOC Heading" w:semiHidden="1" w:uiPriority="39" w:unhideWhenUsed="1" w:qFormat="1"/>
-    <w:lsdException w:name="Plain Table 1" w:uiPriority="41"/>
-    <w:lsdException w:name="Plain Table 2" w:uiPriority="42"/>
-    <w:lsdException w:name="Plain Table 3" w:uiPriority="43"/>
-    <w:lsdException w:name="Plain Table 4" w:uiPriority="44"/>
-    <w:lsdException w:name="Plain Table 5" w:uiPriority="45"/>
-    <w:lsdException w:name="Grid Table Light" w:uiPriority="40"/>
-    <w:lsdException w:name="Grid Table 1 Light" w:uiPriority="46"/>
-    <w:lsdException w:name="Grid Table 2" w:uiPriority="47"/>
-    <w:lsdException w:name="Grid Table 3" w:uiPriority="48"/>
-    <w:lsdException w:name="Grid Table 4" w:uiPriority="49"/>
-    <w:lsdException w:name="Grid Table 5 Dark" w:uiPriority="50"/>
-    <w:lsdException w:name="Grid Table 6 Colorful" w:uiPriority="51"/>
-    <w:lsdException w:name="Grid Table 7 Colorful" w:uiPriority="52"/>
-    <w:lsdException w:name="Grid Table 1 Light Accent 1" w:uiPriority="46"/>
-    <w:lsdException w:name="Grid Table 2 Accent 1" w:uiPriority="47"/>
-    <w:lsdException w:name="Grid Table 3 Accent 1" w:uiPriority="48"/>
-    <w:lsdException w:name="Grid Table 4 Accent 1" w:uiPriority="49"/>
-    <w:lsdException w:name="Grid Table 5 Dark Accent 1" w:uiPriority="50"/>
-    <w:lsdException w:name="Grid Table 6 Colorful Accent 1" w:uiPriority="51"/>
-    <w:lsdException w:name="Grid Table 7 Colorful Accent 1" w:uiPriority="52"/>
-    <w:lsdException w:name="Grid Table 1 Light Accent 2" w:uiPriority="46"/>
-    <w:lsdException w:name="Grid Table 2 Accent 2" w:uiPriority="47"/>
-    <w:lsdException w:name="Grid Table 3 Accent 2" w:uiPriority="48"/>
-    <w:lsdException w:name="Grid Table 4 Accent 2" w:uiPriority="49"/>
-    <w:lsdException w:name="Grid Table 5 Dark Accent 2" w:uiPriority="50"/>
-    <w:lsdException w:name="Grid Table 6 Colorful Accent 2" w:uiPriority="51"/>
-    <w:lsdException w:name="Grid Table 7 Colorful Accent 2" w:uiPriority="52"/>
-    <w:lsdException w:name="Grid Table 1 Light Accent 3" w:uiPriority="46"/>
-    <w:lsdException w:name="Grid Table 2 Accent 3" w:uiPriority="47"/>
-    <w:lsdException w:name="Grid Table 3 Accent 3" w:uiPriority="48"/>
-    <w:lsdException w:name="Grid Table 4 Accent 3" w:uiPriority="49"/>
-    <w:lsdException w:name="Grid Table 5 Dark Accent 3" w:uiPriority="50"/>
-    <w:lsdException w:name="Grid Table 6 Colorful Accent 3" w:uiPriority="51"/>
-    <w:lsdException w:name="Grid Table 7 Colorful Accent 3" w:uiPriority="52"/>
-    <w:lsdException w:name="Grid Table 1 Light Accent 4" w:uiPriority="46"/>
-    <w:lsdException w:name="Grid Table 2 Accent 4" w:uiPriority="47"/>
-    <w:lsdException w:name="Grid Table 3 Accent 4" w:uiPriority="48"/>
-    <w:lsdException w:name="Grid Table 4 Accent 4" w:uiPriority="49"/>
-    <w:lsdException w:name="Grid Table 5 Dark Accent 4" w:uiPriority="50"/>
-    <w:lsdException w:name="Grid Table 6 Colorful Accent 4" w:uiPriority="51"/>
-    <w:lsdException w:name="Grid Table 7 Colorful Accent 4" w:uiPriority="52"/>
-    <w:lsdException w:name="Grid Table 1 Light Accent 5" w:uiPriority="46"/>
-    <w:lsdException w:name="Grid Table 2 Accent 5" w:uiPriority="47"/>
-    <w:lsdException w:name="Grid Table 3 Accent 5" w:uiPriority="48"/>
-    <w:lsdException w:name="Grid Table 4 Accent 5" w:uiPriority="49"/>
-    <w:lsdException w:name="Grid Table 5 Dark Accent 5" w:uiPriority="50"/>
-    <w:lsdException w:name="Grid Table 6 Colorful Accent 5" w:uiPriority="51"/>
-    <w:lsdException w:name="Grid Table 7 Colorful Accent 5" w:uiPriority="52"/>
-    <w:lsdException w:name="Grid Table 1 Light Accent 6" w:uiPriority="46"/>
-    <w:lsdException w:name="Grid Table 2 Accent 6" w:uiPriority="47"/>
-    <w:lsdException w:name="Grid Table 3 Accent 6" w:uiPriority="48"/>
-    <w:lsdException w:name="Grid Table 4 Accent 6" w:uiPriority="49"/>
-    <w:lsdException w:name="Grid Table 5 Dark Accent 6" w:uiPriority="50"/>
-    <w:lsdException w:name="Grid Table 6 Colorful Accent 6" w:uiPriority="51"/>
-    <w:lsdException w:name="Grid Table 7 Colorful Accent 6" w:uiPriority="52"/>
-    <w:lsdException w:name="List Table 1 Light" w:uiPriority="46"/>
-    <w:lsdException w:name="List Table 2" w:uiPriority="47"/>
-    <w:lsdException w:name="List Table 3" w:uiPriority="48"/>
-    <w:lsdException w:name="List Table 4" w:uiPriority="49"/>
-    <w:lsdException w:name="List Table 5 Dark" w:uiPriority="50"/>
-    <w:lsdException w:name="List Table 6 Colorful" w:uiPriority="51"/>
-    <w:lsdException w:name="List Table 7 Colorful" w:uiPriority="52"/>
-    <w:lsdException w:name="List Table 1 Light Accent 1" w:uiPriority="46"/>
-    <w:lsdException w:name="List Table 2 Accent 1" w:uiPriority="47"/>
-    <w:lsdException w:name="List Table 3 Accent 1" w:uiPriority="48"/>
-    <w:lsdException w:name="List Table 4 Accent 1" w:uiPriority="49"/>
-    <w:lsdException w:name="List Table 5 Dark Accent 1" w:uiPriority="50"/>
-    <w:lsdException w:name="List Table 6 Colorful Accent 1" w:uiPriority="51"/>
-    <w:lsdException w:name="List Table 7 Colorful Accent 1" w:uiPriority="52"/>
-    <w:lsdException w:name="List Table 1 Light Accent 2" w:uiPriority="46"/>
-    <w:lsdException w:name="List Table 2 Accent 2" w:uiPriority="47"/>
-    <w:lsdException w:name="List Table 3 Accent 2" w:uiPriority="48"/>
-    <w:lsdException w:name="List Table 4 Accent 2" w:uiPriority="49"/>
-    <w:lsdException w:name="List Table 5 Dark Accent 2" w:uiPriority="50"/>
-    <w:lsdException w:name="List Table 6 Colorful Accent 2" w:uiPriority="51"/>
-    <w:lsdException w:name="List Table 7 Colorful Accent 2" w:uiPriority="52"/>
-    <w:lsdException w:name="List Table 1 Light Accent 3" w:uiPriority="46"/>
-    <w:lsdException w:name="List Table 2 Accent 3" w:uiPriority="47"/>
-    <w:lsdException w:name="List Table 3 Accent 3" w:uiPriority="48"/>
-    <w:lsdException w:name="List Table 4 Accent 3" w:uiPriority="49"/>
-    <w:lsdException w:name="List Table 5 Dark Accent 3" w:uiPriority="50"/>
-    <w:lsdException w:name="List Table 6 Colorful Accent 3" w:uiPriority="51"/>
-    <w:lsdException w:name="List Table 7 Colorful Accent 3" w:uiPriority="52"/>
-    <w:lsdException w:name="List Table 1 Light Accent 4" w:uiPriority="46"/>
-    <w:lsdException w:name="List Table 2 Accent 4" w:uiPriority="47"/>
-    <w:lsdException w:name="List Table 3 Accent 4" w:uiPriority="48"/>
-    <w:lsdException w:name="List Table 4 Accent 4" w:uiPriority="49"/>
-    <w:lsdException w:name="List Table 5 Dark Accent 4" w:uiPriority="50"/>
-    <w:lsdException w:name="List Table 6 Colorful Accent 4" w:uiPriority="51"/>
-    <w:lsdException w:name="List Table 7 Colorful Accent 4" w:uiPriority="52"/>
-    <w:lsdException w:name="List Table 1 Light Accent 5" w:uiPriority="46"/>
-    <w:lsdException w:name="List Table 2 Accent 5" w:uiPriority="47"/>
-    <w:lsdException w:name="List Table 3 Accent 5" w:uiPriority="48"/>
-    <w:lsdException w:name="List Table 4 Accent 5" w:uiPriority="49"/>
-    <w:lsdException w:name="List Table 5 Dark Accent 5" w:uiPriority="50"/>
-    <w:lsdException w:name="List Table 6 Colorful Accent 5" w:uiPriority="51"/>
-    <w:lsdException w:name="List Table 7 Colorful Accent 5" w:uiPriority="52"/>
-    <w:lsdException w:name="List Table 1 Light Accent 6" w:uiPriority="46"/>
-    <w:lsdException w:name="List Table 2 Accent 6" w:uiPriority="47"/>
-    <w:lsdException w:name="List Table 3 Accent 6" w:uiPriority="48"/>
-    <w:lsdException w:name="List Table 4 Accent 6" w:uiPriority="49"/>
-    <w:lsdException w:name="List Table 5 Dark Accent 6" w:uiPriority="50"/>
-    <w:lsdException w:name="List Table 6 Colorful Accent 6" w:uiPriority="51"/>
-    <w:lsdException w:name="List Table 7 Colorful Accent 6" w:uiPriority="52"/>
-    <w:lsdException w:name="Mention" w:semiHidden="1" w:unhideWhenUsed="1"/>
-    <w:lsdException w:name="Smart Hyperlink" w:semiHidden="1" w:unhideWhenUsed="1"/>
-    <w:lsdException w:name="Hashtag" w:semiHidden="1" w:unhideWhenUsed="1"/>
-    <w:lsdException w:name="Unresolved Mention" w:semiHidden="1" w:unhideWhenUsed="1"/>
-    <w:lsdException w:name="Smart Link" w:semiHidden="1" w:unhideWhenUsed="1"/>
+  <w:latentStyles w:defLockedState="0" w:defUIPriority="99" w:defSemiHidden="1" w:defUnhideWhenUsed="1" w:defQFormat="0" w:count="267">
+    <w:lsdException w:name="Normal" w:semiHidden="0" w:uiPriority="0" w:unhideWhenUsed="0" w:qFormat="1"/>
+    <w:lsdException w:name="heading 1" w:semiHidden="0" w:uiPriority="9" w:unhideWhenUsed="0" w:qFormat="1"/>
+    <w:lsdException w:name="heading 2" w:uiPriority="9" w:qFormat="1"/>
+    <w:lsdException w:name="heading 3" w:uiPriority="9" w:qFormat="1"/>
+    <w:lsdException w:name="heading 4" w:uiPriority="9" w:qFormat="1"/>
+    <w:lsdException w:name="heading 5" w:uiPriority="9" w:qFormat="1"/>
+    <w:lsdException w:name="heading 6" w:uiPriority="9" w:qFormat="1"/>
+    <w:lsdException w:name="heading 7" w:uiPriority="9" w:qFormat="1"/>
+    <w:lsdException w:name="heading 8" w:uiPriority="9" w:qFormat="1"/>
+    <w:lsdException w:name="heading 9" w:uiPriority="9" w:qFormat="1"/>
+    <w:lsdException w:name="toc 1" w:uiPriority="39"/>
+    <w:lsdException w:name="toc 2" w:uiPriority="39"/>
+    <w:lsdException w:name="toc 3" w:uiPriority="39"/>
+    <w:lsdException w:name="toc 4" w:uiPriority="39"/>
+    <w:lsdException w:name="toc 5" w:uiPriority="39"/>
+    <w:lsdException w:name="toc 6" w:uiPriority="39"/>
+    <w:lsdException w:name="toc 7" w:uiPriority="39"/>
+    <w:lsdException w:name="toc 8" w:uiPriority="39"/>
+    <w:lsdException w:name="toc 9" w:uiPriority="39"/>
+    <w:lsdException w:name="annotation text" w:qFormat="1"/>
+    <w:lsdException w:name="caption" w:uiPriority="35" w:qFormat="1"/>
+    <w:lsdException w:name="annotation reference" w:qFormat="1"/>
+    <w:lsdException w:name="Title" w:semiHidden="0" w:uiPriority="10" w:unhideWhenUsed="0" w:qFormat="1"/>
+    <w:lsdException w:name="Default Paragraph Font" w:uiPriority="1"/>
+    <w:lsdException w:name="Body Text" w:uiPriority="1" w:qFormat="1"/>
+    <w:lsdException w:name="Subtitle" w:semiHidden="0" w:uiPriority="11" w:unhideWhenUsed="0" w:qFormat="1"/>
+    <w:lsdException w:name="Strong" w:semiHidden="0" w:uiPriority="22" w:unhideWhenUsed="0" w:qFormat="1"/>
+    <w:lsdException w:name="Emphasis" w:semiHidden="0" w:uiPriority="20" w:unhideWhenUsed="0" w:qFormat="1"/>
+    <w:lsdException w:name="Table Grid" w:semiHidden="0" w:uiPriority="39" w:unhideWhenUsed="0"/>
+    <w:lsdException w:name="Placeholder Text" w:unhideWhenUsed="0"/>
+    <w:lsdException w:name="No Spacing" w:semiHidden="0" w:uiPriority="1" w:unhideWhenUsed="0" w:qFormat="1"/>
+    <w:lsdException w:name="Light Shading" w:semiHidden="0" w:uiPriority="60" w:unhideWhenUsed="0"/>
+    <w:lsdException w:name="Light List" w:semiHidden="0" w:uiPriority="61" w:unhideWhenUsed="0"/>
+    <w:lsdException w:name="Light Grid" w:semiHidden="0" w:uiPriority="62" w:unhideWhenUsed="0"/>
+    <w:lsdException w:name="Medium Shading 1" w:semiHidden="0" w:uiPriority="63" w:unhideWhenUsed="0"/>
+    <w:lsdException w:name="Medium Shading 2" w:semiHidden="0" w:uiPriority="64" w:unhideWhenUsed="0"/>
+    <w:lsdException w:name="Medium List 1" w:semiHidden="0" w:uiPriority="65" w:unhideWhenUsed="0"/>
+    <w:lsdException w:name="Medium List 2" w:semiHidden="0" w:uiPriority="66" w:unhideWhenUsed="0"/>
+    <w:lsdException w:name="Medium Grid 1" w:semiHidden="0" w:uiPriority="67" w:unhideWhenUsed="0"/>
+    <w:lsdException w:name="Medium Grid 2" w:semiHidden="0" w:uiPriority="68" w:unhideWhenUsed="0"/>
+    <w:lsdException w:name="Medium Grid 3" w:semiHidden="0" w:uiPriority="69" w:unhideWhenUsed="0"/>
+    <w:lsdException w:name="Dark List" w:semiHidden="0" w:uiPriority="70" w:unhideWhenUsed="0"/>
+    <w:lsdException w:name="Colorful Shading" w:semiHidden="0" w:uiPriority="71" w:unhideWhenUsed="0"/>
+    <w:lsdException w:name="Colorful List" w:semiHidden="0" w:uiPriority="72" w:unhideWhenUsed="0"/>
+    <w:lsdException w:name="Colorful Grid" w:semiHidden="0" w:uiPriority="73" w:unhideWhenUsed="0"/>
+    <w:lsdException w:name="Light Shading Accent 1" w:semiHidden="0" w:uiPriority="60" w:unhideWhenUsed="0"/>
+    <w:lsdException w:name="Light List Accent 1" w:semiHidden="0" w:uiPriority="61" w:unhideWhenUsed="0"/>
+    <w:lsdException w:name="Light Grid Accent 1" w:semiHidden="0" w:uiPriority="62" w:unhideWhenUsed="0"/>
+    <w:lsdException w:name="Medium Shading 1 Accent 1" w:semiHidden="0" w:uiPriority="63" w:unhideWhenUsed="0"/>
+    <w:lsdException w:name="Medium Shading 2 Accent 1" w:semiHidden="0" w:uiPriority="64" w:unhideWhenUsed="0"/>
+    <w:lsdException w:name="Medium List 1 Accent 1" w:semiHidden="0" w:uiPriority="65" w:unhideWhenUsed="0"/>
+    <w:lsdException w:name="Revision" w:unhideWhenUsed="0"/>
+    <w:lsdException w:name="List Paragraph" w:semiHidden="0" w:uiPriority="34" w:unhideWhenUsed="0" w:qFormat="1"/>
+    <w:lsdException w:name="Quote" w:semiHidden="0" w:uiPriority="29" w:unhideWhenUsed="0" w:qFormat="1"/>
+    <w:lsdException w:name="Intense Quote" w:semiHidden="0" w:uiPriority="30" w:unhideWhenUsed="0" w:qFormat="1"/>
+    <w:lsdException w:name="Medium List 2 Accent 1" w:semiHidden="0" w:uiPriority="66" w:unhideWhenUsed="0"/>
+    <w:lsdException w:name="Medium Grid 1 Accent 1" w:semiHidden="0" w:uiPriority="67" w:unhideWhenUsed="0"/>
+    <w:lsdException w:name="Medium Grid 2 Accent 1" w:semiHidden="0" w:uiPriority="68" w:unhideWhenUsed="0"/>
+    <w:lsdException w:name="Medium Grid 3 Accent 1" w:semiHidden="0" w:uiPriority="69" w:unhideWhenUsed="0"/>
+    <w:lsdException w:name="Dark List Accent 1" w:semiHidden="0" w:uiPriority="70" w:unhideWhenUsed="0"/>
+    <w:lsdException w:name="Colorful Shading Accent 1" w:semiHidden="0" w:uiPriority="71" w:unhideWhenUsed="0"/>
+    <w:lsdException w:name="Colorful List Accent 1" w:semiHidden="0" w:uiPriority="72" w:unhideWhenUsed="0"/>
+    <w:lsdException w:name="Colorful Grid Accent 1" w:semiHidden="0" w:uiPriority="73" w:unhideWhenUsed="0"/>
+    <w:lsdException w:name="Light Shading Accent 2" w:semiHidden="0" w:uiPriority="60" w:unhideWhenUsed="0"/>
+    <w:lsdException w:name="Light List Accent 2" w:semiHidden="0" w:uiPriority="61" w:unhideWhenUsed="0"/>
+    <w:lsdException w:name="Light Grid Accent 2" w:semiHidden="0" w:uiPriority="62" w:unhideWhenUsed="0"/>
+    <w:lsdException w:name="Medium Shading 1 Accent 2" w:semiHidden="0" w:uiPriority="63" w:unhideWhenUsed="0"/>
+    <w:lsdException w:name="Medium Shading 2 Accent 2" w:semiHidden="0" w:uiPriority="64" w:unhideWhenUsed="0"/>
+    <w:lsdException w:name="Medium List 1 Accent 2" w:semiHidden="0" w:uiPriority="65" w:unhideWhenUsed="0"/>
+    <w:lsdException w:name="Medium List 2 Accent 2" w:semiHidden="0" w:uiPriority="66" w:unhideWhenUsed="0"/>
+    <w:lsdException w:name="Medium Grid 1 Accent 2" w:semiHidden="0" w:uiPriority="67" w:unhideWhenUsed="0"/>
+    <w:lsdException w:name="Medium Grid 2 Accent 2" w:semiHidden="0" w:uiPriority="68" w:unhideWhenUsed="0"/>
+    <w:lsdException w:name="Medium Grid 3 Accent 2" w:semiHidden="0" w:uiPriority="69" w:unhideWhenUsed="0"/>
+    <w:lsdException w:name="Dark List Accent 2" w:semiHidden="0" w:uiPriority="70" w:unhideWhenUsed="0"/>
+    <w:lsdException w:name="Colorful Shading Accent 2" w:semiHidden="0" w:uiPriority="71" w:unhideWhenUsed="0"/>
+    <w:lsdException w:name="Colorful List Accent 2" w:semiHidden="0" w:uiPriority="72" w:unhideWhenUsed="0"/>
+    <w:lsdException w:name="Colorful Grid Accent 2" w:semiHidden="0" w:uiPriority="73" w:unhideWhenUsed="0"/>
+    <w:lsdException w:name="Light Shading Accent 3" w:semiHidden="0" w:uiPriority="60" w:unhideWhenUsed="0"/>
+    <w:lsdException w:name="Light List Accent 3" w:semiHidden="0" w:uiPriority="61" w:unhideWhenUsed="0"/>
+    <w:lsdException w:name="Light Grid Accent 3" w:semiHidden="0" w:uiPriority="62" w:unhideWhenUsed="0"/>
+    <w:lsdException w:name="Medium Shading 1 Accent 3" w:semiHidden="0" w:uiPriority="63" w:unhideWhenUsed="0"/>
+    <w:lsdException w:name="Medium Shading 2 Accent 3" w:semiHidden="0" w:uiPriority="64" w:unhideWhenUsed="0"/>
+    <w:lsdException w:name="Medium List 1 Accent 3" w:semiHidden="0" w:uiPriority="65" w:unhideWhenUsed="0"/>
+    <w:lsdException w:name="Medium List 2 Accent 3" w:semiHidden="0" w:uiPriority="66" w:unhideWhenUsed="0"/>
+    <w:lsdException w:name="Medium Grid 1 Accent 3" w:semiHidden="0" w:uiPriority="67" w:unhideWhenUsed="0"/>
+    <w:lsdException w:name="Medium Grid 2 Accent 3" w:semiHidden="0" w:uiPriority="68" w:unhideWhenUsed="0"/>
+    <w:lsdException w:name="Medium Grid 3 Accent 3" w:semiHidden="0" w:uiPriority="69" w:unhideWhenUsed="0"/>
+    <w:lsdException w:name="Dark List Accent 3" w:semiHidden="0" w:uiPriority="70" w:unhideWhenUsed="0"/>
+    <w:lsdException w:name="Colorful Shading Accent 3" w:semiHidden="0" w:uiPriority="71" w:unhideWhenUsed="0"/>
+    <w:lsdException w:name="Colorful List Accent 3" w:semiHidden="0" w:uiPriority="72" w:unhideWhenUsed="0"/>
+    <w:lsdException w:name="Colorful Grid Accent 3" w:semiHidden="0" w:uiPriority="73" w:unhideWhenUsed="0"/>
+    <w:lsdException w:name="Light Shading Accent 4" w:semiHidden="0" w:uiPriority="60" w:unhideWhenUsed="0"/>
+    <w:lsdException w:name="Light List Accent 4" w:semiHidden="0" w:uiPriority="61" w:unhideWhenUsed="0"/>
+    <w:lsdException w:name="Light Grid Accent 4" w:semiHidden="0" w:uiPriority="62" w:unhideWhenUsed="0"/>
+    <w:lsdException w:name="Medium Shading 1 Accent 4" w:semiHidden="0" w:uiPriority="63" w:unhideWhenUsed="0"/>
+    <w:lsdException w:name="Medium Shading 2 Accent 4" w:semiHidden="0" w:uiPriority="64" w:unhideWhenUsed="0"/>
+    <w:lsdException w:name="Medium List 1 Accent 4" w:semiHidden="0" w:uiPriority="65" w:unhideWhenUsed="0"/>
+    <w:lsdException w:name="Medium List 2 Accent 4" w:semiHidden="0" w:uiPriority="66" w:unhideWhenUsed="0"/>
+    <w:lsdException w:name="Medium Grid 1 Accent 4" w:semiHidden="0" w:uiPriority="67" w:unhideWhenUsed="0"/>
+    <w:lsdException w:name="Medium Grid 2 Accent 4" w:semiHidden="0" w:uiPriority="68" w:unhideWhenUsed="0"/>
+    <w:lsdException w:name="Medium Grid 3 Accent 4" w:semiHidden="0" w:uiPriority="69" w:unhideWhenUsed="0"/>
+    <w:lsdException w:name="Dark List Accent 4" w:semiHidden="0" w:uiPriority="70" w:unhideWhenUsed="0"/>
+    <w:lsdException w:name="Colorful Shading Accent 4" w:semiHidden="0" w:uiPriority="71" w:unhideWhenUsed="0"/>
+    <w:lsdException w:name="Colorful List Accent 4" w:semiHidden="0" w:uiPriority="72" w:unhideWhenUsed="0"/>
+    <w:lsdException w:name="Colorful Grid Accent 4" w:semiHidden="0" w:uiPriority="73" w:unhideWhenUsed="0"/>
+    <w:lsdException w:name="Light Shading Accent 5" w:semiHidden="0" w:uiPriority="60" w:unhideWhenUsed="0"/>
+    <w:lsdException w:name="Light List Accent 5" w:semiHidden="0" w:uiPriority="61" w:unhideWhenUsed="0"/>
+    <w:lsdException w:name="Light Grid Accent 5" w:semiHidden="0" w:uiPriority="62" w:unhideWhenUsed="0"/>
+    <w:lsdException w:name="Medium Shading 1 Accent 5" w:semiHidden="0" w:uiPriority="63" w:unhideWhenUsed="0"/>
+    <w:lsdException w:name="Medium Shading 2 Accent 5" w:semiHidden="0" w:uiPriority="64" w:unhideWhenUsed="0"/>
+    <w:lsdException w:name="Medium List 1 Accent 5" w:semiHidden="0" w:uiPriority="65" w:unhideWhenUsed="0"/>
+    <w:lsdException w:name="Medium List 2 Accent 5" w:semiHidden="0" w:uiPriority="66" w:unhideWhenUsed="0"/>
+    <w:lsdException w:name="Medium Grid 1 Accent 5" w:semiHidden="0" w:uiPriority="67" w:unhideWhenUsed="0"/>
+    <w:lsdException w:name="Medium Grid 2 Accent 5" w:semiHidden="0" w:uiPriority="68" w:unhideWhenUsed="0"/>
+    <w:lsdException w:name="Medium Grid 3 Accent 5" w:semiHidden="0" w:uiPriority="69" w:unhideWhenUsed="0"/>
+    <w:lsdException w:name="Dark List Accent 5" w:semiHidden="0" w:uiPriority="70" w:unhideWhenUsed="0"/>
+    <w:lsdException w:name="Colorful Shading Accent 5" w:semiHidden="0" w:uiPriority="71" w:unhideWhenUsed="0"/>
+    <w:lsdException w:name="Colorful List Accent 5" w:semiHidden="0" w:uiPriority="72" w:unhideWhenUsed="0"/>
+    <w:lsdException w:name="Colorful Grid Accent 5" w:semiHidden="0" w:uiPriority="73" w:unhideWhenUsed="0"/>
+    <w:lsdException w:name="Light Shading Accent 6" w:semiHidden="0" w:uiPriority="60" w:unhideWhenUsed="0"/>
+    <w:lsdException w:name="Light List Accent 6" w:semiHidden="0" w:uiPriority="61" w:unhideWhenUsed="0"/>
+    <w:lsdException w:name="Light Grid Accent 6" w:semiHidden="0" w:uiPriority="62" w:unhideWhenUsed="0"/>
+    <w:lsdException w:name="Medium Shading 1 Accent 6" w:semiHidden="0" w:uiPriority="63" w:unhideWhenUsed="0"/>
+    <w:lsdException w:name="Medium Shading 2 Accent 6" w:semiHidden="0" w:uiPriority="64" w:unhideWhenUsed="0"/>
+    <w:lsdException w:name="Medium List 1 Accent 6" w:semiHidden="0" w:uiPriority="65" w:unhideWhenUsed="0"/>
+    <w:lsdException w:name="Medium List 2 Accent 6" w:semiHidden="0" w:uiPriority="66" w:unhideWhenUsed="0"/>
+    <w:lsdException w:name="Medium Grid 1 Accent 6" w:semiHidden="0" w:uiPriority="67" w:unhideWhenUsed="0"/>
+    <w:lsdException w:name="Medium Grid 2 Accent 6" w:semiHidden="0" w:uiPriority="68" w:unhideWhenUsed="0"/>
+    <w:lsdException w:name="Medium Grid 3 Accent 6" w:semiHidden="0" w:uiPriority="69" w:unhideWhenUsed="0"/>
+    <w:lsdException w:name="Dark List Accent 6" w:semiHidden="0" w:uiPriority="70" w:unhideWhenUsed="0"/>
+    <w:lsdException w:name="Colorful Shading Accent 6" w:semiHidden="0" w:uiPriority="71" w:unhideWhenUsed="0"/>
+    <w:lsdException w:name="Colorful List Accent 6" w:semiHidden="0" w:uiPriority="72" w:unhideWhenUsed="0"/>
+    <w:lsdException w:name="Colorful Grid Accent 6" w:semiHidden="0" w:uiPriority="73" w:unhideWhenUsed="0"/>
+    <w:lsdException w:name="Subtle Emphasis" w:semiHidden="0" w:uiPriority="19" w:unhideWhenUsed="0" w:qFormat="1"/>
+    <w:lsdException w:name="Intense Emphasis" w:semiHidden="0" w:uiPriority="21" w:unhideWhenUsed="0" w:qFormat="1"/>
+    <w:lsdException w:name="Subtle Reference" w:semiHidden="0" w:uiPriority="31" w:unhideWhenUsed="0" w:qFormat="1"/>
+    <w:lsdException w:name="Intense Reference" w:semiHidden="0" w:uiPriority="32" w:unhideWhenUsed="0" w:qFormat="1"/>
+    <w:lsdException w:name="Book Title" w:semiHidden="0" w:uiPriority="33" w:unhideWhenUsed="0" w:qFormat="1"/>
+    <w:lsdException w:name="Bibliography" w:uiPriority="37"/>
+    <w:lsdException w:name="TOC Heading" w:uiPriority="39" w:qFormat="1"/>
   </w:latentStyles>
   <w:style w:type="paragraph" w:default="1" w:styleId="Normal">
     <w:name w:val="Normal"/>
@@ -5108,7 +4741,1866 @@
     <w:qFormat/>
     <w:rsid w:val="000F4FEF"/>
   </w:style>
-  <w:style w:type="character" w:styleId="UnresolvedMention">
+  <w:style w:type="character" w:customStyle="1" w:styleId="UnresolvedMention">
+    <w:name w:val="Unresolved Mention"/>
+    <w:basedOn w:val="DefaultParagraphFont"/>
+    <w:uiPriority w:val="99"/>
+    <w:semiHidden/>
+    <w:unhideWhenUsed/>
+    <w:rsid w:val="005E785C"/>
+    <w:rPr>
+      <w:color w:val="605E5C"/>
+      <w:shd w:val="clear" w:color="auto" w:fill="E1DFDD"/>
+    </w:rPr>
+  </w:style>
+  <w:style w:type="paragraph" w:customStyle="1" w:styleId="interviewsituationcondition">
+    <w:name w:val="interview situation condition"/>
+    <w:basedOn w:val="Heading1"/>
+    <w:next w:val="Heading2"/>
+    <w:qFormat/>
+    <w:rsid w:val="000F4FEF"/>
+    <w:pPr>
+      <w:keepNext/>
+      <w:keepLines/>
+      <w:pBdr>
+        <w:bottom w:val="none" w:sz="0" w:space="0" w:color="auto"/>
+      </w:pBdr>
+      <w:spacing w:after="60" w:afterAutospacing="0"/>
+    </w:pPr>
+    <w:rPr>
+      <w:rFonts w:asciiTheme="majorHAnsi" w:eastAsiaTheme="majorEastAsia" w:hAnsiTheme="majorHAnsi" w:cstheme="majorBidi"/>
+      <w:color w:val="FF0000"/>
+      <w:spacing w:val="0"/>
+      <w:sz w:val="24"/>
+      <w:szCs w:val="26"/>
+    </w:rPr>
+  </w:style>
+  <w:style w:type="paragraph" w:customStyle="1" w:styleId="heading">
+    <w:name w:val="heading"/>
+    <w:basedOn w:val="Normal"/>
+    <w:rsid w:val="00DD3DDA"/>
+    <w:pPr>
+      <w:spacing w:before="100" w:after="100"/>
+    </w:pPr>
+    <w:rPr>
+      <w:rFonts w:ascii="Times New Roman" w:eastAsia="Times New Roman" w:hAnsi="Times New Roman" w:cs="Times New Roman"/>
+      <w:sz w:val="24"/>
+      <w:szCs w:val="24"/>
+    </w:rPr>
+  </w:style>
+  <w:style w:type="character" w:customStyle="1" w:styleId="Interviewpinknote">
+    <w:name w:val="Interview pink note"/>
+    <w:basedOn w:val="BodyChar"/>
+    <w:uiPriority w:val="1"/>
+    <w:qFormat/>
+    <w:rsid w:val="00DD3DDA"/>
+    <w:rPr>
+      <w:rFonts w:ascii="Helvetica" w:eastAsiaTheme="minorHAnsi" w:hAnsi="Helvetica" w:cs="Tahoma"/>
+      <w:b w:val="0"/>
+      <w:bCs/>
+      <w:color w:val="FF99FF"/>
+      <w:sz w:val="24"/>
+      <w:szCs w:val="24"/>
+    </w:rPr>
+  </w:style>
+  <w:style w:type="paragraph" w:customStyle="1" w:styleId="interviewsituationp">
+    <w:name w:val="interview situation p"/>
+    <w:basedOn w:val="Body"/>
+    <w:next w:val="interviewsituationcondition"/>
+    <w:qFormat/>
+    <w:rsid w:val="00DD3DDA"/>
+    <w:pPr>
+      <w:spacing w:before="240" w:after="0" w:line="240" w:lineRule="auto"/>
+      <w:contextualSpacing/>
+    </w:pPr>
+  </w:style>
+  <w:style w:type="character" w:customStyle="1" w:styleId="Heading5Char">
+    <w:name w:val="Heading 5 Char"/>
+    <w:basedOn w:val="DefaultParagraphFont"/>
+    <w:link w:val="Heading5"/>
+    <w:uiPriority w:val="9"/>
+    <w:rsid w:val="000F4FEF"/>
+    <w:rPr>
+      <w:rFonts w:ascii="Arial" w:hAnsi="Arial" w:cs="Arial"/>
+      <w:color w:val="666666"/>
+    </w:rPr>
+  </w:style>
+  <w:style w:type="character" w:customStyle="1" w:styleId="Heading6Char">
+    <w:name w:val="Heading 6 Char"/>
+    <w:basedOn w:val="DefaultParagraphFont"/>
+    <w:link w:val="Heading6"/>
+    <w:uiPriority w:val="9"/>
+    <w:semiHidden/>
+    <w:rsid w:val="000F4FEF"/>
+    <w:rPr>
+      <w:rFonts w:ascii="Arial" w:hAnsi="Arial" w:cs="Arial"/>
+      <w:i/>
+      <w:color w:val="666666"/>
+    </w:rPr>
+  </w:style>
+  <w:style w:type="paragraph" w:styleId="TOC1">
+    <w:name w:val="toc 1"/>
+    <w:basedOn w:val="Normal"/>
+    <w:next w:val="Normal"/>
+    <w:autoRedefine/>
+    <w:uiPriority w:val="39"/>
+    <w:unhideWhenUsed/>
+    <w:rsid w:val="000F4FEF"/>
+    <w:pPr>
+      <w:spacing w:after="100"/>
+    </w:pPr>
+  </w:style>
+  <w:style w:type="paragraph" w:styleId="TOC2">
+    <w:name w:val="toc 2"/>
+    <w:basedOn w:val="Normal"/>
+    <w:next w:val="Normal"/>
+    <w:autoRedefine/>
+    <w:uiPriority w:val="39"/>
+    <w:unhideWhenUsed/>
+    <w:rsid w:val="000F4FEF"/>
+    <w:pPr>
+      <w:spacing w:after="100"/>
+      <w:ind w:left="240"/>
+    </w:pPr>
+  </w:style>
+  <w:style w:type="paragraph" w:styleId="TOC3">
+    <w:name w:val="toc 3"/>
+    <w:basedOn w:val="Normal"/>
+    <w:next w:val="Normal"/>
+    <w:autoRedefine/>
+    <w:uiPriority w:val="39"/>
+    <w:unhideWhenUsed/>
+    <w:rsid w:val="000F4FEF"/>
+    <w:pPr>
+      <w:spacing w:after="100"/>
+      <w:ind w:left="480"/>
+    </w:pPr>
+  </w:style>
+  <w:style w:type="paragraph" w:styleId="CommentText">
+    <w:name w:val="annotation text"/>
+    <w:basedOn w:val="Normal"/>
+    <w:link w:val="CommentTextChar"/>
+    <w:uiPriority w:val="99"/>
+    <w:unhideWhenUsed/>
+    <w:qFormat/>
+    <w:rsid w:val="000F4FEF"/>
+    <w:rPr>
+      <w:sz w:val="20"/>
+      <w:szCs w:val="20"/>
+    </w:rPr>
+  </w:style>
+  <w:style w:type="character" w:customStyle="1" w:styleId="CommentTextChar">
+    <w:name w:val="Comment Text Char"/>
+    <w:basedOn w:val="DefaultParagraphFont"/>
+    <w:link w:val="CommentText"/>
+    <w:uiPriority w:val="99"/>
+    <w:qFormat/>
+    <w:rsid w:val="000F4FEF"/>
+    <w:rPr>
+      <w:rFonts w:ascii="Arial" w:hAnsi="Arial" w:cs="Arial"/>
+      <w:sz w:val="20"/>
+      <w:szCs w:val="20"/>
+    </w:rPr>
+  </w:style>
+  <w:style w:type="paragraph" w:styleId="Header">
+    <w:name w:val="header"/>
+    <w:basedOn w:val="Normal"/>
+    <w:link w:val="HeaderChar"/>
+    <w:uiPriority w:val="99"/>
+    <w:unhideWhenUsed/>
+    <w:rsid w:val="000F4FEF"/>
+    <w:pPr>
+      <w:tabs>
+        <w:tab w:val="center" w:pos="4680"/>
+        <w:tab w:val="right" w:pos="9360"/>
+      </w:tabs>
+    </w:pPr>
+  </w:style>
+  <w:style w:type="character" w:customStyle="1" w:styleId="HeaderChar">
+    <w:name w:val="Header Char"/>
+    <w:basedOn w:val="DefaultParagraphFont"/>
+    <w:link w:val="Header"/>
+    <w:uiPriority w:val="99"/>
+    <w:rsid w:val="000F4FEF"/>
+    <w:rPr>
+      <w:rFonts w:ascii="Arial" w:hAnsi="Arial" w:cs="Arial"/>
+    </w:rPr>
+  </w:style>
+  <w:style w:type="character" w:styleId="CommentReference">
+    <w:name w:val="annotation reference"/>
+    <w:basedOn w:val="DefaultParagraphFont"/>
+    <w:uiPriority w:val="99"/>
+    <w:semiHidden/>
+    <w:unhideWhenUsed/>
+    <w:qFormat/>
+    <w:rsid w:val="000F4FEF"/>
+    <w:rPr>
+      <w:sz w:val="16"/>
+      <w:szCs w:val="16"/>
+    </w:rPr>
+  </w:style>
+  <w:style w:type="paragraph" w:styleId="Title">
+    <w:name w:val="Title"/>
+    <w:basedOn w:val="Normal"/>
+    <w:next w:val="Normal"/>
+    <w:link w:val="TitleChar"/>
+    <w:uiPriority w:val="10"/>
+    <w:qFormat/>
+    <w:rsid w:val="000F4FEF"/>
+    <w:pPr>
+      <w:spacing w:before="0" w:beforeAutospacing="0" w:after="100" w:line="276" w:lineRule="auto"/>
+    </w:pPr>
+    <w:rPr>
+      <w:rFonts w:ascii="Helvetica" w:hAnsi="Helvetica" w:cs="Helvetica"/>
+      <w:color w:val="0A2A78"/>
+      <w:spacing w:val="-2"/>
+      <w:sz w:val="48"/>
+      <w:szCs w:val="24"/>
+    </w:rPr>
+  </w:style>
+  <w:style w:type="character" w:customStyle="1" w:styleId="TitleChar">
+    <w:name w:val="Title Char"/>
+    <w:basedOn w:val="DefaultParagraphFont"/>
+    <w:link w:val="Title"/>
+    <w:uiPriority w:val="10"/>
+    <w:qFormat/>
+    <w:rsid w:val="000F4FEF"/>
+    <w:rPr>
+      <w:rFonts w:ascii="Helvetica" w:hAnsi="Helvetica" w:cs="Helvetica"/>
+      <w:color w:val="0A2A78"/>
+      <w:spacing w:val="-2"/>
+      <w:sz w:val="48"/>
+      <w:szCs w:val="24"/>
+    </w:rPr>
+  </w:style>
+  <w:style w:type="paragraph" w:styleId="Subtitle">
+    <w:name w:val="Subtitle"/>
+    <w:basedOn w:val="Normal"/>
+    <w:next w:val="Normal"/>
+    <w:link w:val="SubtitleChar"/>
+    <w:uiPriority w:val="11"/>
+    <w:qFormat/>
+    <w:rsid w:val="000F4FEF"/>
+    <w:pPr>
+      <w:keepNext/>
+      <w:keepLines/>
+      <w:spacing w:after="320"/>
+    </w:pPr>
+    <w:rPr>
+      <w:color w:val="666666"/>
+      <w:sz w:val="30"/>
+      <w:szCs w:val="30"/>
+    </w:rPr>
+  </w:style>
+  <w:style w:type="character" w:customStyle="1" w:styleId="SubtitleChar">
+    <w:name w:val="Subtitle Char"/>
+    <w:basedOn w:val="DefaultParagraphFont"/>
+    <w:link w:val="Subtitle"/>
+    <w:uiPriority w:val="11"/>
+    <w:rsid w:val="000F4FEF"/>
+    <w:rPr>
+      <w:rFonts w:ascii="Arial" w:hAnsi="Arial" w:cs="Arial"/>
+      <w:color w:val="666666"/>
+      <w:sz w:val="30"/>
+      <w:szCs w:val="30"/>
+    </w:rPr>
+  </w:style>
+  <w:style w:type="character" w:styleId="FollowedHyperlink">
+    <w:name w:val="FollowedHyperlink"/>
+    <w:basedOn w:val="DefaultParagraphFont"/>
+    <w:uiPriority w:val="99"/>
+    <w:semiHidden/>
+    <w:unhideWhenUsed/>
+    <w:rsid w:val="000F4FEF"/>
+    <w:rPr>
+      <w:color w:val="954F72" w:themeColor="followedHyperlink"/>
+      <w:u w:val="single"/>
+    </w:rPr>
+  </w:style>
+  <w:style w:type="character" w:styleId="Strong">
+    <w:name w:val="Strong"/>
+    <w:basedOn w:val="DefaultParagraphFont"/>
+    <w:uiPriority w:val="22"/>
+    <w:qFormat/>
+    <w:rsid w:val="000F4FEF"/>
+    <w:rPr>
+      <w:b/>
+      <w:bCs/>
+    </w:rPr>
+  </w:style>
+  <w:style w:type="character" w:styleId="Emphasis">
+    <w:name w:val="Emphasis"/>
+    <w:basedOn w:val="DefaultParagraphFont"/>
+    <w:uiPriority w:val="20"/>
+    <w:qFormat/>
+    <w:rsid w:val="000F4FEF"/>
+    <w:rPr>
+      <w:i/>
+      <w:iCs/>
+    </w:rPr>
+  </w:style>
+  <w:style w:type="paragraph" w:styleId="PlainText">
+    <w:name w:val="Plain Text"/>
+    <w:basedOn w:val="Normal"/>
+    <w:link w:val="PlainTextChar"/>
+    <w:uiPriority w:val="99"/>
+    <w:semiHidden/>
+    <w:unhideWhenUsed/>
+    <w:rsid w:val="00DD3DDA"/>
+    <w:pPr>
+      <w:spacing w:after="0"/>
+    </w:pPr>
+    <w:rPr>
+      <w:sz w:val="24"/>
+      <w:szCs w:val="21"/>
+    </w:rPr>
+  </w:style>
+  <w:style w:type="character" w:customStyle="1" w:styleId="PlainTextChar">
+    <w:name w:val="Plain Text Char"/>
+    <w:basedOn w:val="DefaultParagraphFont"/>
+    <w:link w:val="PlainText"/>
+    <w:uiPriority w:val="99"/>
+    <w:semiHidden/>
+    <w:rsid w:val="00DD3DDA"/>
+    <w:rPr>
+      <w:rFonts w:ascii="Arial" w:hAnsi="Arial" w:cs="Arial"/>
+      <w:sz w:val="24"/>
+      <w:szCs w:val="21"/>
+    </w:rPr>
+  </w:style>
+  <w:style w:type="paragraph" w:styleId="NormalWeb">
+    <w:name w:val="Normal (Web)"/>
+    <w:basedOn w:val="Normal"/>
+    <w:uiPriority w:val="99"/>
+    <w:unhideWhenUsed/>
+    <w:rsid w:val="000F4FEF"/>
+    <w:pPr>
+      <w:spacing w:before="100" w:after="100"/>
+    </w:pPr>
+    <w:rPr>
+      <w:rFonts w:ascii="Times New Roman" w:eastAsia="Times New Roman" w:hAnsi="Times New Roman" w:cs="Times New Roman"/>
+      <w:sz w:val="24"/>
+      <w:szCs w:val="24"/>
+    </w:rPr>
+  </w:style>
+  <w:style w:type="paragraph" w:styleId="HTMLPreformatted">
+    <w:name w:val="HTML Preformatted"/>
+    <w:basedOn w:val="Normal"/>
+    <w:link w:val="HTMLPreformattedChar"/>
+    <w:uiPriority w:val="99"/>
+    <w:semiHidden/>
+    <w:unhideWhenUsed/>
+    <w:rsid w:val="000F4FEF"/>
+    <w:pPr>
+      <w:tabs>
+        <w:tab w:val="left" w:pos="916"/>
+        <w:tab w:val="left" w:pos="1832"/>
+        <w:tab w:val="left" w:pos="2748"/>
+        <w:tab w:val="left" w:pos="3664"/>
+        <w:tab w:val="left" w:pos="4580"/>
+        <w:tab w:val="left" w:pos="5496"/>
+        <w:tab w:val="left" w:pos="6412"/>
+        <w:tab w:val="left" w:pos="7328"/>
+        <w:tab w:val="left" w:pos="8244"/>
+        <w:tab w:val="left" w:pos="9160"/>
+        <w:tab w:val="left" w:pos="10076"/>
+        <w:tab w:val="left" w:pos="10992"/>
+        <w:tab w:val="left" w:pos="11908"/>
+        <w:tab w:val="left" w:pos="12824"/>
+        <w:tab w:val="left" w:pos="13740"/>
+        <w:tab w:val="left" w:pos="14656"/>
+      </w:tabs>
+      <w:spacing w:before="0" w:beforeAutospacing="0" w:after="0" w:afterAutospacing="0"/>
+    </w:pPr>
+    <w:rPr>
+      <w:rFonts w:ascii="Courier New" w:eastAsia="Times New Roman" w:hAnsi="Courier New" w:cs="Courier New"/>
+      <w:sz w:val="20"/>
+      <w:szCs w:val="20"/>
+    </w:rPr>
+  </w:style>
+  <w:style w:type="character" w:customStyle="1" w:styleId="HTMLPreformattedChar">
+    <w:name w:val="HTML Preformatted Char"/>
+    <w:basedOn w:val="DefaultParagraphFont"/>
+    <w:link w:val="HTMLPreformatted"/>
+    <w:uiPriority w:val="99"/>
+    <w:semiHidden/>
+    <w:rsid w:val="000F4FEF"/>
+    <w:rPr>
+      <w:rFonts w:ascii="Courier New" w:eastAsia="Times New Roman" w:hAnsi="Courier New" w:cs="Courier New"/>
+      <w:sz w:val="20"/>
+      <w:szCs w:val="20"/>
+    </w:rPr>
+  </w:style>
+  <w:style w:type="paragraph" w:styleId="CommentSubject">
+    <w:name w:val="annotation subject"/>
+    <w:basedOn w:val="CommentText"/>
+    <w:next w:val="CommentText"/>
+    <w:link w:val="CommentSubjectChar"/>
+    <w:uiPriority w:val="99"/>
+    <w:semiHidden/>
+    <w:unhideWhenUsed/>
+    <w:rsid w:val="000F4FEF"/>
+    <w:rPr>
+      <w:b/>
+      <w:bCs/>
+    </w:rPr>
+  </w:style>
+  <w:style w:type="character" w:customStyle="1" w:styleId="CommentSubjectChar">
+    <w:name w:val="Comment Subject Char"/>
+    <w:basedOn w:val="CommentTextChar"/>
+    <w:link w:val="CommentSubject"/>
+    <w:uiPriority w:val="99"/>
+    <w:semiHidden/>
+    <w:rsid w:val="000F4FEF"/>
+    <w:rPr>
+      <w:rFonts w:ascii="Arial" w:hAnsi="Arial" w:cs="Arial"/>
+      <w:b/>
+      <w:bCs/>
+      <w:sz w:val="20"/>
+      <w:szCs w:val="20"/>
+    </w:rPr>
+  </w:style>
+  <w:style w:type="paragraph" w:styleId="BalloonText">
+    <w:name w:val="Balloon Text"/>
+    <w:basedOn w:val="Normal"/>
+    <w:link w:val="BalloonTextChar"/>
+    <w:uiPriority w:val="99"/>
+    <w:semiHidden/>
+    <w:unhideWhenUsed/>
+    <w:rsid w:val="000F4FEF"/>
+    <w:rPr>
+      <w:rFonts w:ascii="Segoe UI" w:hAnsi="Segoe UI" w:cs="Segoe UI"/>
+      <w:sz w:val="18"/>
+      <w:szCs w:val="18"/>
+    </w:rPr>
+  </w:style>
+  <w:style w:type="character" w:customStyle="1" w:styleId="BalloonTextChar">
+    <w:name w:val="Balloon Text Char"/>
+    <w:basedOn w:val="DefaultParagraphFont"/>
+    <w:link w:val="BalloonText"/>
+    <w:uiPriority w:val="99"/>
+    <w:semiHidden/>
+    <w:rsid w:val="000F4FEF"/>
+    <w:rPr>
+      <w:rFonts w:ascii="Segoe UI" w:hAnsi="Segoe UI" w:cs="Segoe UI"/>
+      <w:sz w:val="18"/>
+      <w:szCs w:val="18"/>
+    </w:rPr>
+  </w:style>
+  <w:style w:type="table" w:styleId="TableGrid">
+    <w:name w:val="Table Grid"/>
+    <w:basedOn w:val="TableNormal"/>
+    <w:uiPriority w:val="39"/>
+    <w:rsid w:val="000F4FEF"/>
+    <w:pPr>
+      <w:widowControl w:val="0"/>
+      <w:autoSpaceDE w:val="0"/>
+      <w:autoSpaceDN w:val="0"/>
+      <w:spacing w:beforeAutospacing="0" w:after="0" w:afterAutospacing="0" w:line="240" w:lineRule="auto"/>
+    </w:pPr>
+    <w:rPr>
+      <w:rFonts w:eastAsiaTheme="minorHAnsi"/>
+    </w:rPr>
+    <w:tblPr>
+      <w:tblBorders>
+        <w:top w:val="single" w:sz="4" w:space="0" w:color="auto"/>
+        <w:left w:val="single" w:sz="4" w:space="0" w:color="auto"/>
+        <w:bottom w:val="single" w:sz="4" w:space="0" w:color="auto"/>
+        <w:right w:val="single" w:sz="4" w:space="0" w:color="auto"/>
+        <w:insideH w:val="single" w:sz="4" w:space="0" w:color="auto"/>
+        <w:insideV w:val="single" w:sz="4" w:space="0" w:color="auto"/>
+      </w:tblBorders>
+    </w:tblPr>
+  </w:style>
+  <w:style w:type="paragraph" w:styleId="NoSpacing">
+    <w:name w:val="No Spacing"/>
+    <w:uiPriority w:val="1"/>
+    <w:qFormat/>
+    <w:rsid w:val="00DD3DDA"/>
+    <w:pPr>
+      <w:spacing w:beforeAutospacing="0" w:after="0" w:afterAutospacing="0"/>
+    </w:pPr>
+    <w:rPr>
+      <w:rFonts w:ascii="Helvetica" w:eastAsiaTheme="minorHAnsi" w:hAnsi="Helvetica"/>
+      <w:sz w:val="24"/>
+    </w:rPr>
+  </w:style>
+  <w:style w:type="paragraph" w:styleId="Quote">
+    <w:name w:val="Quote"/>
+    <w:basedOn w:val="Normal"/>
+    <w:next w:val="Normal"/>
+    <w:link w:val="QuoteChar"/>
+    <w:uiPriority w:val="29"/>
+    <w:rsid w:val="000F4FEF"/>
+    <w:pPr>
+      <w:spacing w:before="200" w:after="160"/>
+      <w:ind w:left="864" w:right="864"/>
+      <w:jc w:val="center"/>
+    </w:pPr>
+    <w:rPr>
+      <w:i/>
+      <w:iCs/>
+      <w:color w:val="404040" w:themeColor="text1" w:themeTint="BF"/>
+    </w:rPr>
+  </w:style>
+  <w:style w:type="character" w:customStyle="1" w:styleId="QuoteChar">
+    <w:name w:val="Quote Char"/>
+    <w:basedOn w:val="DefaultParagraphFont"/>
+    <w:link w:val="Quote"/>
+    <w:uiPriority w:val="29"/>
+    <w:rsid w:val="000F4FEF"/>
+    <w:rPr>
+      <w:rFonts w:ascii="Arial" w:hAnsi="Arial" w:cs="Arial"/>
+      <w:i/>
+      <w:iCs/>
+      <w:color w:val="404040" w:themeColor="text1" w:themeTint="BF"/>
+    </w:rPr>
+  </w:style>
+  <w:style w:type="character" w:styleId="SubtleEmphasis">
+    <w:name w:val="Subtle Emphasis"/>
+    <w:basedOn w:val="DefaultParagraphFont"/>
+    <w:uiPriority w:val="19"/>
+    <w:rsid w:val="000F4FEF"/>
+    <w:rPr>
+      <w:i/>
+      <w:iCs/>
+      <w:color w:val="404040" w:themeColor="text1" w:themeTint="BF"/>
+    </w:rPr>
+  </w:style>
+  <w:style w:type="paragraph" w:styleId="TOCHeading">
+    <w:name w:val="TOC Heading"/>
+    <w:basedOn w:val="Heading1"/>
+    <w:next w:val="Normal"/>
+    <w:uiPriority w:val="39"/>
+    <w:unhideWhenUsed/>
+    <w:qFormat/>
+    <w:rsid w:val="000F4FEF"/>
+    <w:pPr>
+      <w:spacing w:before="240" w:after="0" w:line="259" w:lineRule="auto"/>
+      <w:outlineLvl w:val="9"/>
+    </w:pPr>
+    <w:rPr>
+      <w:rFonts w:asciiTheme="majorHAnsi" w:eastAsiaTheme="majorEastAsia" w:hAnsiTheme="majorHAnsi" w:cstheme="majorBidi"/>
+      <w:color w:val="2F5496" w:themeColor="accent1" w:themeShade="BF"/>
+      <w:sz w:val="32"/>
+      <w:szCs w:val="32"/>
+    </w:rPr>
+  </w:style>
+  <w:style w:type="character" w:customStyle="1" w:styleId="BodyChar">
+    <w:name w:val="Body Char"/>
+    <w:basedOn w:val="DefaultParagraphFont"/>
+    <w:link w:val="Body"/>
+    <w:rsid w:val="000F4FEF"/>
+    <w:rPr>
+      <w:rFonts w:ascii="Helvetica" w:eastAsiaTheme="minorHAnsi" w:hAnsi="Helvetica" w:cs="Helvetica"/>
+      <w:sz w:val="24"/>
+      <w:szCs w:val="24"/>
+    </w:rPr>
+  </w:style>
+  <w:style w:type="paragraph" w:customStyle="1" w:styleId="interviewneedsediting">
+    <w:name w:val="interview needs editing"/>
+    <w:basedOn w:val="Normal"/>
+    <w:next w:val="Normal"/>
+    <w:qFormat/>
+    <w:rsid w:val="000F4FEF"/>
+    <w:pPr>
+      <w:shd w:val="clear" w:color="auto" w:fill="FFFF00"/>
+      <w:spacing w:after="60" w:line="360" w:lineRule="auto"/>
+    </w:pPr>
+    <w:rPr>
+      <w:sz w:val="21"/>
+      <w:szCs w:val="21"/>
+    </w:rPr>
+  </w:style>
+  <w:style w:type="table" w:customStyle="1" w:styleId="TableGridLight1">
+    <w:name w:val="Table Grid Light1"/>
+    <w:basedOn w:val="TableNormal"/>
+    <w:uiPriority w:val="40"/>
+    <w:rsid w:val="000F4FEF"/>
+    <w:pPr>
+      <w:spacing w:beforeAutospacing="0" w:after="0" w:afterAutospacing="0" w:line="240" w:lineRule="auto"/>
+    </w:pPr>
+    <w:rPr>
+      <w:rFonts w:eastAsiaTheme="minorHAnsi"/>
+    </w:rPr>
+    <w:tblPr>
+      <w:tblBorders>
+        <w:top w:val="single" w:sz="4" w:space="0" w:color="BFBFBF" w:themeColor="background1" w:themeShade="BF"/>
+        <w:left w:val="single" w:sz="4" w:space="0" w:color="BFBFBF" w:themeColor="background1" w:themeShade="BF"/>
+        <w:bottom w:val="single" w:sz="4" w:space="0" w:color="BFBFBF" w:themeColor="background1" w:themeShade="BF"/>
+        <w:right w:val="single" w:sz="4" w:space="0" w:color="BFBFBF" w:themeColor="background1" w:themeShade="BF"/>
+        <w:insideH w:val="single" w:sz="4" w:space="0" w:color="BFBFBF" w:themeColor="background1" w:themeShade="BF"/>
+        <w:insideV w:val="single" w:sz="4" w:space="0" w:color="BFBFBF" w:themeColor="background1" w:themeShade="BF"/>
+      </w:tblBorders>
+    </w:tblPr>
+  </w:style>
+  <w:style w:type="character" w:customStyle="1" w:styleId="UnresolvedMention1">
+    <w:name w:val="Unresolved Mention1"/>
+    <w:basedOn w:val="DefaultParagraphFont"/>
+    <w:uiPriority w:val="99"/>
+    <w:semiHidden/>
+    <w:unhideWhenUsed/>
+    <w:rsid w:val="00062938"/>
+    <w:rPr>
+      <w:color w:val="605E5C"/>
+      <w:shd w:val="clear" w:color="auto" w:fill="E1DFDD"/>
+    </w:rPr>
+  </w:style>
+  <w:style w:type="character" w:customStyle="1" w:styleId="UnresolvedMention2">
+    <w:name w:val="Unresolved Mention2"/>
+    <w:basedOn w:val="DefaultParagraphFont"/>
+    <w:uiPriority w:val="99"/>
+    <w:semiHidden/>
+    <w:unhideWhenUsed/>
+    <w:rsid w:val="00062938"/>
+    <w:rPr>
+      <w:color w:val="605E5C"/>
+      <w:shd w:val="clear" w:color="auto" w:fill="E1DFDD"/>
+    </w:rPr>
+  </w:style>
+  <w:style w:type="character" w:customStyle="1" w:styleId="UnresolvedMention3">
+    <w:name w:val="Unresolved Mention3"/>
+    <w:basedOn w:val="DefaultParagraphFont"/>
+    <w:uiPriority w:val="99"/>
+    <w:semiHidden/>
+    <w:unhideWhenUsed/>
+    <w:rsid w:val="00062938"/>
+    <w:rPr>
+      <w:color w:val="605E5C"/>
+      <w:shd w:val="clear" w:color="auto" w:fill="E1DFDD"/>
+    </w:rPr>
+  </w:style>
+  <w:style w:type="paragraph" w:styleId="Revision">
+    <w:name w:val="Revision"/>
+    <w:hidden/>
+    <w:uiPriority w:val="99"/>
+    <w:semiHidden/>
+    <w:rsid w:val="00062938"/>
+    <w:pPr>
+      <w:spacing w:beforeAutospacing="0" w:after="0" w:afterAutospacing="0" w:line="240" w:lineRule="auto"/>
+    </w:pPr>
+    <w:rPr>
+      <w:rFonts w:ascii="Arial" w:hAnsi="Arial" w:cs="Arial"/>
+    </w:rPr>
+  </w:style>
+  <w:style w:type="character" w:customStyle="1" w:styleId="UnresolvedMention4">
+    <w:name w:val="Unresolved Mention4"/>
+    <w:basedOn w:val="DefaultParagraphFont"/>
+    <w:uiPriority w:val="99"/>
+    <w:semiHidden/>
+    <w:unhideWhenUsed/>
+    <w:rsid w:val="00062938"/>
+    <w:rPr>
+      <w:color w:val="605E5C"/>
+      <w:shd w:val="clear" w:color="auto" w:fill="E1DFDD"/>
+    </w:rPr>
+  </w:style>
+  <w:style w:type="character" w:customStyle="1" w:styleId="UnresolvedMention31">
+    <w:name w:val="Unresolved Mention31"/>
+    <w:basedOn w:val="DefaultParagraphFont"/>
+    <w:uiPriority w:val="99"/>
+    <w:semiHidden/>
+    <w:unhideWhenUsed/>
+    <w:rsid w:val="00062938"/>
+    <w:rPr>
+      <w:color w:val="605E5C"/>
+      <w:shd w:val="clear" w:color="auto" w:fill="E1DFDD"/>
+    </w:rPr>
+  </w:style>
+  <w:style w:type="character" w:customStyle="1" w:styleId="UnresolvedMention5">
+    <w:name w:val="Unresolved Mention5"/>
+    <w:basedOn w:val="DefaultParagraphFont"/>
+    <w:uiPriority w:val="99"/>
+    <w:semiHidden/>
+    <w:unhideWhenUsed/>
+    <w:rsid w:val="00062938"/>
+    <w:rPr>
+      <w:color w:val="605E5C"/>
+      <w:shd w:val="clear" w:color="auto" w:fill="E1DFDD"/>
+    </w:rPr>
+  </w:style>
+  <w:style w:type="character" w:customStyle="1" w:styleId="UnresolvedMention6">
+    <w:name w:val="Unresolved Mention6"/>
+    <w:basedOn w:val="DefaultParagraphFont"/>
+    <w:uiPriority w:val="99"/>
+    <w:semiHidden/>
+    <w:unhideWhenUsed/>
+    <w:rsid w:val="00062938"/>
+    <w:rPr>
+      <w:color w:val="605E5C"/>
+      <w:shd w:val="clear" w:color="auto" w:fill="E1DFDD"/>
+    </w:rPr>
+  </w:style>
+  <w:style w:type="character" w:customStyle="1" w:styleId="UnresolvedMention7">
+    <w:name w:val="Unresolved Mention7"/>
+    <w:basedOn w:val="DefaultParagraphFont"/>
+    <w:uiPriority w:val="99"/>
+    <w:semiHidden/>
+    <w:unhideWhenUsed/>
+    <w:rsid w:val="00062938"/>
+    <w:rPr>
+      <w:color w:val="605E5C"/>
+      <w:shd w:val="clear" w:color="auto" w:fill="E1DFDD"/>
+    </w:rPr>
+  </w:style>
+  <w:style w:type="character" w:customStyle="1" w:styleId="UnresolvedMention8">
+    <w:name w:val="Unresolved Mention8"/>
+    <w:basedOn w:val="DefaultParagraphFont"/>
+    <w:uiPriority w:val="99"/>
+    <w:semiHidden/>
+    <w:unhideWhenUsed/>
+    <w:rsid w:val="00062938"/>
+    <w:rPr>
+      <w:color w:val="605E5C"/>
+      <w:shd w:val="clear" w:color="auto" w:fill="E1DFDD"/>
+    </w:rPr>
+  </w:style>
+</w:styles>
+</file>
+
+<file path=word/stylesWithEffects.xml><?xml version="1.0" encoding="utf-8"?>
+<w:styles xmlns:wpc="http://schemas.microsoft.com/office/word/2010/wordprocessingCanvas" xmlns:mc="http://schemas.openxmlformats.org/markup-compatibility/2006" xmlns:o="urn:schemas-microsoft-com:office:office" xmlns:r="http://schemas.openxmlformats.org/officeDocument/2006/relationships" xmlns:m="http://schemas.openxmlformats.org/officeDocument/2006/math" xmlns:v="urn:schemas-microsoft-com:vml" xmlns:wp14="http://schemas.microsoft.com/office/word/2010/wordprocessingDrawing" xmlns:wp="http://schemas.openxmlformats.org/drawingml/2006/wordprocessingDrawing" xmlns:w10="urn:schemas-microsoft-com:office:word" xmlns:w="http://schemas.openxmlformats.org/wordprocessingml/2006/main" xmlns:w14="http://schemas.microsoft.com/office/word/2010/wordml" xmlns:wpg="http://schemas.microsoft.com/office/word/2010/wordprocessingGroup" xmlns:wpi="http://schemas.microsoft.com/office/word/2010/wordprocessingInk" xmlns:wne="http://schemas.microsoft.com/office/word/2006/wordml" xmlns:wps="http://schemas.microsoft.com/office/word/2010/wordprocessingShape" mc:Ignorable="w14 wp14">
+  <w:docDefaults>
+    <w:rPrDefault>
+      <w:rPr>
+        <w:rFonts w:asciiTheme="minorHAnsi" w:eastAsia="Arial" w:hAnsiTheme="minorHAnsi" w:cstheme="minorBidi"/>
+        <w:sz w:val="22"/>
+        <w:szCs w:val="22"/>
+        <w:lang w:val="en-US" w:eastAsia="en-US" w:bidi="ar-SA"/>
+      </w:rPr>
+    </w:rPrDefault>
+    <w:pPrDefault>
+      <w:pPr>
+        <w:spacing w:beforeAutospacing="1" w:after="160" w:afterAutospacing="1" w:line="259" w:lineRule="auto"/>
+      </w:pPr>
+    </w:pPrDefault>
+  </w:docDefaults>
+  <w:latentStyles w:defLockedState="0" w:defUIPriority="99" w:defSemiHidden="1" w:defUnhideWhenUsed="1" w:defQFormat="0" w:count="267">
+    <w:lsdException w:name="Normal" w:semiHidden="0" w:uiPriority="0" w:unhideWhenUsed="0" w:qFormat="1"/>
+    <w:lsdException w:name="heading 1" w:semiHidden="0" w:uiPriority="9" w:unhideWhenUsed="0" w:qFormat="1"/>
+    <w:lsdException w:name="heading 2" w:uiPriority="9" w:qFormat="1"/>
+    <w:lsdException w:name="heading 3" w:uiPriority="9" w:qFormat="1"/>
+    <w:lsdException w:name="heading 4" w:uiPriority="9" w:qFormat="1"/>
+    <w:lsdException w:name="heading 5" w:uiPriority="9" w:qFormat="1"/>
+    <w:lsdException w:name="heading 6" w:uiPriority="9" w:qFormat="1"/>
+    <w:lsdException w:name="heading 7" w:uiPriority="9" w:qFormat="1"/>
+    <w:lsdException w:name="heading 8" w:uiPriority="9" w:qFormat="1"/>
+    <w:lsdException w:name="heading 9" w:uiPriority="9" w:qFormat="1"/>
+    <w:lsdException w:name="toc 1" w:uiPriority="39"/>
+    <w:lsdException w:name="toc 2" w:uiPriority="39"/>
+    <w:lsdException w:name="toc 3" w:uiPriority="39"/>
+    <w:lsdException w:name="toc 4" w:uiPriority="39"/>
+    <w:lsdException w:name="toc 5" w:uiPriority="39"/>
+    <w:lsdException w:name="toc 6" w:uiPriority="39"/>
+    <w:lsdException w:name="toc 7" w:uiPriority="39"/>
+    <w:lsdException w:name="toc 8" w:uiPriority="39"/>
+    <w:lsdException w:name="toc 9" w:uiPriority="39"/>
+    <w:lsdException w:name="annotation text" w:qFormat="1"/>
+    <w:lsdException w:name="caption" w:uiPriority="35" w:qFormat="1"/>
+    <w:lsdException w:name="annotation reference" w:qFormat="1"/>
+    <w:lsdException w:name="Title" w:semiHidden="0" w:uiPriority="10" w:unhideWhenUsed="0" w:qFormat="1"/>
+    <w:lsdException w:name="Default Paragraph Font" w:uiPriority="1"/>
+    <w:lsdException w:name="Body Text" w:uiPriority="1" w:qFormat="1"/>
+    <w:lsdException w:name="Subtitle" w:semiHidden="0" w:uiPriority="11" w:unhideWhenUsed="0" w:qFormat="1"/>
+    <w:lsdException w:name="Strong" w:semiHidden="0" w:uiPriority="22" w:unhideWhenUsed="0" w:qFormat="1"/>
+    <w:lsdException w:name="Emphasis" w:semiHidden="0" w:uiPriority="20" w:unhideWhenUsed="0" w:qFormat="1"/>
+    <w:lsdException w:name="Table Grid" w:semiHidden="0" w:uiPriority="39" w:unhideWhenUsed="0"/>
+    <w:lsdException w:name="Placeholder Text" w:unhideWhenUsed="0"/>
+    <w:lsdException w:name="No Spacing" w:semiHidden="0" w:uiPriority="1" w:unhideWhenUsed="0" w:qFormat="1"/>
+    <w:lsdException w:name="Light Shading" w:semiHidden="0" w:uiPriority="60" w:unhideWhenUsed="0"/>
+    <w:lsdException w:name="Light List" w:semiHidden="0" w:uiPriority="61" w:unhideWhenUsed="0"/>
+    <w:lsdException w:name="Light Grid" w:semiHidden="0" w:uiPriority="62" w:unhideWhenUsed="0"/>
+    <w:lsdException w:name="Medium Shading 1" w:semiHidden="0" w:uiPriority="63" w:unhideWhenUsed="0"/>
+    <w:lsdException w:name="Medium Shading 2" w:semiHidden="0" w:uiPriority="64" w:unhideWhenUsed="0"/>
+    <w:lsdException w:name="Medium List 1" w:semiHidden="0" w:uiPriority="65" w:unhideWhenUsed="0"/>
+    <w:lsdException w:name="Medium List 2" w:semiHidden="0" w:uiPriority="66" w:unhideWhenUsed="0"/>
+    <w:lsdException w:name="Medium Grid 1" w:semiHidden="0" w:uiPriority="67" w:unhideWhenUsed="0"/>
+    <w:lsdException w:name="Medium Grid 2" w:semiHidden="0" w:uiPriority="68" w:unhideWhenUsed="0"/>
+    <w:lsdException w:name="Medium Grid 3" w:semiHidden="0" w:uiPriority="69" w:unhideWhenUsed="0"/>
+    <w:lsdException w:name="Dark List" w:semiHidden="0" w:uiPriority="70" w:unhideWhenUsed="0"/>
+    <w:lsdException w:name="Colorful Shading" w:semiHidden="0" w:uiPriority="71" w:unhideWhenUsed="0"/>
+    <w:lsdException w:name="Colorful List" w:semiHidden="0" w:uiPriority="72" w:unhideWhenUsed="0"/>
+    <w:lsdException w:name="Colorful Grid" w:semiHidden="0" w:uiPriority="73" w:unhideWhenUsed="0"/>
+    <w:lsdException w:name="Light Shading Accent 1" w:semiHidden="0" w:uiPriority="60" w:unhideWhenUsed="0"/>
+    <w:lsdException w:name="Light List Accent 1" w:semiHidden="0" w:uiPriority="61" w:unhideWhenUsed="0"/>
+    <w:lsdException w:name="Light Grid Accent 1" w:semiHidden="0" w:uiPriority="62" w:unhideWhenUsed="0"/>
+    <w:lsdException w:name="Medium Shading 1 Accent 1" w:semiHidden="0" w:uiPriority="63" w:unhideWhenUsed="0"/>
+    <w:lsdException w:name="Medium Shading 2 Accent 1" w:semiHidden="0" w:uiPriority="64" w:unhideWhenUsed="0"/>
+    <w:lsdException w:name="Medium List 1 Accent 1" w:semiHidden="0" w:uiPriority="65" w:unhideWhenUsed="0"/>
+    <w:lsdException w:name="Revision" w:unhideWhenUsed="0"/>
+    <w:lsdException w:name="List Paragraph" w:semiHidden="0" w:uiPriority="34" w:unhideWhenUsed="0" w:qFormat="1"/>
+    <w:lsdException w:name="Quote" w:semiHidden="0" w:uiPriority="29" w:unhideWhenUsed="0" w:qFormat="1"/>
+    <w:lsdException w:name="Intense Quote" w:semiHidden="0" w:uiPriority="30" w:unhideWhenUsed="0" w:qFormat="1"/>
+    <w:lsdException w:name="Medium List 2 Accent 1" w:semiHidden="0" w:uiPriority="66" w:unhideWhenUsed="0"/>
+    <w:lsdException w:name="Medium Grid 1 Accent 1" w:semiHidden="0" w:uiPriority="67" w:unhideWhenUsed="0"/>
+    <w:lsdException w:name="Medium Grid 2 Accent 1" w:semiHidden="0" w:uiPriority="68" w:unhideWhenUsed="0"/>
+    <w:lsdException w:name="Medium Grid 3 Accent 1" w:semiHidden="0" w:uiPriority="69" w:unhideWhenUsed="0"/>
+    <w:lsdException w:name="Dark List Accent 1" w:semiHidden="0" w:uiPriority="70" w:unhideWhenUsed="0"/>
+    <w:lsdException w:name="Colorful Shading Accent 1" w:semiHidden="0" w:uiPriority="71" w:unhideWhenUsed="0"/>
+    <w:lsdException w:name="Colorful List Accent 1" w:semiHidden="0" w:uiPriority="72" w:unhideWhenUsed="0"/>
+    <w:lsdException w:name="Colorful Grid Accent 1" w:semiHidden="0" w:uiPriority="73" w:unhideWhenUsed="0"/>
+    <w:lsdException w:name="Light Shading Accent 2" w:semiHidden="0" w:uiPriority="60" w:unhideWhenUsed="0"/>
+    <w:lsdException w:name="Light List Accent 2" w:semiHidden="0" w:uiPriority="61" w:unhideWhenUsed="0"/>
+    <w:lsdException w:name="Light Grid Accent 2" w:semiHidden="0" w:uiPriority="62" w:unhideWhenUsed="0"/>
+    <w:lsdException w:name="Medium Shading 1 Accent 2" w:semiHidden="0" w:uiPriority="63" w:unhideWhenUsed="0"/>
+    <w:lsdException w:name="Medium Shading 2 Accent 2" w:semiHidden="0" w:uiPriority="64" w:unhideWhenUsed="0"/>
+    <w:lsdException w:name="Medium List 1 Accent 2" w:semiHidden="0" w:uiPriority="65" w:unhideWhenUsed="0"/>
+    <w:lsdException w:name="Medium List 2 Accent 2" w:semiHidden="0" w:uiPriority="66" w:unhideWhenUsed="0"/>
+    <w:lsdException w:name="Medium Grid 1 Accent 2" w:semiHidden="0" w:uiPriority="67" w:unhideWhenUsed="0"/>
+    <w:lsdException w:name="Medium Grid 2 Accent 2" w:semiHidden="0" w:uiPriority="68" w:unhideWhenUsed="0"/>
+    <w:lsdException w:name="Medium Grid 3 Accent 2" w:semiHidden="0" w:uiPriority="69" w:unhideWhenUsed="0"/>
+    <w:lsdException w:name="Dark List Accent 2" w:semiHidden="0" w:uiPriority="70" w:unhideWhenUsed="0"/>
+    <w:lsdException w:name="Colorful Shading Accent 2" w:semiHidden="0" w:uiPriority="71" w:unhideWhenUsed="0"/>
+    <w:lsdException w:name="Colorful List Accent 2" w:semiHidden="0" w:uiPriority="72" w:unhideWhenUsed="0"/>
+    <w:lsdException w:name="Colorful Grid Accent 2" w:semiHidden="0" w:uiPriority="73" w:unhideWhenUsed="0"/>
+    <w:lsdException w:name="Light Shading Accent 3" w:semiHidden="0" w:uiPriority="60" w:unhideWhenUsed="0"/>
+    <w:lsdException w:name="Light List Accent 3" w:semiHidden="0" w:uiPriority="61" w:unhideWhenUsed="0"/>
+    <w:lsdException w:name="Light Grid Accent 3" w:semiHidden="0" w:uiPriority="62" w:unhideWhenUsed="0"/>
+    <w:lsdException w:name="Medium Shading 1 Accent 3" w:semiHidden="0" w:uiPriority="63" w:unhideWhenUsed="0"/>
+    <w:lsdException w:name="Medium Shading 2 Accent 3" w:semiHidden="0" w:uiPriority="64" w:unhideWhenUsed="0"/>
+    <w:lsdException w:name="Medium List 1 Accent 3" w:semiHidden="0" w:uiPriority="65" w:unhideWhenUsed="0"/>
+    <w:lsdException w:name="Medium List 2 Accent 3" w:semiHidden="0" w:uiPriority="66" w:unhideWhenUsed="0"/>
+    <w:lsdException w:name="Medium Grid 1 Accent 3" w:semiHidden="0" w:uiPriority="67" w:unhideWhenUsed="0"/>
+    <w:lsdException w:name="Medium Grid 2 Accent 3" w:semiHidden="0" w:uiPriority="68" w:unhideWhenUsed="0"/>
+    <w:lsdException w:name="Medium Grid 3 Accent 3" w:semiHidden="0" w:uiPriority="69" w:unhideWhenUsed="0"/>
+    <w:lsdException w:name="Dark List Accent 3" w:semiHidden="0" w:uiPriority="70" w:unhideWhenUsed="0"/>
+    <w:lsdException w:name="Colorful Shading Accent 3" w:semiHidden="0" w:uiPriority="71" w:unhideWhenUsed="0"/>
+    <w:lsdException w:name="Colorful List Accent 3" w:semiHidden="0" w:uiPriority="72" w:unhideWhenUsed="0"/>
+    <w:lsdException w:name="Colorful Grid Accent 3" w:semiHidden="0" w:uiPriority="73" w:unhideWhenUsed="0"/>
+    <w:lsdException w:name="Light Shading Accent 4" w:semiHidden="0" w:uiPriority="60" w:unhideWhenUsed="0"/>
+    <w:lsdException w:name="Light List Accent 4" w:semiHidden="0" w:uiPriority="61" w:unhideWhenUsed="0"/>
+    <w:lsdException w:name="Light Grid Accent 4" w:semiHidden="0" w:uiPriority="62" w:unhideWhenUsed="0"/>
+    <w:lsdException w:name="Medium Shading 1 Accent 4" w:semiHidden="0" w:uiPriority="63" w:unhideWhenUsed="0"/>
+    <w:lsdException w:name="Medium Shading 2 Accent 4" w:semiHidden="0" w:uiPriority="64" w:unhideWhenUsed="0"/>
+    <w:lsdException w:name="Medium List 1 Accent 4" w:semiHidden="0" w:uiPriority="65" w:unhideWhenUsed="0"/>
+    <w:lsdException w:name="Medium List 2 Accent 4" w:semiHidden="0" w:uiPriority="66" w:unhideWhenUsed="0"/>
+    <w:lsdException w:name="Medium Grid 1 Accent 4" w:semiHidden="0" w:uiPriority="67" w:unhideWhenUsed="0"/>
+    <w:lsdException w:name="Medium Grid 2 Accent 4" w:semiHidden="0" w:uiPriority="68" w:unhideWhenUsed="0"/>
+    <w:lsdException w:name="Medium Grid 3 Accent 4" w:semiHidden="0" w:uiPriority="69" w:unhideWhenUsed="0"/>
+    <w:lsdException w:name="Dark List Accent 4" w:semiHidden="0" w:uiPriority="70" w:unhideWhenUsed="0"/>
+    <w:lsdException w:name="Colorful Shading Accent 4" w:semiHidden="0" w:uiPriority="71" w:unhideWhenUsed="0"/>
+    <w:lsdException w:name="Colorful List Accent 4" w:semiHidden="0" w:uiPriority="72" w:unhideWhenUsed="0"/>
+    <w:lsdException w:name="Colorful Grid Accent 4" w:semiHidden="0" w:uiPriority="73" w:unhideWhenUsed="0"/>
+    <w:lsdException w:name="Light Shading Accent 5" w:semiHidden="0" w:uiPriority="60" w:unhideWhenUsed="0"/>
+    <w:lsdException w:name="Light List Accent 5" w:semiHidden="0" w:uiPriority="61" w:unhideWhenUsed="0"/>
+    <w:lsdException w:name="Light Grid Accent 5" w:semiHidden="0" w:uiPriority="62" w:unhideWhenUsed="0"/>
+    <w:lsdException w:name="Medium Shading 1 Accent 5" w:semiHidden="0" w:uiPriority="63" w:unhideWhenUsed="0"/>
+    <w:lsdException w:name="Medium Shading 2 Accent 5" w:semiHidden="0" w:uiPriority="64" w:unhideWhenUsed="0"/>
+    <w:lsdException w:name="Medium List 1 Accent 5" w:semiHidden="0" w:uiPriority="65" w:unhideWhenUsed="0"/>
+    <w:lsdException w:name="Medium List 2 Accent 5" w:semiHidden="0" w:uiPriority="66" w:unhideWhenUsed="0"/>
+    <w:lsdException w:name="Medium Grid 1 Accent 5" w:semiHidden="0" w:uiPriority="67" w:unhideWhenUsed="0"/>
+    <w:lsdException w:name="Medium Grid 2 Accent 5" w:semiHidden="0" w:uiPriority="68" w:unhideWhenUsed="0"/>
+    <w:lsdException w:name="Medium Grid 3 Accent 5" w:semiHidden="0" w:uiPriority="69" w:unhideWhenUsed="0"/>
+    <w:lsdException w:name="Dark List Accent 5" w:semiHidden="0" w:uiPriority="70" w:unhideWhenUsed="0"/>
+    <w:lsdException w:name="Colorful Shading Accent 5" w:semiHidden="0" w:uiPriority="71" w:unhideWhenUsed="0"/>
+    <w:lsdException w:name="Colorful List Accent 5" w:semiHidden="0" w:uiPriority="72" w:unhideWhenUsed="0"/>
+    <w:lsdException w:name="Colorful Grid Accent 5" w:semiHidden="0" w:uiPriority="73" w:unhideWhenUsed="0"/>
+    <w:lsdException w:name="Light Shading Accent 6" w:semiHidden="0" w:uiPriority="60" w:unhideWhenUsed="0"/>
+    <w:lsdException w:name="Light List Accent 6" w:semiHidden="0" w:uiPriority="61" w:unhideWhenUsed="0"/>
+    <w:lsdException w:name="Light Grid Accent 6" w:semiHidden="0" w:uiPriority="62" w:unhideWhenUsed="0"/>
+    <w:lsdException w:name="Medium Shading 1 Accent 6" w:semiHidden="0" w:uiPriority="63" w:unhideWhenUsed="0"/>
+    <w:lsdException w:name="Medium Shading 2 Accent 6" w:semiHidden="0" w:uiPriority="64" w:unhideWhenUsed="0"/>
+    <w:lsdException w:name="Medium List 1 Accent 6" w:semiHidden="0" w:uiPriority="65" w:unhideWhenUsed="0"/>
+    <w:lsdException w:name="Medium List 2 Accent 6" w:semiHidden="0" w:uiPriority="66" w:unhideWhenUsed="0"/>
+    <w:lsdException w:name="Medium Grid 1 Accent 6" w:semiHidden="0" w:uiPriority="67" w:unhideWhenUsed="0"/>
+    <w:lsdException w:name="Medium Grid 2 Accent 6" w:semiHidden="0" w:uiPriority="68" w:unhideWhenUsed="0"/>
+    <w:lsdException w:name="Medium Grid 3 Accent 6" w:semiHidden="0" w:uiPriority="69" w:unhideWhenUsed="0"/>
+    <w:lsdException w:name="Dark List Accent 6" w:semiHidden="0" w:uiPriority="70" w:unhideWhenUsed="0"/>
+    <w:lsdException w:name="Colorful Shading Accent 6" w:semiHidden="0" w:uiPriority="71" w:unhideWhenUsed="0"/>
+    <w:lsdException w:name="Colorful List Accent 6" w:semiHidden="0" w:uiPriority="72" w:unhideWhenUsed="0"/>
+    <w:lsdException w:name="Colorful Grid Accent 6" w:semiHidden="0" w:uiPriority="73" w:unhideWhenUsed="0"/>
+    <w:lsdException w:name="Subtle Emphasis" w:semiHidden="0" w:uiPriority="19" w:unhideWhenUsed="0" w:qFormat="1"/>
+    <w:lsdException w:name="Intense Emphasis" w:semiHidden="0" w:uiPriority="21" w:unhideWhenUsed="0" w:qFormat="1"/>
+    <w:lsdException w:name="Subtle Reference" w:semiHidden="0" w:uiPriority="31" w:unhideWhenUsed="0" w:qFormat="1"/>
+    <w:lsdException w:name="Intense Reference" w:semiHidden="0" w:uiPriority="32" w:unhideWhenUsed="0" w:qFormat="1"/>
+    <w:lsdException w:name="Book Title" w:semiHidden="0" w:uiPriority="33" w:unhideWhenUsed="0" w:qFormat="1"/>
+    <w:lsdException w:name="Bibliography" w:uiPriority="37"/>
+    <w:lsdException w:name="TOC Heading" w:uiPriority="39" w:qFormat="1"/>
+  </w:latentStyles>
+  <w:style w:type="paragraph" w:default="1" w:styleId="Normal">
+    <w:name w:val="Normal"/>
+    <w:qFormat/>
+    <w:rsid w:val="000F4FEF"/>
+    <w:pPr>
+      <w:spacing w:before="-1" w:after="-1" w:line="240" w:lineRule="auto"/>
+    </w:pPr>
+    <w:rPr>
+      <w:rFonts w:ascii="Arial" w:hAnsi="Arial" w:cs="Arial"/>
+    </w:rPr>
+  </w:style>
+  <w:style w:type="paragraph" w:styleId="Heading1">
+    <w:name w:val="heading 1"/>
+    <w:basedOn w:val="Normal"/>
+    <w:link w:val="Heading1Char"/>
+    <w:uiPriority w:val="9"/>
+    <w:qFormat/>
+    <w:rsid w:val="000F4FEF"/>
+    <w:pPr>
+      <w:pBdr>
+        <w:bottom w:val="single" w:sz="4" w:space="1" w:color="A6A6A6" w:themeColor="background1" w:themeShade="A6"/>
+      </w:pBdr>
+      <w:spacing w:before="0" w:beforeAutospacing="0" w:after="100" w:line="276" w:lineRule="auto"/>
+      <w:outlineLvl w:val="0"/>
+    </w:pPr>
+    <w:rPr>
+      <w:rFonts w:ascii="Helvetica" w:hAnsi="Helvetica" w:cs="Helvetica"/>
+      <w:color w:val="0A2A78"/>
+      <w:spacing w:val="-4"/>
+      <w:sz w:val="40"/>
+      <w:szCs w:val="24"/>
+    </w:rPr>
+  </w:style>
+  <w:style w:type="paragraph" w:styleId="Heading2">
+    <w:name w:val="heading 2"/>
+    <w:basedOn w:val="Normal"/>
+    <w:next w:val="Normal"/>
+    <w:link w:val="Heading2Char"/>
+    <w:uiPriority w:val="9"/>
+    <w:unhideWhenUsed/>
+    <w:qFormat/>
+    <w:rsid w:val="000F4FEF"/>
+    <w:pPr>
+      <w:widowControl w:val="0"/>
+      <w:autoSpaceDE w:val="0"/>
+      <w:autoSpaceDN w:val="0"/>
+      <w:spacing w:before="0" w:beforeAutospacing="0" w:after="0" w:afterAutospacing="0" w:line="276" w:lineRule="auto"/>
+      <w:outlineLvl w:val="1"/>
+    </w:pPr>
+    <w:rPr>
+      <w:rFonts w:ascii="Helvetica" w:eastAsiaTheme="minorHAnsi" w:hAnsi="Helvetica" w:cs="Helvetica"/>
+      <w:color w:val="0A2A78"/>
+      <w:spacing w:val="-2"/>
+      <w:sz w:val="36"/>
+      <w:szCs w:val="24"/>
+    </w:rPr>
+  </w:style>
+  <w:style w:type="paragraph" w:styleId="Heading3">
+    <w:name w:val="heading 3"/>
+    <w:basedOn w:val="Heading2"/>
+    <w:next w:val="Body"/>
+    <w:link w:val="Heading3Char"/>
+    <w:uiPriority w:val="9"/>
+    <w:unhideWhenUsed/>
+    <w:qFormat/>
+    <w:rsid w:val="000F4FEF"/>
+    <w:pPr>
+      <w:outlineLvl w:val="2"/>
+    </w:pPr>
+    <w:rPr>
+      <w:sz w:val="32"/>
+    </w:rPr>
+  </w:style>
+  <w:style w:type="paragraph" w:styleId="Heading4">
+    <w:name w:val="heading 4"/>
+    <w:basedOn w:val="Normal"/>
+    <w:next w:val="Normal"/>
+    <w:link w:val="Heading4Char"/>
+    <w:uiPriority w:val="9"/>
+    <w:unhideWhenUsed/>
+    <w:qFormat/>
+    <w:rsid w:val="000F4FEF"/>
+    <w:pPr>
+      <w:widowControl w:val="0"/>
+      <w:autoSpaceDE w:val="0"/>
+      <w:autoSpaceDN w:val="0"/>
+      <w:spacing w:before="54" w:beforeAutospacing="0" w:after="120" w:afterAutospacing="0" w:line="276" w:lineRule="auto"/>
+      <w:ind w:left="360"/>
+      <w:outlineLvl w:val="3"/>
+    </w:pPr>
+    <w:rPr>
+      <w:rFonts w:ascii="Helvetica" w:eastAsiaTheme="minorHAnsi" w:hAnsi="Helvetica" w:cs="Helvetica"/>
+      <w:iCs/>
+      <w:color w:val="0A2A78"/>
+      <w:spacing w:val="-2"/>
+      <w:sz w:val="24"/>
+      <w:szCs w:val="24"/>
+    </w:rPr>
+  </w:style>
+  <w:style w:type="paragraph" w:styleId="Heading5">
+    <w:name w:val="heading 5"/>
+    <w:basedOn w:val="Normal"/>
+    <w:next w:val="Normal"/>
+    <w:link w:val="Heading5Char"/>
+    <w:uiPriority w:val="9"/>
+    <w:unhideWhenUsed/>
+    <w:qFormat/>
+    <w:rsid w:val="000F4FEF"/>
+    <w:pPr>
+      <w:keepNext/>
+      <w:keepLines/>
+      <w:spacing w:before="240" w:after="80"/>
+      <w:outlineLvl w:val="4"/>
+    </w:pPr>
+    <w:rPr>
+      <w:color w:val="666666"/>
+    </w:rPr>
+  </w:style>
+  <w:style w:type="paragraph" w:styleId="Heading6">
+    <w:name w:val="heading 6"/>
+    <w:basedOn w:val="Normal"/>
+    <w:next w:val="Normal"/>
+    <w:link w:val="Heading6Char"/>
+    <w:uiPriority w:val="9"/>
+    <w:semiHidden/>
+    <w:unhideWhenUsed/>
+    <w:qFormat/>
+    <w:rsid w:val="000F4FEF"/>
+    <w:pPr>
+      <w:keepNext/>
+      <w:keepLines/>
+      <w:spacing w:before="240" w:after="80"/>
+      <w:outlineLvl w:val="5"/>
+    </w:pPr>
+    <w:rPr>
+      <w:i/>
+      <w:color w:val="666666"/>
+    </w:rPr>
+  </w:style>
+  <w:style w:type="character" w:default="1" w:styleId="DefaultParagraphFont">
+    <w:name w:val="Default Paragraph Font"/>
+    <w:uiPriority w:val="1"/>
+    <w:semiHidden/>
+    <w:unhideWhenUsed/>
+  </w:style>
+  <w:style w:type="table" w:default="1" w:styleId="TableNormal">
+    <w:name w:val="Normal Table"/>
+    <w:uiPriority w:val="99"/>
+    <w:semiHidden/>
+    <w:unhideWhenUsed/>
+    <w:tblPr>
+      <w:tblInd w:w="0" w:type="dxa"/>
+      <w:tblCellMar>
+        <w:top w:w="0" w:type="dxa"/>
+        <w:left w:w="108" w:type="dxa"/>
+        <w:bottom w:w="0" w:type="dxa"/>
+        <w:right w:w="108" w:type="dxa"/>
+      </w:tblCellMar>
+    </w:tblPr>
+  </w:style>
+  <w:style w:type="numbering" w:default="1" w:styleId="NoList">
+    <w:name w:val="No List"/>
+    <w:uiPriority w:val="99"/>
+    <w:semiHidden/>
+    <w:unhideWhenUsed/>
+  </w:style>
+  <w:style w:type="paragraph" w:customStyle="1" w:styleId="Code">
+    <w:name w:val="Code"/>
+    <w:basedOn w:val="Normal"/>
+    <w:qFormat/>
+    <w:rsid w:val="000F4FEF"/>
+    <w:rPr>
+      <w:rFonts w:ascii="Calibri" w:hAnsi="Calibri"/>
+    </w:rPr>
+  </w:style>
+  <w:style w:type="paragraph" w:customStyle="1" w:styleId="Body">
+    <w:name w:val="Body"/>
+    <w:basedOn w:val="Normal"/>
+    <w:link w:val="BodyChar"/>
+    <w:qFormat/>
+    <w:rsid w:val="000F4FEF"/>
+    <w:pPr>
+      <w:spacing w:before="0" w:beforeAutospacing="0" w:after="120" w:afterAutospacing="0" w:line="276" w:lineRule="auto"/>
+    </w:pPr>
+    <w:rPr>
+      <w:rFonts w:ascii="Helvetica" w:eastAsiaTheme="minorHAnsi" w:hAnsi="Helvetica" w:cs="Helvetica"/>
+      <w:sz w:val="24"/>
+      <w:szCs w:val="24"/>
+    </w:rPr>
+  </w:style>
+  <w:style w:type="character" w:customStyle="1" w:styleId="Heading1Char">
+    <w:name w:val="Heading 1 Char"/>
+    <w:basedOn w:val="DefaultParagraphFont"/>
+    <w:link w:val="Heading1"/>
+    <w:uiPriority w:val="9"/>
+    <w:rsid w:val="000F4FEF"/>
+    <w:rPr>
+      <w:rFonts w:ascii="Helvetica" w:hAnsi="Helvetica" w:cs="Helvetica"/>
+      <w:color w:val="0A2A78"/>
+      <w:spacing w:val="-4"/>
+      <w:sz w:val="40"/>
+      <w:szCs w:val="24"/>
+    </w:rPr>
+  </w:style>
+  <w:style w:type="paragraph" w:styleId="ListParagraph">
+    <w:name w:val="List Paragraph"/>
+    <w:basedOn w:val="BodyText"/>
+    <w:uiPriority w:val="34"/>
+    <w:qFormat/>
+    <w:rsid w:val="000F4FEF"/>
+    <w:pPr>
+      <w:widowControl w:val="0"/>
+      <w:numPr>
+        <w:numId w:val="9"/>
+      </w:numPr>
+      <w:autoSpaceDE w:val="0"/>
+      <w:autoSpaceDN w:val="0"/>
+      <w:spacing w:before="54" w:beforeAutospacing="0" w:afterAutospacing="0" w:line="276" w:lineRule="auto"/>
+    </w:pPr>
+    <w:rPr>
+      <w:rFonts w:ascii="Helvetica" w:eastAsiaTheme="minorHAnsi" w:hAnsi="Helvetica" w:cs="Helvetica"/>
+      <w:color w:val="202529"/>
+      <w:spacing w:val="-2"/>
+      <w:sz w:val="24"/>
+      <w:szCs w:val="24"/>
+    </w:rPr>
+  </w:style>
+  <w:style w:type="paragraph" w:customStyle="1" w:styleId="TFVariable">
+    <w:name w:val="TF Variable"/>
+    <w:basedOn w:val="Heading3"/>
+    <w:next w:val="Body"/>
+    <w:qFormat/>
+    <w:rsid w:val="000F4FEF"/>
+    <w:pPr>
+      <w:numPr>
+        <w:numId w:val="11"/>
+      </w:numPr>
+    </w:pPr>
+  </w:style>
+  <w:style w:type="character" w:customStyle="1" w:styleId="Heading3Char">
+    <w:name w:val="Heading 3 Char"/>
+    <w:basedOn w:val="DefaultParagraphFont"/>
+    <w:link w:val="Heading3"/>
+    <w:uiPriority w:val="9"/>
+    <w:qFormat/>
+    <w:rsid w:val="000F4FEF"/>
+    <w:rPr>
+      <w:rFonts w:ascii="Helvetica" w:eastAsiaTheme="minorHAnsi" w:hAnsi="Helvetica" w:cs="Helvetica"/>
+      <w:color w:val="0A2A78"/>
+      <w:spacing w:val="-2"/>
+      <w:sz w:val="32"/>
+      <w:szCs w:val="24"/>
+    </w:rPr>
+  </w:style>
+  <w:style w:type="paragraph" w:customStyle="1" w:styleId="interviewcondition">
+    <w:name w:val="interview condition"/>
+    <w:basedOn w:val="Normal"/>
+    <w:link w:val="interviewconditionChar"/>
+    <w:qFormat/>
+    <w:rsid w:val="00F44633"/>
+    <w:pPr>
+      <w:spacing w:after="60" w:line="360" w:lineRule="auto"/>
+    </w:pPr>
+    <w:rPr>
+      <w:rFonts w:asciiTheme="minorHAnsi" w:hAnsiTheme="minorHAnsi" w:cstheme="minorBidi"/>
+      <w:color w:val="00B050"/>
+      <w:u w:val="single"/>
+    </w:rPr>
+  </w:style>
+  <w:style w:type="character" w:customStyle="1" w:styleId="interviewconditionChar">
+    <w:name w:val="interview condition Char"/>
+    <w:basedOn w:val="DefaultParagraphFont"/>
+    <w:link w:val="interviewcondition"/>
+    <w:rsid w:val="00F44633"/>
+    <w:rPr>
+      <w:color w:val="00B050"/>
+      <w:u w:val="single"/>
+    </w:rPr>
+  </w:style>
+  <w:style w:type="paragraph" w:customStyle="1" w:styleId="interviewbutton">
+    <w:name w:val="interview button"/>
+    <w:basedOn w:val="Normal"/>
+    <w:next w:val="Normal"/>
+    <w:link w:val="interviewbuttonChar"/>
+    <w:qFormat/>
+    <w:rsid w:val="000F4FEF"/>
+    <w:pPr>
+      <w:shd w:val="clear" w:color="auto" w:fill="0070C0"/>
+      <w:spacing w:after="60" w:line="360" w:lineRule="auto"/>
+    </w:pPr>
+    <w:rPr>
+      <w:rFonts w:asciiTheme="minorHAnsi" w:hAnsiTheme="minorHAnsi" w:cstheme="minorBidi"/>
+      <w:color w:val="FFFFFF" w:themeColor="background1"/>
+      <w:szCs w:val="40"/>
+    </w:rPr>
+  </w:style>
+  <w:style w:type="character" w:customStyle="1" w:styleId="interviewbuttonChar">
+    <w:name w:val="interview button Char"/>
+    <w:basedOn w:val="DefaultParagraphFont"/>
+    <w:link w:val="interviewbutton"/>
+    <w:qFormat/>
+    <w:rsid w:val="000F4FEF"/>
+    <w:rPr>
+      <w:color w:val="FFFFFF" w:themeColor="background1"/>
+      <w:szCs w:val="40"/>
+      <w:shd w:val="clear" w:color="auto" w:fill="0070C0"/>
+    </w:rPr>
+  </w:style>
+  <w:style w:type="paragraph" w:styleId="BodyText">
+    <w:name w:val="Body Text"/>
+    <w:basedOn w:val="Normal"/>
+    <w:link w:val="BodyTextChar"/>
+    <w:uiPriority w:val="1"/>
+    <w:unhideWhenUsed/>
+    <w:qFormat/>
+    <w:rsid w:val="000F4FEF"/>
+    <w:pPr>
+      <w:spacing w:after="120"/>
+    </w:pPr>
+  </w:style>
+  <w:style w:type="character" w:customStyle="1" w:styleId="BodyTextChar">
+    <w:name w:val="Body Text Char"/>
+    <w:basedOn w:val="DefaultParagraphFont"/>
+    <w:link w:val="BodyText"/>
+    <w:uiPriority w:val="1"/>
+    <w:rsid w:val="000F4FEF"/>
+    <w:rPr>
+      <w:rFonts w:ascii="Arial" w:hAnsi="Arial" w:cs="Arial"/>
+    </w:rPr>
+  </w:style>
+  <w:style w:type="character" w:customStyle="1" w:styleId="interviewcondition2">
+    <w:name w:val="interview condition 2"/>
+    <w:basedOn w:val="Hyperlink"/>
+    <w:uiPriority w:val="1"/>
+    <w:qFormat/>
+    <w:rsid w:val="000F4FEF"/>
+    <w:rPr>
+      <w:rFonts w:ascii="Helvetica" w:eastAsia="Arial" w:hAnsi="Helvetica" w:cs="Helvetica"/>
+      <w:color w:val="009999"/>
+      <w:spacing w:val="-2"/>
+      <w:sz w:val="24"/>
+      <w:szCs w:val="24"/>
+      <w:u w:val="none"/>
+    </w:rPr>
+  </w:style>
+  <w:style w:type="character" w:styleId="Hyperlink">
+    <w:name w:val="Hyperlink"/>
+    <w:basedOn w:val="DefaultParagraphFont"/>
+    <w:uiPriority w:val="99"/>
+    <w:unhideWhenUsed/>
+    <w:rsid w:val="000F4FEF"/>
+    <w:rPr>
+      <w:rFonts w:ascii="Helvetica" w:hAnsi="Helvetica" w:cs="Helvetica"/>
+      <w:color w:val="0563C1" w:themeColor="hyperlink"/>
+      <w:spacing w:val="-2"/>
+      <w:sz w:val="24"/>
+      <w:szCs w:val="24"/>
+      <w:u w:val="none"/>
+    </w:rPr>
+  </w:style>
+  <w:style w:type="paragraph" w:customStyle="1" w:styleId="variable">
+    <w:name w:val="variable"/>
+    <w:basedOn w:val="Normal"/>
+    <w:qFormat/>
+    <w:rsid w:val="00B61CCF"/>
+    <w:pPr>
+      <w:spacing w:after="120" w:line="276" w:lineRule="auto"/>
+    </w:pPr>
+    <w:rPr>
+      <w:color w:val="FF7C80"/>
+      <w:shd w:val="clear" w:color="auto" w:fill="FFFFCC"/>
+      <w:lang w:val="en"/>
+    </w:rPr>
+  </w:style>
+  <w:style w:type="character" w:customStyle="1" w:styleId="Heading2Char">
+    <w:name w:val="Heading 2 Char"/>
+    <w:basedOn w:val="DefaultParagraphFont"/>
+    <w:link w:val="Heading2"/>
+    <w:uiPriority w:val="9"/>
+    <w:rsid w:val="000F4FEF"/>
+    <w:rPr>
+      <w:rFonts w:ascii="Helvetica" w:eastAsiaTheme="minorHAnsi" w:hAnsi="Helvetica" w:cs="Helvetica"/>
+      <w:color w:val="0A2A78"/>
+      <w:spacing w:val="-2"/>
+      <w:sz w:val="36"/>
+      <w:szCs w:val="24"/>
+    </w:rPr>
+  </w:style>
+  <w:style w:type="character" w:customStyle="1" w:styleId="Heading4Char">
+    <w:name w:val="Heading 4 Char"/>
+    <w:basedOn w:val="DefaultParagraphFont"/>
+    <w:link w:val="Heading4"/>
+    <w:uiPriority w:val="9"/>
+    <w:qFormat/>
+    <w:rsid w:val="000F4FEF"/>
+    <w:rPr>
+      <w:rFonts w:ascii="Helvetica" w:eastAsiaTheme="minorHAnsi" w:hAnsi="Helvetica" w:cs="Helvetica"/>
+      <w:iCs/>
+      <w:color w:val="0A2A78"/>
+      <w:spacing w:val="-2"/>
+      <w:sz w:val="24"/>
+      <w:szCs w:val="24"/>
+    </w:rPr>
+  </w:style>
+  <w:style w:type="paragraph" w:customStyle="1" w:styleId="Example">
+    <w:name w:val="Example"/>
+    <w:basedOn w:val="Heading4"/>
+    <w:next w:val="Normal"/>
+    <w:qFormat/>
+    <w:rsid w:val="000F4FEF"/>
+  </w:style>
+  <w:style w:type="paragraph" w:customStyle="1" w:styleId="Exampleparagraph">
+    <w:name w:val="Example paragraph"/>
+    <w:basedOn w:val="Body"/>
+    <w:next w:val="Body"/>
+    <w:qFormat/>
+    <w:rsid w:val="00CA58DD"/>
+    <w:pPr>
+      <w:ind w:left="416"/>
+    </w:pPr>
+    <w:rPr>
+      <w:color w:val="202529"/>
+      <w:spacing w:val="-2"/>
+    </w:rPr>
+  </w:style>
+  <w:style w:type="paragraph" w:customStyle="1" w:styleId="ListParagraphNumbered">
+    <w:name w:val="List Paragraph Numbered"/>
+    <w:basedOn w:val="ListParagraph"/>
+    <w:qFormat/>
+    <w:rsid w:val="000F4FEF"/>
+    <w:pPr>
+      <w:numPr>
+        <w:numId w:val="10"/>
+      </w:numPr>
+    </w:pPr>
+    <w:rPr>
+      <w:b/>
+    </w:rPr>
+  </w:style>
+  <w:style w:type="paragraph" w:customStyle="1" w:styleId="ExampleorImportantblock">
+    <w:name w:val="Example or Important block"/>
+    <w:basedOn w:val="Body"/>
+    <w:qFormat/>
+    <w:rsid w:val="000F4FEF"/>
+    <w:pPr>
+      <w:widowControl w:val="0"/>
+      <w:suppressAutoHyphens/>
+      <w:ind w:left="403"/>
+    </w:pPr>
+    <w:rPr>
+      <w:color w:val="202529"/>
+      <w:spacing w:val="-2"/>
+    </w:rPr>
+  </w:style>
+  <w:style w:type="paragraph" w:customStyle="1" w:styleId="Listnumbered">
+    <w:name w:val="List numbered"/>
+    <w:basedOn w:val="Normal"/>
+    <w:qFormat/>
+    <w:rsid w:val="000F4FEF"/>
+    <w:pPr>
+      <w:widowControl w:val="0"/>
+      <w:autoSpaceDE w:val="0"/>
+      <w:autoSpaceDN w:val="0"/>
+      <w:spacing w:before="54" w:beforeAutospacing="0" w:after="120" w:afterAutospacing="0" w:line="276" w:lineRule="auto"/>
+    </w:pPr>
+    <w:rPr>
+      <w:rFonts w:ascii="Helvetica" w:eastAsiaTheme="minorHAnsi" w:hAnsi="Helvetica" w:cs="Helvetica"/>
+      <w:color w:val="202529"/>
+      <w:spacing w:val="-2"/>
+      <w:sz w:val="24"/>
+      <w:szCs w:val="24"/>
+    </w:rPr>
+  </w:style>
+  <w:style w:type="character" w:customStyle="1" w:styleId="Helptextinquestionmark">
+    <w:name w:val="Help text in question mark"/>
+    <w:basedOn w:val="DefaultParagraphFont"/>
+    <w:uiPriority w:val="1"/>
+    <w:qFormat/>
+    <w:rsid w:val="000F4FEF"/>
+    <w:rPr>
+      <w:rFonts w:ascii="Tahoma" w:hAnsi="Tahoma" w:cs="Tahoma"/>
+      <w:color w:val="FFFFFF" w:themeColor="background1"/>
+      <w:szCs w:val="24"/>
+      <w:shd w:val="clear" w:color="auto" w:fill="33CCFF"/>
+    </w:rPr>
+  </w:style>
+  <w:style w:type="character" w:customStyle="1" w:styleId="interviewtextbox">
+    <w:name w:val="interview text box"/>
+    <w:basedOn w:val="DefaultParagraphFont"/>
+    <w:uiPriority w:val="1"/>
+    <w:qFormat/>
+    <w:rsid w:val="000F4FEF"/>
+    <w:rPr>
+      <w:shd w:val="clear" w:color="auto" w:fill="D9D9D9" w:themeFill="background1" w:themeFillShade="D9"/>
+    </w:rPr>
+  </w:style>
+  <w:style w:type="character" w:customStyle="1" w:styleId="interviewhelpquestionmark">
+    <w:name w:val="interview help question mark"/>
+    <w:basedOn w:val="DefaultParagraphFont"/>
+    <w:uiPriority w:val="1"/>
+    <w:qFormat/>
+    <w:rsid w:val="000F4FEF"/>
+    <w:rPr>
+      <w:color w:val="FFFFFF" w:themeColor="background1"/>
+      <w:shd w:val="clear" w:color="auto" w:fill="9CC2E5" w:themeFill="accent5" w:themeFillTint="99"/>
+    </w:rPr>
+  </w:style>
+  <w:style w:type="paragraph" w:customStyle="1" w:styleId="ListPlevel2">
+    <w:name w:val="List P level 2"/>
+    <w:basedOn w:val="ListParagraph"/>
+    <w:qFormat/>
+    <w:rsid w:val="000F4FEF"/>
+    <w:pPr>
+      <w:ind w:left="765"/>
+    </w:pPr>
+    <w:rPr>
+      <w:color w:val="auto"/>
+      <w:spacing w:val="0"/>
+    </w:rPr>
+  </w:style>
+  <w:style w:type="paragraph" w:customStyle="1" w:styleId="ListPlevel3">
+    <w:name w:val="List P level 3"/>
+    <w:basedOn w:val="ListPlevel2"/>
+    <w:qFormat/>
+    <w:rsid w:val="000F4FEF"/>
+    <w:pPr>
+      <w:tabs>
+        <w:tab w:val="num" w:pos="360"/>
+      </w:tabs>
+      <w:ind w:left="2160"/>
+    </w:pPr>
+  </w:style>
+  <w:style w:type="paragraph" w:customStyle="1" w:styleId="ListParagraphNumberedBold">
+    <w:name w:val="List Paragraph Numbered (Bold)"/>
+    <w:basedOn w:val="ListParagraphNumbered"/>
+    <w:qFormat/>
+    <w:rsid w:val="00AA522D"/>
+    <w:pPr>
+      <w:ind w:left="405"/>
+    </w:pPr>
+    <w:rPr>
+      <w:color w:val="auto"/>
+      <w:spacing w:val="0"/>
+    </w:rPr>
+  </w:style>
+  <w:style w:type="paragraph" w:styleId="Footer">
+    <w:name w:val="footer"/>
+    <w:basedOn w:val="Normal"/>
+    <w:link w:val="FooterChar"/>
+    <w:uiPriority w:val="99"/>
+    <w:unhideWhenUsed/>
+    <w:rsid w:val="000F4FEF"/>
+    <w:pPr>
+      <w:tabs>
+        <w:tab w:val="center" w:pos="4680"/>
+        <w:tab w:val="right" w:pos="9360"/>
+      </w:tabs>
+    </w:pPr>
+  </w:style>
+  <w:style w:type="character" w:customStyle="1" w:styleId="FooterChar">
+    <w:name w:val="Footer Char"/>
+    <w:basedOn w:val="DefaultParagraphFont"/>
+    <w:link w:val="Footer"/>
+    <w:uiPriority w:val="99"/>
+    <w:qFormat/>
+    <w:rsid w:val="000F4FEF"/>
+    <w:rPr>
+      <w:rFonts w:ascii="Arial" w:hAnsi="Arial" w:cs="Arial"/>
+    </w:rPr>
+  </w:style>
+  <w:style w:type="paragraph" w:customStyle="1" w:styleId="FooterRight">
+    <w:name w:val="Footer Right"/>
+    <w:basedOn w:val="Footer"/>
+    <w:qFormat/>
+    <w:rsid w:val="00FA6057"/>
+    <w:pPr>
+      <w:jc w:val="right"/>
+    </w:pPr>
+  </w:style>
+  <w:style w:type="paragraph" w:customStyle="1" w:styleId="interviewsituationpara">
+    <w:name w:val="interview situation para"/>
+    <w:basedOn w:val="Body"/>
+    <w:next w:val="interviewsituationcondition"/>
+    <w:link w:val="interviewsituationparaChar"/>
+    <w:qFormat/>
+    <w:rsid w:val="00DD3DDA"/>
+    <w:pPr>
+      <w:spacing w:before="120" w:after="0" w:line="240" w:lineRule="auto"/>
+      <w:contextualSpacing/>
+    </w:pPr>
+  </w:style>
+  <w:style w:type="character" w:customStyle="1" w:styleId="interviewsituationparaChar">
+    <w:name w:val="interview situation para Char"/>
+    <w:basedOn w:val="BodyChar"/>
+    <w:link w:val="interviewsituationpara"/>
+    <w:rsid w:val="00DD3DDA"/>
+    <w:rPr>
+      <w:rFonts w:ascii="Helvetica" w:eastAsiaTheme="minorHAnsi" w:hAnsi="Helvetica" w:cs="Helvetica"/>
+      <w:sz w:val="24"/>
+      <w:szCs w:val="24"/>
+    </w:rPr>
+  </w:style>
+  <w:style w:type="paragraph" w:customStyle="1" w:styleId="Done">
+    <w:name w:val="Done"/>
+    <w:basedOn w:val="ListParagraph"/>
+    <w:qFormat/>
+    <w:rsid w:val="00DD3DDA"/>
+    <w:pPr>
+      <w:numPr>
+        <w:ilvl w:val="1"/>
+        <w:numId w:val="3"/>
+      </w:numPr>
+    </w:pPr>
+  </w:style>
+  <w:style w:type="character" w:customStyle="1" w:styleId="subject">
+    <w:name w:val="subject"/>
+    <w:basedOn w:val="DefaultParagraphFont"/>
+    <w:rsid w:val="000F4FEF"/>
+  </w:style>
+  <w:style w:type="character" w:customStyle="1" w:styleId="convention">
+    <w:name w:val="convention"/>
+    <w:basedOn w:val="DefaultParagraphFont"/>
+    <w:uiPriority w:val="1"/>
+    <w:qFormat/>
+    <w:rsid w:val="000F4FEF"/>
+    <w:rPr>
+      <w:sz w:val="22"/>
+      <w:szCs w:val="22"/>
+      <w:shd w:val="clear" w:color="auto" w:fill="A6A6A6" w:themeFill="background1" w:themeFillShade="A6"/>
+    </w:rPr>
+  </w:style>
+  <w:style w:type="paragraph" w:customStyle="1" w:styleId="Default">
+    <w:name w:val="Default"/>
+    <w:rsid w:val="000F4FEF"/>
+    <w:pPr>
+      <w:autoSpaceDE w:val="0"/>
+      <w:autoSpaceDN w:val="0"/>
+      <w:adjustRightInd w:val="0"/>
+      <w:spacing w:beforeAutospacing="0" w:after="0" w:afterAutospacing="0" w:line="240" w:lineRule="auto"/>
+    </w:pPr>
+    <w:rPr>
+      <w:rFonts w:ascii="Arial" w:eastAsiaTheme="minorHAnsi" w:hAnsi="Arial" w:cs="Arial"/>
+      <w:color w:val="000000"/>
+      <w:sz w:val="24"/>
+      <w:szCs w:val="24"/>
+    </w:rPr>
+  </w:style>
+  <w:style w:type="paragraph" w:customStyle="1" w:styleId="Example-bulleted">
+    <w:name w:val="Example - bulleted"/>
+    <w:basedOn w:val="Body"/>
+    <w:qFormat/>
+    <w:rsid w:val="000F4FEF"/>
+    <w:pPr>
+      <w:widowControl w:val="0"/>
+      <w:numPr>
+        <w:numId w:val="4"/>
+      </w:numPr>
+      <w:suppressAutoHyphens/>
+      <w:autoSpaceDE w:val="0"/>
+      <w:autoSpaceDN w:val="0"/>
+      <w:spacing w:before="60"/>
+    </w:pPr>
+    <w:rPr>
+      <w:rFonts w:eastAsia="Calibri"/>
+    </w:rPr>
+  </w:style>
+  <w:style w:type="character" w:customStyle="1" w:styleId="f1-light">
+    <w:name w:val="f1-light"/>
+    <w:basedOn w:val="DefaultParagraphFont"/>
+    <w:rsid w:val="000F4FEF"/>
+  </w:style>
+  <w:style w:type="paragraph" w:customStyle="1" w:styleId="H3numberedfordirections">
+    <w:name w:val="H3 numbered for directions"/>
+    <w:basedOn w:val="Heading3"/>
+    <w:next w:val="Normal"/>
+    <w:qFormat/>
+    <w:rsid w:val="000F4FEF"/>
+    <w:pPr>
+      <w:numPr>
+        <w:numId w:val="5"/>
+      </w:numPr>
+      <w:outlineLvl w:val="9"/>
+    </w:pPr>
+  </w:style>
+  <w:style w:type="character" w:customStyle="1" w:styleId="Interviewbutton0">
+    <w:name w:val="Interview button"/>
+    <w:basedOn w:val="DefaultParagraphFont"/>
+    <w:uiPriority w:val="1"/>
+    <w:qFormat/>
+    <w:rsid w:val="000F4FEF"/>
+    <w:rPr>
+      <w:color w:val="FFFFFF" w:themeColor="background1"/>
+      <w:bdr w:val="none" w:sz="0" w:space="0" w:color="auto"/>
+      <w:shd w:val="clear" w:color="auto" w:fill="0B5ED8"/>
+    </w:rPr>
+  </w:style>
+  <w:style w:type="paragraph" w:customStyle="1" w:styleId="interviewbuttons">
+    <w:name w:val="interview buttons"/>
+    <w:basedOn w:val="Normal"/>
+    <w:qFormat/>
+    <w:rsid w:val="000F4FEF"/>
+    <w:pPr>
+      <w:pBdr>
+        <w:top w:val="single" w:sz="12" w:space="1" w:color="0070C0"/>
+        <w:left w:val="single" w:sz="12" w:space="4" w:color="0070C0"/>
+        <w:bottom w:val="single" w:sz="12" w:space="1" w:color="0070C0"/>
+        <w:right w:val="single" w:sz="12" w:space="4" w:color="0070C0"/>
+        <w:between w:val="single" w:sz="12" w:space="1" w:color="0070C0"/>
+        <w:bar w:val="single" w:sz="12" w:color="0070C0"/>
+      </w:pBdr>
+      <w:shd w:val="clear" w:color="auto" w:fill="FFFFFF"/>
+      <w:spacing w:after="0"/>
+      <w:ind w:left="-58" w:right="-216"/>
+    </w:pPr>
+    <w:rPr>
+      <w:sz w:val="21"/>
+      <w:szCs w:val="21"/>
+    </w:rPr>
+  </w:style>
+  <w:style w:type="paragraph" w:customStyle="1" w:styleId="interviewcheckboxes">
+    <w:name w:val="interview checkboxes"/>
+    <w:basedOn w:val="ListParagraph"/>
+    <w:qFormat/>
+    <w:rsid w:val="000F4FEF"/>
+    <w:pPr>
+      <w:numPr>
+        <w:numId w:val="6"/>
+      </w:numPr>
+      <w:pBdr>
+        <w:top w:val="single" w:sz="12" w:space="1" w:color="0070C0"/>
+        <w:left w:val="single" w:sz="12" w:space="4" w:color="0070C0"/>
+        <w:bottom w:val="single" w:sz="12" w:space="1" w:color="0070C0"/>
+        <w:right w:val="single" w:sz="12" w:space="4" w:color="0070C0"/>
+        <w:between w:val="single" w:sz="12" w:space="1" w:color="0070C0"/>
+        <w:bar w:val="single" w:sz="12" w:color="0070C0"/>
+      </w:pBdr>
+    </w:pPr>
+  </w:style>
+  <w:style w:type="character" w:customStyle="1" w:styleId="interviewclickformoreinfo-definition">
+    <w:name w:val="interview click for more info - definition"/>
+    <w:uiPriority w:val="1"/>
+    <w:qFormat/>
+    <w:rsid w:val="000F4FEF"/>
+    <w:rPr>
+      <w:color w:val="00B050"/>
+      <w:u w:val="dash" w:color="92D050"/>
+    </w:rPr>
+  </w:style>
+  <w:style w:type="character" w:customStyle="1" w:styleId="InterviewCommentText">
+    <w:name w:val="Interview Comment Text"/>
+    <w:basedOn w:val="BodyTextChar"/>
+    <w:uiPriority w:val="1"/>
+    <w:qFormat/>
+    <w:rsid w:val="000F4FEF"/>
+    <w:rPr>
+      <w:rFonts w:ascii="Helvetica" w:eastAsia="Arial" w:hAnsi="Helvetica" w:cs="Helvetica"/>
+      <w:color w:val="7030A0"/>
+      <w:spacing w:val="-2"/>
+      <w:sz w:val="24"/>
+      <w:szCs w:val="24"/>
+    </w:rPr>
+  </w:style>
+  <w:style w:type="character" w:customStyle="1" w:styleId="interviewconvention">
+    <w:name w:val="interview convention"/>
+    <w:basedOn w:val="DefaultParagraphFont"/>
+    <w:uiPriority w:val="1"/>
+    <w:qFormat/>
+    <w:rsid w:val="000F4FEF"/>
+    <w:rPr>
+      <w:sz w:val="22"/>
+      <w:szCs w:val="22"/>
+      <w:shd w:val="clear" w:color="auto" w:fill="A6A6A6" w:themeFill="background1" w:themeFillShade="A6"/>
+    </w:rPr>
+  </w:style>
+  <w:style w:type="paragraph" w:customStyle="1" w:styleId="interviewglossarywordintemplate">
+    <w:name w:val="interview glossary word in template"/>
+    <w:basedOn w:val="Normal"/>
+    <w:link w:val="interviewglossarywordintemplateChar"/>
+    <w:qFormat/>
+    <w:rsid w:val="000F4FEF"/>
+    <w:pPr>
+      <w:spacing w:after="60" w:line="360" w:lineRule="auto"/>
+    </w:pPr>
+    <w:rPr>
+      <w:rFonts w:asciiTheme="minorHAnsi" w:hAnsiTheme="minorHAnsi" w:cstheme="minorBidi"/>
+    </w:rPr>
+  </w:style>
+  <w:style w:type="character" w:customStyle="1" w:styleId="interviewglossarywordintemplateChar">
+    <w:name w:val="interview glossary word in template Char"/>
+    <w:basedOn w:val="DefaultParagraphFont"/>
+    <w:link w:val="interviewglossarywordintemplate"/>
+    <w:rsid w:val="000F4FEF"/>
+  </w:style>
+  <w:style w:type="character" w:customStyle="1" w:styleId="interviewsituation">
+    <w:name w:val="interview situation"/>
+    <w:basedOn w:val="interviewneedstobewritten"/>
+    <w:uiPriority w:val="1"/>
+    <w:qFormat/>
+    <w:rsid w:val="00DD3DDA"/>
+    <w:rPr>
+      <w:shd w:val="clear" w:color="auto" w:fill="FFFF00"/>
+    </w:rPr>
+  </w:style>
+  <w:style w:type="character" w:customStyle="1" w:styleId="interviewneedstobewritten">
+    <w:name w:val="interview needs to be written"/>
+    <w:basedOn w:val="DefaultParagraphFont"/>
+    <w:uiPriority w:val="1"/>
+    <w:qFormat/>
+    <w:rsid w:val="000F4FEF"/>
+    <w:rPr>
+      <w:shd w:val="clear" w:color="auto" w:fill="FFFF00"/>
+    </w:rPr>
+  </w:style>
+  <w:style w:type="character" w:customStyle="1" w:styleId="interviewPAPtexttrigger">
+    <w:name w:val="interview PAP text trigger"/>
+    <w:basedOn w:val="DefaultParagraphFont"/>
+    <w:uiPriority w:val="1"/>
+    <w:qFormat/>
+    <w:rsid w:val="000F4FEF"/>
+    <w:rPr>
+      <w:shd w:val="clear" w:color="auto" w:fill="009999"/>
+    </w:rPr>
+  </w:style>
+  <w:style w:type="character" w:customStyle="1" w:styleId="interviewpdf">
+    <w:name w:val="interview pdf"/>
+    <w:basedOn w:val="DefaultParagraphFont"/>
+    <w:uiPriority w:val="1"/>
+    <w:qFormat/>
+    <w:rsid w:val="000F4FEF"/>
+    <w:rPr>
+      <w:b/>
+      <w:szCs w:val="24"/>
+      <w:shd w:val="clear" w:color="auto" w:fill="FF00FF"/>
+    </w:rPr>
+  </w:style>
+  <w:style w:type="paragraph" w:customStyle="1" w:styleId="interviewquestionid">
+    <w:name w:val="interview question id"/>
+    <w:basedOn w:val="BodyText"/>
+    <w:qFormat/>
+    <w:rsid w:val="000F4FEF"/>
+    <w:pPr>
+      <w:spacing w:before="240" w:after="0"/>
+    </w:pPr>
+    <w:rPr>
+      <w:color w:val="FF9F9F"/>
+    </w:rPr>
+  </w:style>
+  <w:style w:type="paragraph" w:customStyle="1" w:styleId="interviewradiobuttons">
+    <w:name w:val="interview radio buttons"/>
+    <w:basedOn w:val="ListParagraph"/>
+    <w:qFormat/>
+    <w:rsid w:val="000F4FEF"/>
+    <w:pPr>
+      <w:numPr>
+        <w:numId w:val="7"/>
+      </w:numPr>
+      <w:pBdr>
+        <w:top w:val="single" w:sz="12" w:space="1" w:color="0070C0"/>
+        <w:left w:val="single" w:sz="12" w:space="4" w:color="0070C0"/>
+        <w:bottom w:val="single" w:sz="12" w:space="1" w:color="0070C0"/>
+        <w:right w:val="single" w:sz="12" w:space="4" w:color="0070C0"/>
+        <w:between w:val="single" w:sz="12" w:space="1" w:color="0070C0"/>
+        <w:bar w:val="single" w:sz="12" w:color="0070C0"/>
+      </w:pBdr>
+      <w:shd w:val="clear" w:color="auto" w:fill="FFFFFF"/>
+      <w:spacing w:after="480" w:line="360" w:lineRule="auto"/>
+      <w:ind w:right="-220"/>
+    </w:pPr>
+    <w:rPr>
+      <w:szCs w:val="21"/>
+    </w:rPr>
+  </w:style>
+  <w:style w:type="character" w:customStyle="1" w:styleId="interviewvariable">
+    <w:name w:val="interview variable"/>
+    <w:basedOn w:val="DefaultParagraphFont"/>
+    <w:uiPriority w:val="1"/>
+    <w:qFormat/>
+    <w:rsid w:val="000F4FEF"/>
+    <w:rPr>
+      <w:color w:val="FF7C80"/>
+      <w:shd w:val="clear" w:color="auto" w:fill="FFFFCC"/>
+    </w:rPr>
+  </w:style>
+  <w:style w:type="paragraph" w:customStyle="1" w:styleId="Listnumberedunderbullet">
+    <w:name w:val="List numbered under bullet"/>
+    <w:basedOn w:val="Normal"/>
+    <w:qFormat/>
+    <w:rsid w:val="000F4FEF"/>
+    <w:pPr>
+      <w:widowControl w:val="0"/>
+      <w:numPr>
+        <w:ilvl w:val="4"/>
+        <w:numId w:val="8"/>
+      </w:numPr>
+      <w:autoSpaceDE w:val="0"/>
+      <w:autoSpaceDN w:val="0"/>
+      <w:spacing w:before="54" w:beforeAutospacing="0" w:after="120" w:afterAutospacing="0" w:line="276" w:lineRule="auto"/>
+    </w:pPr>
+    <w:rPr>
+      <w:rFonts w:ascii="Helvetica" w:eastAsiaTheme="minorHAnsi" w:hAnsi="Helvetica" w:cs="Helvetica"/>
+      <w:color w:val="202529"/>
+      <w:spacing w:val="-2"/>
+      <w:sz w:val="24"/>
+      <w:szCs w:val="24"/>
+    </w:rPr>
+  </w:style>
+  <w:style w:type="paragraph" w:customStyle="1" w:styleId="MLRIAdvocacyguideforPDFPart">
+    <w:name w:val="MLRI Advocacy guide for PDF Part"/>
+    <w:basedOn w:val="Normal"/>
+    <w:qFormat/>
+    <w:rsid w:val="000F4FEF"/>
+    <w:pPr>
+      <w:spacing w:before="480" w:after="80" w:line="320" w:lineRule="exact"/>
+      <w:ind w:left="187"/>
+    </w:pPr>
+    <w:rPr>
+      <w:rFonts w:ascii="Bookman Old Style" w:hAnsi="Bookman Old Style"/>
+      <w:color w:val="808080"/>
+      <w:szCs w:val="28"/>
+    </w:rPr>
+  </w:style>
+  <w:style w:type="character" w:customStyle="1" w:styleId="NumChar">
+    <w:name w:val="NumChar"/>
+    <w:basedOn w:val="DefaultParagraphFont"/>
+    <w:uiPriority w:val="1"/>
+    <w:qFormat/>
+    <w:rsid w:val="000F4FEF"/>
+    <w:rPr>
+      <w:rFonts w:eastAsiaTheme="minorHAnsi"/>
+    </w:rPr>
+  </w:style>
+  <w:style w:type="paragraph" w:customStyle="1" w:styleId="one-indent">
+    <w:name w:val="one-indent"/>
+    <w:basedOn w:val="Normal"/>
+    <w:rsid w:val="000F4FEF"/>
+    <w:pPr>
+      <w:spacing w:before="100" w:after="100"/>
+    </w:pPr>
+    <w:rPr>
+      <w:rFonts w:ascii="Times New Roman" w:eastAsia="Times New Roman" w:hAnsi="Times New Roman" w:cs="Times New Roman"/>
+      <w:sz w:val="24"/>
+      <w:szCs w:val="24"/>
+    </w:rPr>
+  </w:style>
+  <w:style w:type="character" w:customStyle="1" w:styleId="small">
+    <w:name w:val="small"/>
+    <w:basedOn w:val="DefaultParagraphFont"/>
+    <w:rsid w:val="000F4FEF"/>
+    <w:rPr>
+      <w:rFonts w:cs="Times New Roman"/>
+    </w:rPr>
+  </w:style>
+  <w:style w:type="paragraph" w:customStyle="1" w:styleId="StyleHeading1Hanging008">
+    <w:name w:val="Style Heading 1 + Hanging:  0.08&quot;"/>
+    <w:basedOn w:val="Heading1"/>
+    <w:qFormat/>
+    <w:rsid w:val="000F4FEF"/>
+    <w:pPr>
+      <w:spacing w:before="120"/>
+      <w:ind w:hanging="115"/>
+    </w:pPr>
+    <w:rPr>
+      <w:rFonts w:eastAsia="Times New Roman" w:cs="Times New Roman"/>
+      <w:szCs w:val="20"/>
+    </w:rPr>
+  </w:style>
+  <w:style w:type="numbering" w:customStyle="1" w:styleId="Style1">
+    <w:name w:val="Style1"/>
+    <w:uiPriority w:val="99"/>
+    <w:rsid w:val="000F4FEF"/>
+    <w:pPr>
+      <w:numPr>
+        <w:numId w:val="2"/>
+      </w:numPr>
+    </w:pPr>
+  </w:style>
+  <w:style w:type="paragraph" w:customStyle="1" w:styleId="TableParagraph">
+    <w:name w:val="Table Paragraph"/>
+    <w:basedOn w:val="Normal"/>
+    <w:uiPriority w:val="1"/>
+    <w:qFormat/>
+    <w:rsid w:val="000F4FEF"/>
+  </w:style>
+  <w:style w:type="character" w:customStyle="1" w:styleId="UnresolvedMention">
     <w:name w:val="Unresolved Mention"/>
     <w:basedOn w:val="DefaultParagraphFont"/>
     <w:uiPriority w:val="99"/>
@@ -6114,7 +7606,7 @@
   <a:extraClrSchemeLst/>
   <a:extLst>
     <a:ext uri="{05A4C25C-085E-4340-85A3-A5531E510DB2}">
-      <thm15:themeFamily xmlns:thm15="http://schemas.microsoft.com/office/thememl/2012/main" name="Office Theme" id="{62F939B6-93AF-4DB8-9C6B-D6C7DFDC589F}" vid="{4A3C46E8-61CC-4603-A589-7422A47A8E4A}"/>
+      <thm15:themeFamily xmlns:thm15="http://schemas.microsoft.com/office/thememl/2012/main" xmlns="" name="Office Theme" id="{62F939B6-93AF-4DB8-9C6B-D6C7DFDC589F}" vid="{4A3C46E8-61CC-4603-A589-7422A47A8E4A}"/>
     </a:ext>
   </a:extLst>
 </a:theme>
@@ -6125,7 +7617,7 @@
 </file>
 
 <file path=customXml/itemProps1.xml><?xml version="1.0" encoding="utf-8"?>
-<ds:datastoreItem xmlns:ds="http://schemas.openxmlformats.org/officeDocument/2006/customXml" ds:itemID="{36285EEE-6041-426B-8EA9-D73E12EF4169}">
+<ds:datastoreItem xmlns:ds="http://schemas.openxmlformats.org/officeDocument/2006/customXml" ds:itemID="{F46E8A33-F33A-4F27-8F38-6C00B23C730E}">
   <ds:schemaRefs>
     <ds:schemaRef ds:uri="http://schemas.openxmlformats.org/officeDocument/2006/bibliography"/>
   </ds:schemaRefs>

</xml_diff>